<commit_message>
Update school universe (Tablas 1-3, 20) with SIAGIE 2025 enrollment
Co-Authored-By: Claude Sonnet 5.5 <noreply@anthropic.com>
Claude-Session: https://claude.ai/code/session_01SPdMPfWMtqGAvnNeyJFNHL
</commit_message>
<xml_diff>
--- a/demanda/Demanda Social - FARMACIA Y BIOQUIMICA.docx
+++ b/demanda/Demanda Social - FARMACIA Y BIOQUIMICA.docx
@@ -830,7 +830,7 @@
           <w:sz w:val="24"/>
           <w:szCs w:val="24"/>
         </w:rPr>
-        <w:t xml:space="preserve">Es fundamental mencionar que el presente estudio está fechado en setiembre de 2026. Los porcentajes de las variables de preferencia y disposición del estudiante provienen del levantamiento de campo realizado entre los meses de julio, agosto y setiembre de 2023 a estudiantes de 5to de secundaria de la Región Lambayeque, promediados a partir de los tres informes de demanda social de referencia (Laboratorio Clínico, Radiología y Terapia Física y Rehabilitación). Los cálculos muestrales se fundamentan en el marco muestral ESCALE 2022, mientras que los datos poblacionales, socioeconómicos y de oferta se actualizaron con la información disponible hasta setiembre de 2026 (CPI Research 2026, APEIM 2025, INEI/OSEL 2025, DIGEMID 2026 y portales institucionales), la cual se incorpora en el análisis descriptivo de la demanda educativa.</w:t>
+        <w:t xml:space="preserve">Es fundamental mencionar que el presente estudio está fechado en setiembre de 2026. Los porcentajes de las variables de preferencia y disposición del estudiante provienen del levantamiento de campo realizado entre los meses de julio, agosto y setiembre de 2023 a estudiantes de 5to de secundaria de la Región Lambayeque, promediados a partir de los tres informes de demanda social de referencia (Laboratorio Clínico, Radiología y Terapia Física y Rehabilitación) y aplicados al marco muestral actualizado con la matrícula 2025 del SIAGIE (MINEDU), con el que se recalcularon las frecuencias. Los cálculos muestrales se fundamentan, por tanto, en dicho marco, mientras que los datos poblacionales, socioeconómicos y de oferta se actualizaron con la información disponible hasta setiembre de 2026 (CPI Research 2026, APEIM 2025, INEI/OSEL 2025, DIGEMID 2026 y portales institucionales), la cual se incorpora en el análisis descriptivo de la demanda educativa.</w:t>
       </w:r>
       <w:r>
         <w:rPr>
@@ -2996,7 +2996,7 @@
           <w:sz w:val="24"/>
           <w:szCs w:val="24"/>
         </w:rPr>
-        <w:t>Número de Instituciones Educativas y de Estudiantes, según provincia de la Región Lambayeque, 202</w:t>
+        <w:t xml:space="preserve">Número de Instituciones Educativas y de Estudiantes, según provincia de la Región Lambayeque, 2025</w:t>
       </w:r>
       <w:r>
         <w:rPr>
@@ -3008,7 +3008,7 @@
           <w:sz w:val="24"/>
           <w:szCs w:val="24"/>
         </w:rPr>
-        <w:t>2</w:t>
+        <w:t xml:space="preserve"/>
       </w:r>
     </w:p>
     <w:tbl>
@@ -3487,7 +3487,7 @@
                 <w:color w:val="000000" w:themeColor="text1"/>
                 <w:lang w:eastAsia="es-PE"/>
               </w:rPr>
-              <w:t>Chiclayo</w:t>
+              <w:t xml:space="preserve">Chiclayo</w:t>
             </w:r>
           </w:p>
         </w:tc>
@@ -3518,7 +3518,7 @@
                 <w:color w:val="000000" w:themeColor="text1"/>
                 <w:lang w:eastAsia="es-PE"/>
               </w:rPr>
-              <w:t>273</w:t>
+              <w:t xml:space="preserve">268</w:t>
             </w:r>
           </w:p>
         </w:tc>
@@ -3549,7 +3549,7 @@
                 <w:color w:val="000000" w:themeColor="text1"/>
                 <w:lang w:eastAsia="es-PE"/>
               </w:rPr>
-              <w:t>93</w:t>
+              <w:t xml:space="preserve">93</w:t>
             </w:r>
           </w:p>
         </w:tc>
@@ -3580,7 +3580,7 @@
                 <w:color w:val="000000" w:themeColor="text1"/>
                 <w:lang w:eastAsia="es-PE"/>
               </w:rPr>
-              <w:t>180</w:t>
+              <w:t xml:space="preserve">175</w:t>
             </w:r>
           </w:p>
         </w:tc>
@@ -3636,7 +3636,7 @@
                 <w:color w:val="000000" w:themeColor="text1"/>
                 <w:lang w:eastAsia="es-PE"/>
               </w:rPr>
-              <w:t>13,819</w:t>
+              <w:t xml:space="preserve">13 291</w:t>
             </w:r>
           </w:p>
         </w:tc>
@@ -3666,7 +3666,7 @@
                 <w:color w:val="000000" w:themeColor="text1"/>
                 <w:lang w:eastAsia="es-PE"/>
               </w:rPr>
-              <w:t>8,972</w:t>
+              <w:t xml:space="preserve">8 070</w:t>
             </w:r>
           </w:p>
         </w:tc>
@@ -3696,7 +3696,7 @@
                 <w:color w:val="000000" w:themeColor="text1"/>
                 <w:lang w:eastAsia="es-PE"/>
               </w:rPr>
-              <w:t>4,847</w:t>
+              <w:t xml:space="preserve">5 221</w:t>
             </w:r>
           </w:p>
         </w:tc>
@@ -3731,7 +3731,7 @@
                 <w:color w:val="000000" w:themeColor="text1"/>
                 <w:lang w:eastAsia="es-PE"/>
               </w:rPr>
-              <w:t>Ferreñafe</w:t>
+              <w:t xml:space="preserve">Ferreñafe</w:t>
             </w:r>
           </w:p>
         </w:tc>
@@ -3761,7 +3761,7 @@
                 <w:color w:val="000000" w:themeColor="text1"/>
                 <w:lang w:eastAsia="es-PE"/>
               </w:rPr>
-              <w:t>56</w:t>
+              <w:t xml:space="preserve">57</w:t>
             </w:r>
           </w:p>
         </w:tc>
@@ -3791,7 +3791,7 @@
                 <w:color w:val="000000" w:themeColor="text1"/>
                 <w:lang w:eastAsia="es-PE"/>
               </w:rPr>
-              <w:t>49</w:t>
+              <w:t xml:space="preserve">49</w:t>
             </w:r>
           </w:p>
         </w:tc>
@@ -3821,7 +3821,7 @@
                 <w:color w:val="000000" w:themeColor="text1"/>
                 <w:lang w:eastAsia="es-PE"/>
               </w:rPr>
-              <w:t>7</w:t>
+              <w:t xml:space="preserve">8</w:t>
             </w:r>
           </w:p>
         </w:tc>
@@ -3875,7 +3875,7 @@
                 <w:color w:val="000000" w:themeColor="text1"/>
                 <w:lang w:eastAsia="es-PE"/>
               </w:rPr>
-              <w:t>1,891</w:t>
+              <w:t xml:space="preserve">1 997</w:t>
             </w:r>
           </w:p>
         </w:tc>
@@ -3904,7 +3904,7 @@
                 <w:color w:val="000000" w:themeColor="text1"/>
                 <w:lang w:eastAsia="es-PE"/>
               </w:rPr>
-              <w:t>1,726</w:t>
+              <w:t xml:space="preserve">1 820</w:t>
             </w:r>
           </w:p>
         </w:tc>
@@ -3933,7 +3933,7 @@
                 <w:color w:val="000000" w:themeColor="text1"/>
                 <w:lang w:eastAsia="es-PE"/>
               </w:rPr>
-              <w:t>165</w:t>
+              <w:t xml:space="preserve">177</w:t>
             </w:r>
           </w:p>
         </w:tc>
@@ -3969,7 +3969,7 @@
                 <w:color w:val="000000" w:themeColor="text1"/>
                 <w:lang w:eastAsia="es-PE"/>
               </w:rPr>
-              <w:t>Lambayeque</w:t>
+              <w:t xml:space="preserve">Lambayeque</w:t>
             </w:r>
           </w:p>
         </w:tc>
@@ -4000,7 +4000,7 @@
                 <w:color w:val="000000" w:themeColor="text1"/>
                 <w:lang w:eastAsia="es-PE"/>
               </w:rPr>
-              <w:t>141</w:t>
+              <w:t xml:space="preserve">141</w:t>
             </w:r>
           </w:p>
         </w:tc>
@@ -4031,7 +4031,7 @@
                 <w:color w:val="000000" w:themeColor="text1"/>
                 <w:lang w:eastAsia="es-PE"/>
               </w:rPr>
-              <w:t>96</w:t>
+              <w:t xml:space="preserve">97</w:t>
             </w:r>
           </w:p>
         </w:tc>
@@ -4062,7 +4062,7 @@
                 <w:color w:val="000000" w:themeColor="text1"/>
                 <w:lang w:eastAsia="es-PE"/>
               </w:rPr>
-              <w:t>45</w:t>
+              <w:t xml:space="preserve">44</w:t>
             </w:r>
           </w:p>
         </w:tc>
@@ -4118,7 +4118,7 @@
                 <w:color w:val="000000" w:themeColor="text1"/>
                 <w:lang w:eastAsia="es-PE"/>
               </w:rPr>
-              <w:t>4,889</w:t>
+              <w:t xml:space="preserve">5 967</w:t>
             </w:r>
           </w:p>
         </w:tc>
@@ -4148,7 +4148,7 @@
                 <w:color w:val="000000" w:themeColor="text1"/>
                 <w:lang w:eastAsia="es-PE"/>
               </w:rPr>
-              <w:t>4,153</w:t>
+              <w:t xml:space="preserve">4 873</w:t>
             </w:r>
           </w:p>
         </w:tc>
@@ -4178,7 +4178,7 @@
                 <w:color w:val="000000" w:themeColor="text1"/>
                 <w:lang w:eastAsia="es-PE"/>
               </w:rPr>
-              <w:t>736</w:t>
+              <w:t xml:space="preserve">1 094</w:t>
             </w:r>
           </w:p>
         </w:tc>
@@ -4220,7 +4220,7 @@
                 <w:color w:val="000000" w:themeColor="text1"/>
                 <w:lang w:eastAsia="es-PE"/>
               </w:rPr>
-              <w:t>Total</w:t>
+              <w:t xml:space="preserve">Total</w:t>
             </w:r>
           </w:p>
         </w:tc>
@@ -4256,7 +4256,7 @@
                 <w:color w:val="000000" w:themeColor="text1"/>
                 <w:lang w:eastAsia="es-PE"/>
               </w:rPr>
-              <w:t>470</w:t>
+              <w:t xml:space="preserve">466</w:t>
             </w:r>
           </w:p>
         </w:tc>
@@ -4292,7 +4292,7 @@
                 <w:color w:val="000000" w:themeColor="text1"/>
                 <w:lang w:eastAsia="es-PE"/>
               </w:rPr>
-              <w:t>238</w:t>
+              <w:t xml:space="preserve">239</w:t>
             </w:r>
           </w:p>
         </w:tc>
@@ -4328,7 +4328,7 @@
                 <w:color w:val="000000" w:themeColor="text1"/>
                 <w:lang w:eastAsia="es-PE"/>
               </w:rPr>
-              <w:t>232</w:t>
+              <w:t xml:space="preserve">227</w:t>
             </w:r>
           </w:p>
         </w:tc>
@@ -4392,7 +4392,7 @@
                 <w:color w:val="000000" w:themeColor="text1"/>
                 <w:lang w:eastAsia="es-PE"/>
               </w:rPr>
-              <w:t>20,599</w:t>
+              <w:t xml:space="preserve">21 255</w:t>
             </w:r>
           </w:p>
         </w:tc>
@@ -4428,7 +4428,7 @@
                 <w:color w:val="000000" w:themeColor="text1"/>
                 <w:lang w:eastAsia="es-PE"/>
               </w:rPr>
-              <w:t>14,851</w:t>
+              <w:t xml:space="preserve">14 763</w:t>
             </w:r>
           </w:p>
         </w:tc>
@@ -4464,7 +4464,7 @@
                 <w:color w:val="000000" w:themeColor="text1"/>
                 <w:lang w:eastAsia="es-PE"/>
               </w:rPr>
-              <w:t>5,748</w:t>
+              <w:t xml:space="preserve">6 492</w:t>
             </w:r>
           </w:p>
         </w:tc>
@@ -4490,7 +4490,7 @@
           <w:sz w:val="20"/>
           <w:szCs w:val="20"/>
         </w:rPr>
-        <w:t>Fuente: MINEDU, Escale – Censo Educativo 2020.</w:t>
+        <w:t xml:space="preserve">Fuente: MINEDU, SIAGIE – Reporte de Matrícula 2025 (5.° grado de secundaria, EBR).</w:t>
       </w:r>
     </w:p>
     <w:p>
@@ -4527,7 +4527,7 @@
           <w:sz w:val="24"/>
           <w:szCs w:val="24"/>
         </w:rPr>
-        <w:t>En el año 2020, la Región Lambayeque contaba con un total de 470 instituciones educativas, de las cuales 238 eran públicas y 232 eran privadas. El número total de estudiantes en la región alcanzaba los 20,599, distribuidos en 14,851 estudiantes en instituciones públicas y 5,748 en instituciones privadas, según datos del MINEDU obtenidos del Escale - Censo Educativo 2022.</w:t>
+        <w:t xml:space="preserve">En el año 2025, la Región Lambayeque contaba con un total de 466 instituciones educativas con 5.° grado de secundaria, de las cuales 239 eran públicas y 227 eran privadas. El número total de estudiantes de 5.° de secundaria en la región alcanzaba los 21 255, distribuidos en 14 763 estudiantes en instituciones públicas y 6 492 en instituciones privadas, según datos del MINEDU obtenidos del SIAGIE - Reporte de Matrícula 2025.</w:t>
       </w:r>
     </w:p>
     <w:p>
@@ -5540,7 +5540,7 @@
                 <w:szCs w:val="18"/>
                 <w:lang w:eastAsia="es-PE"/>
               </w:rPr>
-              <w:t>Chiclayo (Estudiantes de I.E. publica)</w:t>
+              <w:t xml:space="preserve">Chiclayo (Estudiantes de I.E. publica)</w:t>
             </w:r>
           </w:p>
         </w:tc>
@@ -5577,7 +5577,7 @@
                 <w:szCs w:val="18"/>
                 <w:lang w:eastAsia="es-PE"/>
               </w:rPr>
-              <w:t>8,972</w:t>
+              <w:t xml:space="preserve">8 070</w:t>
             </w:r>
           </w:p>
         </w:tc>
@@ -5614,7 +5614,7 @@
                 <w:szCs w:val="18"/>
                 <w:lang w:eastAsia="es-PE"/>
               </w:rPr>
-              <w:t>0.435555</w:t>
+              <w:t xml:space="preserve">0.379675</w:t>
             </w:r>
           </w:p>
         </w:tc>
@@ -5653,7 +5653,7 @@
                 <w:szCs w:val="18"/>
                 <w:lang w:eastAsia="es-PE"/>
               </w:rPr>
-              <w:t>0.500</w:t>
+              <w:t xml:space="preserve">0.500</w:t>
             </w:r>
           </w:p>
         </w:tc>
@@ -5692,7 +5692,7 @@
                 <w:szCs w:val="18"/>
                 <w:lang w:eastAsia="es-PE"/>
               </w:rPr>
-              <w:t>0.500</w:t>
+              <w:t xml:space="preserve">0.500</w:t>
             </w:r>
           </w:p>
         </w:tc>
@@ -5729,7 +5729,7 @@
                 <w:szCs w:val="18"/>
                 <w:lang w:eastAsia="es-PE"/>
               </w:rPr>
-              <w:t>0.1088888</w:t>
+              <w:t xml:space="preserve">0.0949188</w:t>
             </w:r>
           </w:p>
         </w:tc>
@@ -5766,7 +5766,7 @@
                 <w:szCs w:val="18"/>
                 <w:lang w:eastAsia="es-PE"/>
               </w:rPr>
-              <w:t>256</w:t>
+              <w:t xml:space="preserve">223</w:t>
             </w:r>
           </w:p>
         </w:tc>
@@ -5807,7 +5807,7 @@
                 <w:szCs w:val="18"/>
                 <w:lang w:eastAsia="es-PE"/>
               </w:rPr>
-              <w:t>Chiclayo (Estudiantes de I.E. privada)</w:t>
+              <w:t xml:space="preserve">Chiclayo (Estudiantes de I.E. privada)</w:t>
             </w:r>
           </w:p>
         </w:tc>
@@ -5844,7 +5844,7 @@
                 <w:szCs w:val="18"/>
                 <w:lang w:eastAsia="es-PE"/>
               </w:rPr>
-              <w:t>4,847</w:t>
+              <w:t xml:space="preserve">5 221</w:t>
             </w:r>
           </w:p>
         </w:tc>
@@ -5881,7 +5881,7 @@
                 <w:szCs w:val="18"/>
                 <w:lang w:eastAsia="es-PE"/>
               </w:rPr>
-              <w:t>0.235303</w:t>
+              <w:t xml:space="preserve">0.245636</w:t>
             </w:r>
           </w:p>
         </w:tc>
@@ -5920,7 +5920,7 @@
                 <w:szCs w:val="18"/>
                 <w:lang w:eastAsia="es-PE"/>
               </w:rPr>
-              <w:t>0.500</w:t>
+              <w:t xml:space="preserve">0.500</w:t>
             </w:r>
           </w:p>
         </w:tc>
@@ -5959,7 +5959,7 @@
                 <w:szCs w:val="18"/>
                 <w:lang w:eastAsia="es-PE"/>
               </w:rPr>
-              <w:t>0.500</w:t>
+              <w:t xml:space="preserve">0.500</w:t>
             </w:r>
           </w:p>
         </w:tc>
@@ -5996,7 +5996,7 @@
                 <w:szCs w:val="18"/>
                 <w:lang w:eastAsia="es-PE"/>
               </w:rPr>
-              <w:t>0.0588257</w:t>
+              <w:t xml:space="preserve">0.0614091</w:t>
             </w:r>
           </w:p>
         </w:tc>
@@ -6033,7 +6033,7 @@
                 <w:szCs w:val="18"/>
                 <w:lang w:eastAsia="es-PE"/>
               </w:rPr>
-              <w:t>138</w:t>
+              <w:t xml:space="preserve">145</w:t>
             </w:r>
           </w:p>
         </w:tc>
@@ -6074,7 +6074,7 @@
                 <w:szCs w:val="18"/>
                 <w:lang w:eastAsia="es-PE"/>
               </w:rPr>
-              <w:t>Ferreñafe (Estudiantes de I.E. publica)</w:t>
+              <w:t xml:space="preserve">Ferreñafe (Estudiantes de I.E. publica)</w:t>
             </w:r>
           </w:p>
         </w:tc>
@@ -6111,7 +6111,7 @@
                 <w:szCs w:val="18"/>
                 <w:lang w:eastAsia="es-PE"/>
               </w:rPr>
-              <w:t>1,726</w:t>
+              <w:t xml:space="preserve">1 820</w:t>
             </w:r>
           </w:p>
         </w:tc>
@@ -6148,7 +6148,7 @@
                 <w:szCs w:val="18"/>
                 <w:lang w:eastAsia="es-PE"/>
               </w:rPr>
-              <w:t>0.08379</w:t>
+              <w:t xml:space="preserve">0.085627</w:t>
             </w:r>
           </w:p>
         </w:tc>
@@ -6187,7 +6187,7 @@
                 <w:szCs w:val="18"/>
                 <w:lang w:eastAsia="es-PE"/>
               </w:rPr>
-              <w:t>0.500</w:t>
+              <w:t xml:space="preserve">0.500</w:t>
             </w:r>
           </w:p>
         </w:tc>
@@ -6226,7 +6226,7 @@
                 <w:szCs w:val="18"/>
                 <w:lang w:eastAsia="es-PE"/>
               </w:rPr>
-              <w:t>0.500</w:t>
+              <w:t xml:space="preserve">0.500</w:t>
             </w:r>
           </w:p>
         </w:tc>
@@ -6263,7 +6263,7 @@
                 <w:szCs w:val="18"/>
                 <w:lang w:eastAsia="es-PE"/>
               </w:rPr>
-              <w:t>0.0209476</w:t>
+              <w:t xml:space="preserve">0.0214067</w:t>
             </w:r>
           </w:p>
         </w:tc>
@@ -6300,7 +6300,7 @@
                 <w:szCs w:val="18"/>
                 <w:lang w:eastAsia="es-PE"/>
               </w:rPr>
-              <w:t>49</w:t>
+              <w:t xml:space="preserve">50</w:t>
             </w:r>
           </w:p>
         </w:tc>
@@ -6341,7 +6341,7 @@
                 <w:szCs w:val="18"/>
                 <w:lang w:eastAsia="es-PE"/>
               </w:rPr>
-              <w:t>Ferreñafe (Estudiantes de I.E. privada)</w:t>
+              <w:t xml:space="preserve">Ferreñafe (Estudiantes de I.E. privada)</w:t>
             </w:r>
           </w:p>
         </w:tc>
@@ -6378,7 +6378,7 @@
                 <w:szCs w:val="18"/>
                 <w:lang w:eastAsia="es-PE"/>
               </w:rPr>
-              <w:t>165</w:t>
+              <w:t xml:space="preserve">177</w:t>
             </w:r>
           </w:p>
         </w:tc>
@@ -6415,7 +6415,7 @@
                 <w:szCs w:val="18"/>
                 <w:lang w:eastAsia="es-PE"/>
               </w:rPr>
-              <w:t>0.00801</w:t>
+              <w:t xml:space="preserve">0.00833</w:t>
             </w:r>
           </w:p>
         </w:tc>
@@ -6454,7 +6454,7 @@
                 <w:szCs w:val="18"/>
                 <w:lang w:eastAsia="es-PE"/>
               </w:rPr>
-              <w:t>0.500</w:t>
+              <w:t xml:space="preserve">0.500</w:t>
             </w:r>
           </w:p>
         </w:tc>
@@ -6493,7 +6493,7 @@
                 <w:szCs w:val="18"/>
                 <w:lang w:eastAsia="es-PE"/>
               </w:rPr>
-              <w:t>0.500</w:t>
+              <w:t xml:space="preserve">0.500</w:t>
             </w:r>
           </w:p>
         </w:tc>
@@ -6530,7 +6530,7 @@
                 <w:szCs w:val="18"/>
                 <w:lang w:eastAsia="es-PE"/>
               </w:rPr>
-              <w:t>0.0020025</w:t>
+              <w:t xml:space="preserve">0.0020819</w:t>
             </w:r>
           </w:p>
         </w:tc>
@@ -6567,7 +6567,7 @@
                 <w:szCs w:val="18"/>
                 <w:lang w:eastAsia="es-PE"/>
               </w:rPr>
-              <w:t>5</w:t>
+              <w:t xml:space="preserve">5</w:t>
             </w:r>
           </w:p>
         </w:tc>
@@ -6608,7 +6608,7 @@
                 <w:szCs w:val="18"/>
                 <w:lang w:eastAsia="es-PE"/>
               </w:rPr>
-              <w:t>Lambayeque (Estudiantes de I.E. publica)</w:t>
+              <w:t xml:space="preserve">Lambayeque (Estudiantes de I.E. publica)</w:t>
             </w:r>
           </w:p>
         </w:tc>
@@ -6645,7 +6645,7 @@
                 <w:szCs w:val="18"/>
                 <w:lang w:eastAsia="es-PE"/>
               </w:rPr>
-              <w:t>4,153</w:t>
+              <w:t xml:space="preserve">4 873</w:t>
             </w:r>
           </w:p>
         </w:tc>
@@ -6682,7 +6682,7 @@
                 <w:szCs w:val="18"/>
                 <w:lang w:eastAsia="es-PE"/>
               </w:rPr>
-              <w:t>0.201612</w:t>
+              <w:t xml:space="preserve">0.229264</w:t>
             </w:r>
           </w:p>
         </w:tc>
@@ -6721,7 +6721,7 @@
                 <w:szCs w:val="18"/>
                 <w:lang w:eastAsia="es-PE"/>
               </w:rPr>
-              <w:t>0.500</w:t>
+              <w:t xml:space="preserve">0.500</w:t>
             </w:r>
           </w:p>
         </w:tc>
@@ -6760,7 +6760,7 @@
                 <w:szCs w:val="18"/>
                 <w:lang w:eastAsia="es-PE"/>
               </w:rPr>
-              <w:t>0.500</w:t>
+              <w:t xml:space="preserve">0.500</w:t>
             </w:r>
           </w:p>
         </w:tc>
@@ -6797,7 +6797,7 @@
                 <w:szCs w:val="18"/>
                 <w:lang w:eastAsia="es-PE"/>
               </w:rPr>
-              <w:t>0.0504029</w:t>
+              <w:t xml:space="preserve">0.0573159</w:t>
             </w:r>
           </w:p>
         </w:tc>
@@ -6834,7 +6834,7 @@
                 <w:szCs w:val="18"/>
                 <w:lang w:eastAsia="es-PE"/>
               </w:rPr>
-              <w:t>119</w:t>
+              <w:t xml:space="preserve">135</w:t>
             </w:r>
           </w:p>
         </w:tc>
@@ -6875,7 +6875,7 @@
                 <w:szCs w:val="18"/>
                 <w:lang w:eastAsia="es-PE"/>
               </w:rPr>
-              <w:t>Lambayeque (Estudiantes de I.E. privada)</w:t>
+              <w:t xml:space="preserve">Lambayeque (Estudiantes de I.E. privada)</w:t>
             </w:r>
           </w:p>
         </w:tc>
@@ -6912,7 +6912,7 @@
                 <w:szCs w:val="18"/>
                 <w:lang w:eastAsia="es-PE"/>
               </w:rPr>
-              <w:t>736</w:t>
+              <w:t xml:space="preserve">1 094</w:t>
             </w:r>
           </w:p>
         </w:tc>
@@ -6949,7 +6949,7 @@
                 <w:szCs w:val="18"/>
                 <w:lang w:eastAsia="es-PE"/>
               </w:rPr>
-              <w:t>0.03573</w:t>
+              <w:t xml:space="preserve">0.051470</w:t>
             </w:r>
           </w:p>
         </w:tc>
@@ -6988,7 +6988,7 @@
                 <w:szCs w:val="18"/>
                 <w:lang w:eastAsia="es-PE"/>
               </w:rPr>
-              <w:t>0.500</w:t>
+              <w:t xml:space="preserve">0.500</w:t>
             </w:r>
           </w:p>
         </w:tc>
@@ -7027,7 +7027,7 @@
                 <w:szCs w:val="18"/>
                 <w:lang w:eastAsia="es-PE"/>
               </w:rPr>
-              <w:t>0.500</w:t>
+              <w:t xml:space="preserve">0.500</w:t>
             </w:r>
           </w:p>
         </w:tc>
@@ -7064,7 +7064,7 @@
                 <w:szCs w:val="18"/>
                 <w:lang w:eastAsia="es-PE"/>
               </w:rPr>
-              <w:t>0.0089325</w:t>
+              <w:t xml:space="preserve">0.0128676</w:t>
             </w:r>
           </w:p>
         </w:tc>
@@ -7101,7 +7101,7 @@
                 <w:szCs w:val="18"/>
                 <w:lang w:eastAsia="es-PE"/>
               </w:rPr>
-              <w:t>21</w:t>
+              <w:t xml:space="preserve">30</w:t>
             </w:r>
           </w:p>
         </w:tc>
@@ -7147,7 +7147,7 @@
                 <w:szCs w:val="18"/>
                 <w:lang w:eastAsia="es-PE"/>
               </w:rPr>
-              <w:t>Total</w:t>
+              <w:t xml:space="preserve">Total</w:t>
             </w:r>
           </w:p>
         </w:tc>
@@ -7188,7 +7188,7 @@
                 <w:szCs w:val="18"/>
                 <w:lang w:eastAsia="es-PE"/>
               </w:rPr>
-              <w:t>20,599</w:t>
+              <w:t xml:space="preserve">21 255</w:t>
             </w:r>
           </w:p>
         </w:tc>
@@ -7229,7 +7229,7 @@
                 <w:szCs w:val="18"/>
                 <w:lang w:eastAsia="es-PE"/>
               </w:rPr>
-              <w:t>1</w:t>
+              <w:t xml:space="preserve">1</w:t>
             </w:r>
           </w:p>
         </w:tc>
@@ -7352,7 +7352,7 @@
                 <w:szCs w:val="18"/>
                 <w:lang w:eastAsia="es-PE"/>
               </w:rPr>
-              <w:t>0.2500</w:t>
+              <w:t xml:space="preserve">0.2500</w:t>
             </w:r>
           </w:p>
         </w:tc>
@@ -7393,7 +7393,7 @@
                 <w:szCs w:val="18"/>
                 <w:lang w:eastAsia="es-PE"/>
               </w:rPr>
-              <w:t>588</w:t>
+              <w:t xml:space="preserve">588</w:t>
             </w:r>
           </w:p>
         </w:tc>
@@ -7649,7 +7649,7 @@
                                 <w:sz w:val="14"/>
                                 <w:szCs w:val="14"/>
                               </w:rPr>
-                              <w:t>588</w:t>
+                              <w:t xml:space="preserve">588</w:t>
                             </w:r>
                           </w:p>
                         </w:txbxContent>
@@ -7690,7 +7690,7 @@
                           <w:sz w:val="14"/>
                           <w:szCs w:val="14"/>
                         </w:rPr>
-                        <w:t>588</w:t>
+                        <w:t xml:space="preserve">588</w:t>
                       </w:r>
                     </w:p>
                   </w:txbxContent>
@@ -8206,7 +8206,7 @@
           <w:sz w:val="24"/>
           <w:szCs w:val="24"/>
         </w:rPr>
-        <w:t>588</w:t>
+        <w:t xml:space="preserve">588</w:t>
       </w:r>
       <w:r>
         <w:rPr>
@@ -9936,7 +9936,7 @@
                 <w:color w:val="000000" w:themeColor="text1"/>
                 <w:lang w:eastAsia="es-PE"/>
               </w:rPr>
-              <w:t>Regional</w:t>
+              <w:t xml:space="preserve">Regional</w:t>
             </w:r>
           </w:p>
         </w:tc>
@@ -10010,7 +10010,7 @@
                 <w:color w:val="000000" w:themeColor="text1"/>
                 <w:lang w:eastAsia="es-PE"/>
               </w:rPr>
-              <w:t xml:space="preserve">424</w:t>
+              <w:t xml:space="preserve">408</w:t>
             </w:r>
           </w:p>
         </w:tc>
@@ -10047,7 +10047,7 @@
                 <w:color w:val="000000" w:themeColor="text1"/>
                 <w:lang w:eastAsia="es-PE"/>
               </w:rPr>
-              <w:t xml:space="preserve">72.1%</w:t>
+              <w:t xml:space="preserve">69.4%</w:t>
             </w:r>
           </w:p>
         </w:tc>
@@ -10084,7 +10084,7 @@
                 <w:color w:val="000000" w:themeColor="text1"/>
                 <w:lang w:eastAsia="es-PE"/>
               </w:rPr>
-              <w:t xml:space="preserve">164</w:t>
+              <w:t xml:space="preserve">180</w:t>
             </w:r>
           </w:p>
         </w:tc>
@@ -10121,7 +10121,7 @@
                 <w:color w:val="000000" w:themeColor="text1"/>
                 <w:lang w:eastAsia="es-PE"/>
               </w:rPr>
-              <w:t xml:space="preserve">27.9%</w:t>
+              <w:t xml:space="preserve">30.6%</w:t>
             </w:r>
           </w:p>
         </w:tc>
@@ -10152,7 +10152,7 @@
                 <w:color w:val="000000" w:themeColor="text1"/>
                 <w:lang w:eastAsia="es-PE"/>
               </w:rPr>
-              <w:t>Chiclayo</w:t>
+              <w:t xml:space="preserve">Chiclayo</w:t>
             </w:r>
           </w:p>
         </w:tc>
@@ -10178,7 +10178,7 @@
                 <w:color w:val="000000" w:themeColor="text1"/>
                 <w:lang w:eastAsia="es-PE"/>
               </w:rPr>
-              <w:t xml:space="preserve">394</w:t>
+              <w:t xml:space="preserve">368</w:t>
             </w:r>
           </w:p>
         </w:tc>
@@ -10204,7 +10204,7 @@
                 <w:color w:val="000000" w:themeColor="text1"/>
                 <w:lang w:eastAsia="es-PE"/>
               </w:rPr>
-              <w:t xml:space="preserve">256</w:t>
+              <w:t xml:space="preserve">223</w:t>
             </w:r>
           </w:p>
         </w:tc>
@@ -10230,7 +10230,7 @@
                 <w:color w:val="000000" w:themeColor="text1"/>
                 <w:lang w:eastAsia="es-PE"/>
               </w:rPr>
-              <w:t xml:space="preserve">43.5%</w:t>
+              <w:t xml:space="preserve">37.9%</w:t>
             </w:r>
           </w:p>
         </w:tc>
@@ -10256,7 +10256,7 @@
                 <w:color w:val="000000" w:themeColor="text1"/>
                 <w:lang w:eastAsia="es-PE"/>
               </w:rPr>
-              <w:t xml:space="preserve">138</w:t>
+              <w:t xml:space="preserve">145</w:t>
             </w:r>
           </w:p>
         </w:tc>
@@ -10282,7 +10282,7 @@
                 <w:color w:val="000000" w:themeColor="text1"/>
                 <w:lang w:eastAsia="es-PE"/>
               </w:rPr>
-              <w:t xml:space="preserve">23.5%</w:t>
+              <w:t xml:space="preserve">24.7%</w:t>
             </w:r>
           </w:p>
         </w:tc>
@@ -10314,7 +10314,7 @@
                 <w:color w:val="000000" w:themeColor="text1"/>
                 <w:lang w:eastAsia="es-PE"/>
               </w:rPr>
-              <w:t>Ferreñafe</w:t>
+              <w:t xml:space="preserve">Ferreñafe</w:t>
             </w:r>
           </w:p>
         </w:tc>
@@ -10341,7 +10341,7 @@
                 <w:color w:val="000000" w:themeColor="text1"/>
                 <w:lang w:eastAsia="es-PE"/>
               </w:rPr>
-              <w:t xml:space="preserve">54</w:t>
+              <w:t xml:space="preserve">55</w:t>
             </w:r>
           </w:p>
         </w:tc>
@@ -10368,7 +10368,7 @@
                 <w:color w:val="000000" w:themeColor="text1"/>
                 <w:lang w:eastAsia="es-PE"/>
               </w:rPr>
-              <w:t xml:space="preserve">49</w:t>
+              <w:t xml:space="preserve">50</w:t>
             </w:r>
           </w:p>
         </w:tc>
@@ -10395,7 +10395,7 @@
                 <w:color w:val="000000" w:themeColor="text1"/>
                 <w:lang w:eastAsia="es-PE"/>
               </w:rPr>
-              <w:t xml:space="preserve">8.3%</w:t>
+              <w:t xml:space="preserve">8.5%</w:t>
             </w:r>
           </w:p>
         </w:tc>
@@ -10486,7 +10486,7 @@
                 <w:color w:val="000000" w:themeColor="text1"/>
                 <w:lang w:eastAsia="es-PE"/>
               </w:rPr>
-              <w:t>Lambayeque</w:t>
+              <w:t xml:space="preserve">Lambayeque</w:t>
             </w:r>
           </w:p>
         </w:tc>
@@ -10518,7 +10518,7 @@
                 <w:color w:val="000000" w:themeColor="text1"/>
                 <w:lang w:eastAsia="es-PE"/>
               </w:rPr>
-              <w:t xml:space="preserve">140</w:t>
+              <w:t xml:space="preserve">165</w:t>
             </w:r>
           </w:p>
         </w:tc>
@@ -10550,7 +10550,7 @@
                 <w:color w:val="000000" w:themeColor="text1"/>
                 <w:lang w:eastAsia="es-PE"/>
               </w:rPr>
-              <w:t xml:space="preserve">119</w:t>
+              <w:t xml:space="preserve">135</w:t>
             </w:r>
           </w:p>
         </w:tc>
@@ -10582,7 +10582,7 @@
                 <w:color w:val="000000" w:themeColor="text1"/>
                 <w:lang w:eastAsia="es-PE"/>
               </w:rPr>
-              <w:t xml:space="preserve">20.2%</w:t>
+              <w:t xml:space="preserve">23.0%</w:t>
             </w:r>
           </w:p>
         </w:tc>
@@ -10614,7 +10614,7 @@
                 <w:color w:val="000000" w:themeColor="text1"/>
                 <w:lang w:eastAsia="es-PE"/>
               </w:rPr>
-              <w:t xml:space="preserve">21</w:t>
+              <w:t xml:space="preserve">30</w:t>
             </w:r>
           </w:p>
         </w:tc>
@@ -10646,7 +10646,7 @@
                 <w:color w:val="000000" w:themeColor="text1"/>
                 <w:lang w:eastAsia="es-PE"/>
               </w:rPr>
-              <w:t xml:space="preserve">3.6%</w:t>
+              <w:t xml:space="preserve">5.1%</w:t>
             </w:r>
           </w:p>
         </w:tc>
@@ -10706,34 +10706,34 @@
           <w:sz w:val="24"/>
           <w:szCs w:val="24"/>
         </w:rPr>
-        <w:t>Como podemos</w:t>
-      </w:r>
-      <w:r>
-        <w:rPr>
-          <w:rFonts w:ascii="Times New Roman" w:hAnsi="Times New Roman" w:cs="Times New Roman"/>
-          <w:color w:val="000000" w:themeColor="text1"/>
-          <w:sz w:val="24"/>
-          <w:szCs w:val="24"/>
-        </w:rPr>
-        <w:t xml:space="preserve"> ver a nivel regional, </w:t>
-      </w:r>
-      <w:r>
-        <w:rPr>
-          <w:rFonts w:ascii="Times New Roman" w:hAnsi="Times New Roman" w:cs="Times New Roman"/>
-          <w:color w:val="000000" w:themeColor="text1"/>
-          <w:sz w:val="24"/>
-          <w:szCs w:val="24"/>
-        </w:rPr>
-        <w:t>el 72.1% de estudiantes asiste a instituciones públicas, mientras que el 27.9% lo hace en instituciones privadas. En Chiclayo, el 43.5% pertenece a instituciones públicas y el 23.5% a privadas. Ferreñafe muestra un menor porcentaje con el 8.3% en instituciones públicas y el 0.9% en privadas. Por último, en Lambayeque, el 20.2% asiste a instituciones públicas y el 3.6% a privadas</w:t>
-      </w:r>
-      <w:r>
-        <w:rPr>
-          <w:rFonts w:ascii="Times New Roman" w:hAnsi="Times New Roman" w:cs="Times New Roman"/>
-          <w:color w:val="000000" w:themeColor="text1"/>
-          <w:sz w:val="24"/>
-          <w:szCs w:val="24"/>
-        </w:rPr>
-        <w:t xml:space="preserve">. </w:t>
+        <w:t xml:space="preserve">Como podemos ver a nivel regional, el 69.4% de estudiantes asiste a instituciones públicas, mientras que el 30.6% lo hace en instituciones privadas. En Chiclayo, el 37.9% pertenece a instituciones públicas y el 24.7% a privadas. Ferreñafe muestra un menor porcentaje con el 8.5% en instituciones públicas y el 0.9% en privadas. Por último, en Lambayeque, el 23.0% asiste a instituciones públicas y el 5.1% a privadas. </w:t>
+      </w:r>
+      <w:r>
+        <w:rPr>
+          <w:rFonts w:ascii="Times New Roman" w:hAnsi="Times New Roman" w:cs="Times New Roman"/>
+          <w:color w:val="000000" w:themeColor="text1"/>
+          <w:sz w:val="24"/>
+          <w:szCs w:val="24"/>
+        </w:rPr>
+        <w:t xml:space="preserve"/>
+      </w:r>
+      <w:r>
+        <w:rPr>
+          <w:rFonts w:ascii="Times New Roman" w:hAnsi="Times New Roman" w:cs="Times New Roman"/>
+          <w:color w:val="000000" w:themeColor="text1"/>
+          <w:sz w:val="24"/>
+          <w:szCs w:val="24"/>
+        </w:rPr>
+        <w:t/>
+      </w:r>
+      <w:r>
+        <w:rPr>
+          <w:rFonts w:ascii="Times New Roman" w:hAnsi="Times New Roman" w:cs="Times New Roman"/>
+          <w:color w:val="000000" w:themeColor="text1"/>
+          <w:sz w:val="24"/>
+          <w:szCs w:val="24"/>
+        </w:rPr>
+        <w:t xml:space="preserve"/>
       </w:r>
     </w:p>
     <w:p>
@@ -10768,16 +10768,16 @@
           <w:sz w:val="24"/>
           <w:szCs w:val="24"/>
         </w:rPr>
-        <w:t xml:space="preserve">Por ello, </w:t>
-      </w:r>
-      <w:r>
-        <w:rPr>
-          <w:rFonts w:ascii="Times New Roman" w:hAnsi="Times New Roman" w:cs="Times New Roman"/>
-          <w:color w:val="000000" w:themeColor="text1"/>
-          <w:sz w:val="24"/>
-          <w:szCs w:val="24"/>
-        </w:rPr>
-        <w:t>la provincia de Chiclayo, el 43.5% de los estudiantes encuestados asisten a instituciones educativas públicas, lo que indica una mayor preferencia por este tipo de instituciones en comparación con las privadas, que representan el 23.5% de la muestra. Esta proporción sugiere una demanda significativa y predominante hacia las instituciones públicas en esta provincia</w:t>
+        <w:t xml:space="preserve">Por ello, en la provincia de Chiclayo, el 37.9% de los estudiantes encuestados asisten a instituciones educativas públicas, lo que indica una mayor preferencia por este tipo de instituciones en comparación con las privadas, que representan el 24.7% de la muestra. Esta proporción sugiere una demanda significativa y predominante hacia las instituciones públicas en esta provincia.</w:t>
+      </w:r>
+      <w:r>
+        <w:rPr>
+          <w:rFonts w:ascii="Times New Roman" w:hAnsi="Times New Roman" w:cs="Times New Roman"/>
+          <w:color w:val="000000" w:themeColor="text1"/>
+          <w:sz w:val="24"/>
+          <w:szCs w:val="24"/>
+        </w:rPr>
+        <w:t/>
       </w:r>
     </w:p>
     <w:p>
@@ -28500,7 +28500,7 @@
                 <w:color w:val="000000" w:themeColor="text1"/>
                 <w:lang w:eastAsia="es-PE"/>
               </w:rPr>
-              <w:t xml:space="preserve">20631</w:t>
+              <w:t xml:space="preserve">21255</w:t>
             </w:r>
           </w:p>
         </w:tc>
@@ -28605,7 +28605,7 @@
           <w:sz w:val="24"/>
           <w:szCs w:val="24"/>
         </w:rPr>
-        <w:t xml:space="preserve">El mercado factible está conformado por los estudiantes de 5° de secundaria de la región Lambayeque (marco muestral ESCALE 2022), que asciende a 20631 estudiantes, lo que representa el 1.5% de la población regional proyectada al 2026.</w:t>
+        <w:t xml:space="preserve">El mercado factible está conformado por los estudiantes de 5° de secundaria de la región Lambayeque (SIAGIE, Reporte de Matrícula 2025), que asciende a 21255 estudiantes, lo que representa el 1.5% de la población regional proyectada al 2026.</w:t>
       </w:r>
       <w:r>
         <w:rPr>

</xml_diff>

<commit_message>
Tabla 4: Farmacia en 6.º lugar (f=34), restore Laboratorio Clínico row, total 588; UTP figures are Chiclayo
Co-Authored-By: Claude Sonnet 5.5 <noreply@anthropic.com>
Claude-Session: https://claude.ai/code/session_01SPdMPfWMtqGAvnNeyJFNHL
</commit_message>
<xml_diff>
--- a/demanda/Demanda Social - FARMACIA Y BIOQUIMICA.docx
+++ b/demanda/Demanda Social - FARMACIA Y BIOQUIMICA.docx
@@ -10969,7 +10969,7 @@
           <w:sz w:val="24"/>
           <w:szCs w:val="24"/>
         </w:rPr>
-        <w:t xml:space="preserve">En la región Lambayeque, la carrera de Farmacia y Bioquímica solo registra postulantes en la Universidad Tecnológica del Perú (UTP), única universidad licenciada de la región que la ofrece desde el año 2025. Según su portal de transparencia (postulantes e ingresantes de pregrado 2022-2025), la UTP registró 276 postulantes en su primer año a nivel nacional: 201 en el ciclo 2025-1 y 75 en el ciclo 2025-2. La UTP consolida sus cifras para todas sus sedes, por lo que este total constituye un tope superior de los postulantes en Chiclayo. Ninguna otra universidad licenciada de la región (UNPRG, USAT, USS, UCV y USMP) ofrece la carrera, lo que refleja la necesidad de ampliar los programas educativos adaptados a las demandas de formación farmacéutica en la región.</w:t>
+        <w:t xml:space="preserve">En la región Lambayeque, la carrera de Farmacia y Bioquímica solo registra postulantes en la Universidad Tecnológica del Perú (UTP), sede Chiclayo, única universidad licenciada de la región que la ofrece desde el año 2025. Según el portal de transparencia de la UTP (postulantes e ingresantes de pregrado 2022-2025), en su primer año la sede Chiclayo registró 276 postulantes: 201 en el ciclo 2025-1 y 75 en el ciclo 2025-2. Ninguna otra universidad licenciada de la región (UNPRG, USAT, USS, UCV y USMP) ofrece la carrera, lo que refleja la necesidad de ampliar los programas educativos adaptados a las demandas de formación farmacéutica en la región.</w:t>
       </w:r>
       <w:r>
         <w:rPr>
@@ -11088,7 +11088,7 @@
           <w:sz w:val="24"/>
           <w:szCs w:val="24"/>
         </w:rPr>
-        <w:t xml:space="preserve">En la región Lambayeque, los ingresantes en la carrera de Farmacia y Bioquímica corresponden únicamente a la Universidad Tecnológica del Perú (UTP): 240 ingresantes en 2025 a nivel nacional (186 en el ciclo 2025-1 y 54 en el ciclo 2025-2), con 158 matriculados en 2025-I y 144 en 2025-II. Al no publicarse el desagregado por sede, esta cifra se toma como tope superior de la oferta en Chiclayo. Como referencia histórica, la Universidad Alas Peruanas (UAP), filial Chiclayo, ofreció la carrera hasta diciembre de 2019, cuando cesó por la denegatoria del licenciamiento institucional. La escasa oferta licenciada en el ámbito universitario local subraya la necesidad de desarrollar programas académicos que atiendan las demandas educativas en Farmacia y Bioquímica en la región.</w:t>
+        <w:t xml:space="preserve">En la región Lambayeque, los ingresantes en la carrera de Farmacia y Bioquímica corresponden únicamente a la Universidad Tecnológica del Perú (UTP), sede Chiclayo: 240 ingresantes en 2025 (186 en el ciclo 2025-1 y 54 en el ciclo 2025-2), con 158 matriculados en 2025-I y 144 en 2025-II. Como referencia histórica, la Universidad Alas Peruanas (UAP), filial Chiclayo, ofreció la carrera hasta diciembre de 2019, cuando cesó por la denegatoria del licenciamiento institucional. La escasa oferta licenciada en el ámbito universitario local subraya la necesidad de desarrollar programas académicos que atiendan las demandas educativas en Farmacia y Bioquímica en la región.</w:t>
       </w:r>
       <w:r>
         <w:rPr>
@@ -11489,7 +11489,7 @@
                 <w:szCs w:val="20"/>
                 <w:lang w:eastAsia="es-PE"/>
               </w:rPr>
-              <w:t xml:space="preserve">92</w:t>
+              <w:t xml:space="preserve">86</w:t>
             </w:r>
           </w:p>
         </w:tc>
@@ -11523,7 +11523,7 @@
                 <w:szCs w:val="20"/>
                 <w:lang w:eastAsia="es-PE"/>
               </w:rPr>
-              <w:t xml:space="preserve">15.6</w:t>
+              <w:t xml:space="preserve">14.6</w:t>
             </w:r>
           </w:p>
         </w:tc>
@@ -11602,7 +11602,7 @@
                 <w:szCs w:val="20"/>
                 <w:lang w:eastAsia="es-PE"/>
               </w:rPr>
-              <w:t xml:space="preserve">78</w:t>
+              <w:t xml:space="preserve">73</w:t>
             </w:r>
           </w:p>
         </w:tc>
@@ -11638,7 +11638,7 @@
                 <w:szCs w:val="20"/>
                 <w:lang w:eastAsia="es-PE"/>
               </w:rPr>
-              <w:t xml:space="preserve">13.3</w:t>
+              <w:t xml:space="preserve">12.4</w:t>
             </w:r>
           </w:p>
         </w:tc>
@@ -11654,7 +11654,6 @@
             <w:cnfStyle w:val="001000000000" w:firstRow="0" w:lastRow="0" w:firstColumn="1" w:lastColumn="0" w:oddVBand="0" w:evenVBand="0" w:oddHBand="0" w:evenHBand="0" w:firstRowFirstColumn="0" w:firstRowLastColumn="0" w:lastRowFirstColumn="0" w:lastRowLastColumn="0"/>
             <w:tcW w:w="6804" w:type="dxa"/>
             <w:tcBorders>
-              <w:top w:val="nil"/>
               <w:bottom w:val="nil"/>
               <w:right w:val="nil"/>
             </w:tcBorders>
@@ -11682,33 +11681,34 @@
               </w:rPr>
               <w:t xml:space="preserve">Ing. Civil</w:t>
             </w:r>
-          </w:p>
-        </w:tc>
-        <w:tc>
-          <w:tcPr>
-            <w:tcW w:w="284" w:type="dxa"/>
-            <w:tcBorders>
-              <w:top w:val="nil"/>
-              <w:left w:val="nil"/>
-              <w:bottom w:val="nil"/>
-              <w:right w:val="nil"/>
-            </w:tcBorders>
-            <w:noWrap/>
-            <w:hideMark/>
-          </w:tcPr>
-          <w:p>
-            <w:pPr>
-              <w:jc w:val="center"/>
-              <w:cnfStyle w:val="000000100000" w:firstRow="0" w:lastRow="0" w:firstColumn="0" w:lastColumn="0" w:oddVBand="0" w:evenVBand="0" w:oddHBand="1" w:evenHBand="0" w:firstRowFirstColumn="0" w:firstRowLastColumn="0" w:lastRowFirstColumn="0" w:lastRowLastColumn="0"/>
-              <w:rPr>
-                <w:rFonts w:ascii="Times New Roman" w:eastAsia="Times New Roman" w:hAnsi="Times New Roman" w:cs="Times New Roman"/>
+            <w:r>
+              <w:rPr>
+                <w:rFonts w:ascii="Times New Roman" w:eastAsia="Times New Roman" w:hAnsi="Times New Roman" w:cs="Times New Roman"/>
+                <w:b w:val="0"/>
                 <w:color w:val="000000" w:themeColor="text1"/>
                 <w:sz w:val="20"/>
                 <w:szCs w:val="20"/>
                 <w:lang w:eastAsia="es-PE"/>
               </w:rPr>
-            </w:pPr>
-            <w:r>
+              <w:t xml:space="preserve"/>
+            </w:r>
+          </w:p>
+        </w:tc>
+        <w:tc>
+          <w:tcPr>
+            <w:tcW w:w="284" w:type="dxa"/>
+            <w:tcBorders>
+              <w:left w:val="nil"/>
+              <w:bottom w:val="nil"/>
+              <w:right w:val="nil"/>
+            </w:tcBorders>
+            <w:noWrap/>
+            <w:hideMark/>
+          </w:tcPr>
+          <w:p>
+            <w:pPr>
+              <w:jc w:val="center"/>
+              <w:cnfStyle w:val="000000100000" w:firstRow="0" w:lastRow="0" w:firstColumn="0" w:lastColumn="0" w:oddVBand="0" w:evenVBand="0" w:oddHBand="1" w:evenHBand="0" w:firstRowFirstColumn="0" w:firstRowLastColumn="0" w:lastRowFirstColumn="0" w:lastRowLastColumn="0"/>
               <w:rPr>
                 <w:rFonts w:ascii="Times New Roman" w:eastAsia="Times New Roman" w:hAnsi="Times New Roman" w:cs="Times New Roman"/>
                 <w:color w:val="000000" w:themeColor="text1"/>
@@ -11716,25 +11716,8 @@
                 <w:szCs w:val="20"/>
                 <w:lang w:eastAsia="es-PE"/>
               </w:rPr>
-              <w:t xml:space="preserve">50</w:t>
-            </w:r>
-          </w:p>
-        </w:tc>
-        <w:tc>
-          <w:tcPr>
-            <w:tcW w:w="1279" w:type="dxa"/>
-            <w:tcBorders>
-              <w:top w:val="nil"/>
-              <w:left w:val="nil"/>
-              <w:bottom w:val="nil"/>
-            </w:tcBorders>
-            <w:noWrap/>
-            <w:hideMark/>
-          </w:tcPr>
-          <w:p>
-            <w:pPr>
-              <w:jc w:val="center"/>
-              <w:cnfStyle w:val="000000100000" w:firstRow="0" w:lastRow="0" w:firstColumn="0" w:lastColumn="0" w:oddVBand="0" w:evenVBand="0" w:oddHBand="1" w:evenHBand="0" w:firstRowFirstColumn="0" w:firstRowLastColumn="0" w:lastRowFirstColumn="0" w:lastRowLastColumn="0"/>
+            </w:pPr>
+            <w:r>
               <w:rPr>
                 <w:rFonts w:ascii="Times New Roman" w:eastAsia="Times New Roman" w:hAnsi="Times New Roman" w:cs="Times New Roman"/>
                 <w:color w:val="000000" w:themeColor="text1"/>
@@ -11742,8 +11725,24 @@
                 <w:szCs w:val="20"/>
                 <w:lang w:eastAsia="es-PE"/>
               </w:rPr>
-            </w:pPr>
-            <w:r>
+              <w:t xml:space="preserve">47</w:t>
+            </w:r>
+          </w:p>
+        </w:tc>
+        <w:tc>
+          <w:tcPr>
+            <w:tcW w:w="1279" w:type="dxa"/>
+            <w:tcBorders>
+              <w:left w:val="nil"/>
+              <w:bottom w:val="nil"/>
+            </w:tcBorders>
+            <w:noWrap/>
+            <w:hideMark/>
+          </w:tcPr>
+          <w:p>
+            <w:pPr>
+              <w:jc w:val="center"/>
+              <w:cnfStyle w:val="000000100000" w:firstRow="0" w:lastRow="0" w:firstColumn="0" w:lastColumn="0" w:oddVBand="0" w:evenVBand="0" w:oddHBand="1" w:evenHBand="0" w:firstRowFirstColumn="0" w:firstRowLastColumn="0" w:lastRowFirstColumn="0" w:lastRowLastColumn="0"/>
               <w:rPr>
                 <w:rFonts w:ascii="Times New Roman" w:eastAsia="Times New Roman" w:hAnsi="Times New Roman" w:cs="Times New Roman"/>
                 <w:color w:val="000000" w:themeColor="text1"/>
@@ -11751,7 +11750,16 @@
                 <w:szCs w:val="20"/>
                 <w:lang w:eastAsia="es-PE"/>
               </w:rPr>
-              <w:t xml:space="preserve">8.5</w:t>
+            </w:pPr>
+            <w:r>
+              <w:rPr>
+                <w:rFonts w:ascii="Times New Roman" w:eastAsia="Times New Roman" w:hAnsi="Times New Roman" w:cs="Times New Roman"/>
+                <w:color w:val="000000" w:themeColor="text1"/>
+                <w:sz w:val="20"/>
+                <w:szCs w:val="20"/>
+                <w:lang w:eastAsia="es-PE"/>
+              </w:rPr>
+              <w:t xml:space="preserve">8.0</w:t>
             </w:r>
           </w:p>
         </w:tc>
@@ -11830,7 +11838,7 @@
                 <w:szCs w:val="20"/>
                 <w:lang w:eastAsia="es-PE"/>
               </w:rPr>
-              <w:t xml:space="preserve">40</w:t>
+              <w:t xml:space="preserve">38</w:t>
             </w:r>
           </w:p>
         </w:tc>
@@ -11866,7 +11874,7 @@
                 <w:szCs w:val="20"/>
                 <w:lang w:eastAsia="es-PE"/>
               </w:rPr>
-              <w:t xml:space="preserve">6.8</w:t>
+              <w:t xml:space="preserve">6.5</w:t>
             </w:r>
           </w:p>
         </w:tc>
@@ -11882,7 +11890,6 @@
             <w:cnfStyle w:val="001000000000" w:firstRow="0" w:lastRow="0" w:firstColumn="1" w:lastColumn="0" w:oddVBand="0" w:evenVBand="0" w:oddHBand="0" w:evenHBand="0" w:firstRowFirstColumn="0" w:firstRowLastColumn="0" w:lastRowFirstColumn="0" w:lastRowLastColumn="0"/>
             <w:tcW w:w="6804" w:type="dxa"/>
             <w:tcBorders>
-              <w:top w:val="nil"/>
               <w:bottom w:val="nil"/>
               <w:right w:val="nil"/>
             </w:tcBorders>
@@ -11910,33 +11917,34 @@
               </w:rPr>
               <w:t xml:space="preserve">Administración</w:t>
             </w:r>
-          </w:p>
-        </w:tc>
-        <w:tc>
-          <w:tcPr>
-            <w:tcW w:w="284" w:type="dxa"/>
-            <w:tcBorders>
-              <w:top w:val="nil"/>
-              <w:left w:val="nil"/>
-              <w:bottom w:val="nil"/>
-              <w:right w:val="nil"/>
-            </w:tcBorders>
-            <w:noWrap/>
-            <w:hideMark/>
-          </w:tcPr>
-          <w:p>
-            <w:pPr>
-              <w:jc w:val="center"/>
-              <w:cnfStyle w:val="000000100000" w:firstRow="0" w:lastRow="0" w:firstColumn="0" w:lastColumn="0" w:oddVBand="0" w:evenVBand="0" w:oddHBand="1" w:evenHBand="0" w:firstRowFirstColumn="0" w:firstRowLastColumn="0" w:lastRowFirstColumn="0" w:lastRowLastColumn="0"/>
-              <w:rPr>
-                <w:rFonts w:ascii="Times New Roman" w:eastAsia="Times New Roman" w:hAnsi="Times New Roman" w:cs="Times New Roman"/>
+            <w:r>
+              <w:rPr>
+                <w:rFonts w:ascii="Times New Roman" w:eastAsia="Times New Roman" w:hAnsi="Times New Roman" w:cs="Times New Roman"/>
+                <w:b w:val="0"/>
                 <w:color w:val="000000" w:themeColor="text1"/>
                 <w:sz w:val="20"/>
                 <w:szCs w:val="20"/>
                 <w:lang w:eastAsia="es-PE"/>
               </w:rPr>
-            </w:pPr>
-            <w:r>
+              <w:t xml:space="preserve"/>
+            </w:r>
+          </w:p>
+        </w:tc>
+        <w:tc>
+          <w:tcPr>
+            <w:tcW w:w="284" w:type="dxa"/>
+            <w:tcBorders>
+              <w:left w:val="nil"/>
+              <w:bottom w:val="nil"/>
+              <w:right w:val="nil"/>
+            </w:tcBorders>
+            <w:noWrap/>
+            <w:hideMark/>
+          </w:tcPr>
+          <w:p>
+            <w:pPr>
+              <w:jc w:val="center"/>
+              <w:cnfStyle w:val="000000100000" w:firstRow="0" w:lastRow="0" w:firstColumn="0" w:lastColumn="0" w:oddVBand="0" w:evenVBand="0" w:oddHBand="1" w:evenHBand="0" w:firstRowFirstColumn="0" w:firstRowLastColumn="0" w:lastRowFirstColumn="0" w:lastRowLastColumn="0"/>
               <w:rPr>
                 <w:rFonts w:ascii="Times New Roman" w:eastAsia="Times New Roman" w:hAnsi="Times New Roman" w:cs="Times New Roman"/>
                 <w:color w:val="000000" w:themeColor="text1"/>
@@ -11944,25 +11952,8 @@
                 <w:szCs w:val="20"/>
                 <w:lang w:eastAsia="es-PE"/>
               </w:rPr>
-              <w:t xml:space="preserve">35</w:t>
-            </w:r>
-          </w:p>
-        </w:tc>
-        <w:tc>
-          <w:tcPr>
-            <w:tcW w:w="1279" w:type="dxa"/>
-            <w:tcBorders>
-              <w:top w:val="nil"/>
-              <w:left w:val="nil"/>
-              <w:bottom w:val="nil"/>
-            </w:tcBorders>
-            <w:noWrap/>
-            <w:hideMark/>
-          </w:tcPr>
-          <w:p>
-            <w:pPr>
-              <w:jc w:val="center"/>
-              <w:cnfStyle w:val="000000100000" w:firstRow="0" w:lastRow="0" w:firstColumn="0" w:lastColumn="0" w:oddVBand="0" w:evenVBand="0" w:oddHBand="1" w:evenHBand="0" w:firstRowFirstColumn="0" w:firstRowLastColumn="0" w:lastRowFirstColumn="0" w:lastRowLastColumn="0"/>
+            </w:pPr>
+            <w:r>
               <w:rPr>
                 <w:rFonts w:ascii="Times New Roman" w:eastAsia="Times New Roman" w:hAnsi="Times New Roman" w:cs="Times New Roman"/>
                 <w:color w:val="000000" w:themeColor="text1"/>
@@ -11970,8 +11961,24 @@
                 <w:szCs w:val="20"/>
                 <w:lang w:eastAsia="es-PE"/>
               </w:rPr>
-            </w:pPr>
-            <w:r>
+              <w:t xml:space="preserve">33</w:t>
+            </w:r>
+          </w:p>
+        </w:tc>
+        <w:tc>
+          <w:tcPr>
+            <w:tcW w:w="1279" w:type="dxa"/>
+            <w:tcBorders>
+              <w:left w:val="nil"/>
+              <w:bottom w:val="nil"/>
+            </w:tcBorders>
+            <w:noWrap/>
+            <w:hideMark/>
+          </w:tcPr>
+          <w:p>
+            <w:pPr>
+              <w:jc w:val="center"/>
+              <w:cnfStyle w:val="000000100000" w:firstRow="0" w:lastRow="0" w:firstColumn="0" w:lastColumn="0" w:oddVBand="0" w:evenVBand="0" w:oddHBand="1" w:evenHBand="0" w:firstRowFirstColumn="0" w:firstRowLastColumn="0" w:lastRowFirstColumn="0" w:lastRowLastColumn="0"/>
               <w:rPr>
                 <w:rFonts w:ascii="Times New Roman" w:eastAsia="Times New Roman" w:hAnsi="Times New Roman" w:cs="Times New Roman"/>
                 <w:color w:val="000000" w:themeColor="text1"/>
@@ -11979,7 +11986,16 @@
                 <w:szCs w:val="20"/>
                 <w:lang w:eastAsia="es-PE"/>
               </w:rPr>
-              <w:t xml:space="preserve">6.0</w:t>
+            </w:pPr>
+            <w:r>
+              <w:rPr>
+                <w:rFonts w:ascii="Times New Roman" w:eastAsia="Times New Roman" w:hAnsi="Times New Roman" w:cs="Times New Roman"/>
+                <w:color w:val="000000" w:themeColor="text1"/>
+                <w:sz w:val="20"/>
+                <w:szCs w:val="20"/>
+                <w:lang w:eastAsia="es-PE"/>
+              </w:rPr>
+              <w:t xml:space="preserve">5.6</w:t>
             </w:r>
           </w:p>
         </w:tc>
@@ -12021,7 +12037,7 @@
                 <w:szCs w:val="20"/>
                 <w:lang w:eastAsia="es-PE"/>
               </w:rPr>
-              <w:t xml:space="preserve">Negocios Internacionales</w:t>
+              <w:t xml:space="preserve">Farmacia y Bioquímica</w:t>
             </w:r>
           </w:p>
         </w:tc>
@@ -12058,7 +12074,7 @@
                 <w:szCs w:val="20"/>
                 <w:lang w:eastAsia="es-PE"/>
               </w:rPr>
-              <w:t xml:space="preserve">33</w:t>
+              <w:t xml:space="preserve">34</w:t>
             </w:r>
           </w:p>
         </w:tc>
@@ -12094,7 +12110,7 @@
                 <w:szCs w:val="20"/>
                 <w:lang w:eastAsia="es-PE"/>
               </w:rPr>
-              <w:t xml:space="preserve">5.6</w:t>
+              <w:t xml:space="preserve">5.8</w:t>
             </w:r>
           </w:p>
         </w:tc>
@@ -12110,7 +12126,6 @@
             <w:cnfStyle w:val="001000000000" w:firstRow="0" w:lastRow="0" w:firstColumn="1" w:lastColumn="0" w:oddVBand="0" w:evenVBand="0" w:oddHBand="0" w:evenHBand="0" w:firstRowFirstColumn="0" w:firstRowLastColumn="0" w:lastRowFirstColumn="0" w:lastRowLastColumn="0"/>
             <w:tcW w:w="6804" w:type="dxa"/>
             <w:tcBorders>
-              <w:top w:val="nil"/>
               <w:bottom w:val="nil"/>
               <w:right w:val="nil"/>
             </w:tcBorders>
@@ -12136,35 +12151,36 @@
                 <w:szCs w:val="20"/>
                 <w:lang w:eastAsia="es-PE"/>
               </w:rPr>
-              <w:t xml:space="preserve">Psicología</w:t>
-            </w:r>
-          </w:p>
-        </w:tc>
-        <w:tc>
-          <w:tcPr>
-            <w:tcW w:w="284" w:type="dxa"/>
-            <w:tcBorders>
-              <w:top w:val="nil"/>
-              <w:left w:val="nil"/>
-              <w:bottom w:val="nil"/>
-              <w:right w:val="nil"/>
-            </w:tcBorders>
-            <w:noWrap/>
-            <w:hideMark/>
-          </w:tcPr>
-          <w:p>
-            <w:pPr>
-              <w:jc w:val="center"/>
-              <w:cnfStyle w:val="000000100000" w:firstRow="0" w:lastRow="0" w:firstColumn="0" w:lastColumn="0" w:oddVBand="0" w:evenVBand="0" w:oddHBand="1" w:evenHBand="0" w:firstRowFirstColumn="0" w:firstRowLastColumn="0" w:lastRowFirstColumn="0" w:lastRowLastColumn="0"/>
-              <w:rPr>
-                <w:rFonts w:ascii="Times New Roman" w:eastAsia="Times New Roman" w:hAnsi="Times New Roman" w:cs="Times New Roman"/>
+              <w:t xml:space="preserve">Negocios Internacionales</w:t>
+            </w:r>
+            <w:r>
+              <w:rPr>
+                <w:rFonts w:ascii="Times New Roman" w:eastAsia="Times New Roman" w:hAnsi="Times New Roman" w:cs="Times New Roman"/>
+                <w:b w:val="0"/>
                 <w:color w:val="000000" w:themeColor="text1"/>
                 <w:sz w:val="20"/>
                 <w:szCs w:val="20"/>
                 <w:lang w:eastAsia="es-PE"/>
               </w:rPr>
-            </w:pPr>
-            <w:r>
+              <w:t xml:space="preserve"/>
+            </w:r>
+          </w:p>
+        </w:tc>
+        <w:tc>
+          <w:tcPr>
+            <w:tcW w:w="284" w:type="dxa"/>
+            <w:tcBorders>
+              <w:left w:val="nil"/>
+              <w:bottom w:val="nil"/>
+              <w:right w:val="nil"/>
+            </w:tcBorders>
+            <w:noWrap/>
+            <w:hideMark/>
+          </w:tcPr>
+          <w:p>
+            <w:pPr>
+              <w:jc w:val="center"/>
+              <w:cnfStyle w:val="000000100000" w:firstRow="0" w:lastRow="0" w:firstColumn="0" w:lastColumn="0" w:oddVBand="0" w:evenVBand="0" w:oddHBand="1" w:evenHBand="0" w:firstRowFirstColumn="0" w:firstRowLastColumn="0" w:lastRowFirstColumn="0" w:lastRowLastColumn="0"/>
               <w:rPr>
                 <w:rFonts w:ascii="Times New Roman" w:eastAsia="Times New Roman" w:hAnsi="Times New Roman" w:cs="Times New Roman"/>
                 <w:color w:val="000000" w:themeColor="text1"/>
@@ -12172,25 +12188,8 @@
                 <w:szCs w:val="20"/>
                 <w:lang w:eastAsia="es-PE"/>
               </w:rPr>
-              <w:t xml:space="preserve">33</w:t>
-            </w:r>
-          </w:p>
-        </w:tc>
-        <w:tc>
-          <w:tcPr>
-            <w:tcW w:w="1279" w:type="dxa"/>
-            <w:tcBorders>
-              <w:top w:val="nil"/>
-              <w:left w:val="nil"/>
-              <w:bottom w:val="nil"/>
-            </w:tcBorders>
-            <w:noWrap/>
-            <w:hideMark/>
-          </w:tcPr>
-          <w:p>
-            <w:pPr>
-              <w:jc w:val="center"/>
-              <w:cnfStyle w:val="000000100000" w:firstRow="0" w:lastRow="0" w:firstColumn="0" w:lastColumn="0" w:oddVBand="0" w:evenVBand="0" w:oddHBand="1" w:evenHBand="0" w:firstRowFirstColumn="0" w:firstRowLastColumn="0" w:lastRowFirstColumn="0" w:lastRowLastColumn="0"/>
+            </w:pPr>
+            <w:r>
               <w:rPr>
                 <w:rFonts w:ascii="Times New Roman" w:eastAsia="Times New Roman" w:hAnsi="Times New Roman" w:cs="Times New Roman"/>
                 <w:color w:val="000000" w:themeColor="text1"/>
@@ -12198,8 +12197,24 @@
                 <w:szCs w:val="20"/>
                 <w:lang w:eastAsia="es-PE"/>
               </w:rPr>
-            </w:pPr>
-            <w:r>
+              <w:t xml:space="preserve">31</w:t>
+            </w:r>
+          </w:p>
+        </w:tc>
+        <w:tc>
+          <w:tcPr>
+            <w:tcW w:w="1279" w:type="dxa"/>
+            <w:tcBorders>
+              <w:left w:val="nil"/>
+              <w:bottom w:val="nil"/>
+            </w:tcBorders>
+            <w:noWrap/>
+            <w:hideMark/>
+          </w:tcPr>
+          <w:p>
+            <w:pPr>
+              <w:jc w:val="center"/>
+              <w:cnfStyle w:val="000000100000" w:firstRow="0" w:lastRow="0" w:firstColumn="0" w:lastColumn="0" w:oddVBand="0" w:evenVBand="0" w:oddHBand="1" w:evenHBand="0" w:firstRowFirstColumn="0" w:firstRowLastColumn="0" w:lastRowFirstColumn="0" w:lastRowLastColumn="0"/>
               <w:rPr>
                 <w:rFonts w:ascii="Times New Roman" w:eastAsia="Times New Roman" w:hAnsi="Times New Roman" w:cs="Times New Roman"/>
                 <w:color w:val="000000" w:themeColor="text1"/>
@@ -12207,7 +12222,16 @@
                 <w:szCs w:val="20"/>
                 <w:lang w:eastAsia="es-PE"/>
               </w:rPr>
-              <w:t xml:space="preserve">5.6</w:t>
+            </w:pPr>
+            <w:r>
+              <w:rPr>
+                <w:rFonts w:ascii="Times New Roman" w:eastAsia="Times New Roman" w:hAnsi="Times New Roman" w:cs="Times New Roman"/>
+                <w:color w:val="000000" w:themeColor="text1"/>
+                <w:sz w:val="20"/>
+                <w:szCs w:val="20"/>
+                <w:lang w:eastAsia="es-PE"/>
+              </w:rPr>
+              <w:t xml:space="preserve">5.3</w:t>
             </w:r>
           </w:p>
         </w:tc>
@@ -12249,7 +12273,7 @@
                 <w:szCs w:val="20"/>
                 <w:lang w:eastAsia="es-PE"/>
               </w:rPr>
-              <w:t xml:space="preserve">Ing. de Sistemas</w:t>
+              <w:t xml:space="preserve">Psicología</w:t>
             </w:r>
           </w:p>
         </w:tc>
@@ -12286,7 +12310,7 @@
                 <w:szCs w:val="20"/>
                 <w:lang w:eastAsia="es-PE"/>
               </w:rPr>
-              <w:t xml:space="preserve">30</w:t>
+              <w:t xml:space="preserve">31</w:t>
             </w:r>
           </w:p>
         </w:tc>
@@ -12322,7 +12346,7 @@
                 <w:szCs w:val="20"/>
                 <w:lang w:eastAsia="es-PE"/>
               </w:rPr>
-              <w:t xml:space="preserve">5.1</w:t>
+              <w:t xml:space="preserve">5.3</w:t>
             </w:r>
           </w:p>
         </w:tc>
@@ -12338,7 +12362,6 @@
             <w:cnfStyle w:val="001000000000" w:firstRow="0" w:lastRow="0" w:firstColumn="1" w:lastColumn="0" w:oddVBand="0" w:evenVBand="0" w:oddHBand="0" w:evenHBand="0" w:firstRowFirstColumn="0" w:firstRowLastColumn="0" w:lastRowFirstColumn="0" w:lastRowLastColumn="0"/>
             <w:tcW w:w="6804" w:type="dxa"/>
             <w:tcBorders>
-              <w:top w:val="nil"/>
               <w:bottom w:val="nil"/>
               <w:right w:val="nil"/>
             </w:tcBorders>
@@ -12364,35 +12387,36 @@
                 <w:szCs w:val="20"/>
                 <w:lang w:eastAsia="es-PE"/>
               </w:rPr>
-              <w:t xml:space="preserve">Ing. Industrial</w:t>
-            </w:r>
-          </w:p>
-        </w:tc>
-        <w:tc>
-          <w:tcPr>
-            <w:tcW w:w="284" w:type="dxa"/>
-            <w:tcBorders>
-              <w:top w:val="nil"/>
-              <w:left w:val="nil"/>
-              <w:bottom w:val="nil"/>
-              <w:right w:val="nil"/>
-            </w:tcBorders>
-            <w:noWrap/>
-            <w:hideMark/>
-          </w:tcPr>
-          <w:p>
-            <w:pPr>
-              <w:jc w:val="center"/>
-              <w:cnfStyle w:val="000000100000" w:firstRow="0" w:lastRow="0" w:firstColumn="0" w:lastColumn="0" w:oddVBand="0" w:evenVBand="0" w:oddHBand="1" w:evenHBand="0" w:firstRowFirstColumn="0" w:firstRowLastColumn="0" w:lastRowFirstColumn="0" w:lastRowLastColumn="0"/>
-              <w:rPr>
-                <w:rFonts w:ascii="Times New Roman" w:eastAsia="Times New Roman" w:hAnsi="Times New Roman" w:cs="Times New Roman"/>
+              <w:t xml:space="preserve">Ing. de Sistemas</w:t>
+            </w:r>
+            <w:r>
+              <w:rPr>
+                <w:rFonts w:ascii="Times New Roman" w:eastAsia="Times New Roman" w:hAnsi="Times New Roman" w:cs="Times New Roman"/>
+                <w:b w:val="0"/>
                 <w:color w:val="000000" w:themeColor="text1"/>
                 <w:sz w:val="20"/>
                 <w:szCs w:val="20"/>
                 <w:lang w:eastAsia="es-PE"/>
               </w:rPr>
-            </w:pPr>
-            <w:r>
+              <w:t xml:space="preserve"/>
+            </w:r>
+          </w:p>
+        </w:tc>
+        <w:tc>
+          <w:tcPr>
+            <w:tcW w:w="284" w:type="dxa"/>
+            <w:tcBorders>
+              <w:left w:val="nil"/>
+              <w:bottom w:val="nil"/>
+              <w:right w:val="nil"/>
+            </w:tcBorders>
+            <w:noWrap/>
+            <w:hideMark/>
+          </w:tcPr>
+          <w:p>
+            <w:pPr>
+              <w:jc w:val="center"/>
+              <w:cnfStyle w:val="000000100000" w:firstRow="0" w:lastRow="0" w:firstColumn="0" w:lastColumn="0" w:oddVBand="0" w:evenVBand="0" w:oddHBand="1" w:evenHBand="0" w:firstRowFirstColumn="0" w:firstRowLastColumn="0" w:lastRowFirstColumn="0" w:lastRowLastColumn="0"/>
               <w:rPr>
                 <w:rFonts w:ascii="Times New Roman" w:eastAsia="Times New Roman" w:hAnsi="Times New Roman" w:cs="Times New Roman"/>
                 <w:color w:val="000000" w:themeColor="text1"/>
@@ -12400,25 +12424,8 @@
                 <w:szCs w:val="20"/>
                 <w:lang w:eastAsia="es-PE"/>
               </w:rPr>
-              <w:t xml:space="preserve">24</w:t>
-            </w:r>
-          </w:p>
-        </w:tc>
-        <w:tc>
-          <w:tcPr>
-            <w:tcW w:w="1279" w:type="dxa"/>
-            <w:tcBorders>
-              <w:top w:val="nil"/>
-              <w:left w:val="nil"/>
-              <w:bottom w:val="nil"/>
-            </w:tcBorders>
-            <w:noWrap/>
-            <w:hideMark/>
-          </w:tcPr>
-          <w:p>
-            <w:pPr>
-              <w:jc w:val="center"/>
-              <w:cnfStyle w:val="000000100000" w:firstRow="0" w:lastRow="0" w:firstColumn="0" w:lastColumn="0" w:oddVBand="0" w:evenVBand="0" w:oddHBand="1" w:evenHBand="0" w:firstRowFirstColumn="0" w:firstRowLastColumn="0" w:lastRowFirstColumn="0" w:lastRowLastColumn="0"/>
+            </w:pPr>
+            <w:r>
               <w:rPr>
                 <w:rFonts w:ascii="Times New Roman" w:eastAsia="Times New Roman" w:hAnsi="Times New Roman" w:cs="Times New Roman"/>
                 <w:color w:val="000000" w:themeColor="text1"/>
@@ -12426,8 +12433,24 @@
                 <w:szCs w:val="20"/>
                 <w:lang w:eastAsia="es-PE"/>
               </w:rPr>
-            </w:pPr>
-            <w:r>
+              <w:t xml:space="preserve">28</w:t>
+            </w:r>
+          </w:p>
+        </w:tc>
+        <w:tc>
+          <w:tcPr>
+            <w:tcW w:w="1279" w:type="dxa"/>
+            <w:tcBorders>
+              <w:left w:val="nil"/>
+              <w:bottom w:val="nil"/>
+            </w:tcBorders>
+            <w:noWrap/>
+            <w:hideMark/>
+          </w:tcPr>
+          <w:p>
+            <w:pPr>
+              <w:jc w:val="center"/>
+              <w:cnfStyle w:val="000000100000" w:firstRow="0" w:lastRow="0" w:firstColumn="0" w:lastColumn="0" w:oddVBand="0" w:evenVBand="0" w:oddHBand="1" w:evenHBand="0" w:firstRowFirstColumn="0" w:firstRowLastColumn="0" w:lastRowFirstColumn="0" w:lastRowLastColumn="0"/>
               <w:rPr>
                 <w:rFonts w:ascii="Times New Roman" w:eastAsia="Times New Roman" w:hAnsi="Times New Roman" w:cs="Times New Roman"/>
                 <w:color w:val="000000" w:themeColor="text1"/>
@@ -12435,7 +12458,16 @@
                 <w:szCs w:val="20"/>
                 <w:lang w:eastAsia="es-PE"/>
               </w:rPr>
-              <w:t xml:space="preserve">4.1</w:t>
+            </w:pPr>
+            <w:r>
+              <w:rPr>
+                <w:rFonts w:ascii="Times New Roman" w:eastAsia="Times New Roman" w:hAnsi="Times New Roman" w:cs="Times New Roman"/>
+                <w:color w:val="000000" w:themeColor="text1"/>
+                <w:sz w:val="20"/>
+                <w:szCs w:val="20"/>
+                <w:lang w:eastAsia="es-PE"/>
+              </w:rPr>
+              <w:t xml:space="preserve">4.8</w:t>
             </w:r>
           </w:p>
         </w:tc>
@@ -12477,7 +12509,7 @@
                 <w:szCs w:val="20"/>
                 <w:lang w:eastAsia="es-PE"/>
               </w:rPr>
-              <w:t xml:space="preserve">Enfermería</w:t>
+              <w:t xml:space="preserve">Ing. Industrial</w:t>
             </w:r>
           </w:p>
         </w:tc>
@@ -12514,7 +12546,7 @@
                 <w:szCs w:val="20"/>
                 <w:lang w:eastAsia="es-PE"/>
               </w:rPr>
-              <w:t xml:space="preserve">20</w:t>
+              <w:t xml:space="preserve">23</w:t>
             </w:r>
           </w:p>
         </w:tc>
@@ -12550,7 +12582,7 @@
                 <w:szCs w:val="20"/>
                 <w:lang w:eastAsia="es-PE"/>
               </w:rPr>
-              <w:t xml:space="preserve">3.4</w:t>
+              <w:t xml:space="preserve">3.9</w:t>
             </w:r>
           </w:p>
         </w:tc>
@@ -12566,7 +12598,6 @@
             <w:cnfStyle w:val="001000000000" w:firstRow="0" w:lastRow="0" w:firstColumn="1" w:lastColumn="0" w:oddVBand="0" w:evenVBand="0" w:oddHBand="0" w:evenHBand="0" w:firstRowFirstColumn="0" w:firstRowLastColumn="0" w:lastRowFirstColumn="0" w:lastRowLastColumn="0"/>
             <w:tcW w:w="6804" w:type="dxa"/>
             <w:tcBorders>
-              <w:top w:val="nil"/>
               <w:bottom w:val="nil"/>
               <w:right w:val="nil"/>
             </w:tcBorders>
@@ -12592,82 +12623,87 @@
                 <w:szCs w:val="20"/>
                 <w:lang w:eastAsia="es-PE"/>
               </w:rPr>
-              <w:t xml:space="preserve">Estomatología</w:t>
-            </w:r>
-          </w:p>
-        </w:tc>
-        <w:tc>
-          <w:tcPr>
-            <w:tcW w:w="284" w:type="dxa"/>
-            <w:tcBorders>
-              <w:top w:val="nil"/>
-              <w:left w:val="nil"/>
-              <w:bottom w:val="nil"/>
-              <w:right w:val="nil"/>
-            </w:tcBorders>
-            <w:noWrap/>
-            <w:hideMark/>
-          </w:tcPr>
-          <w:p>
-            <w:pPr>
-              <w:jc w:val="center"/>
-              <w:cnfStyle w:val="000000100000" w:firstRow="0" w:lastRow="0" w:firstColumn="0" w:lastColumn="0" w:oddVBand="0" w:evenVBand="0" w:oddHBand="1" w:evenHBand="0" w:firstRowFirstColumn="0" w:firstRowLastColumn="0" w:lastRowFirstColumn="0" w:lastRowLastColumn="0"/>
-              <w:rPr>
-                <w:rFonts w:ascii="Times New Roman" w:eastAsia="Times New Roman" w:hAnsi="Times New Roman" w:cs="Times New Roman"/>
-                <w:bCs/>
+              <w:t xml:space="preserve">Enfermería</w:t>
+            </w:r>
+            <w:r>
+              <w:rPr>
+                <w:rFonts w:ascii="Times New Roman" w:eastAsia="Times New Roman" w:hAnsi="Times New Roman" w:cs="Times New Roman"/>
+                <w:b w:val="0"/>
                 <w:color w:val="000000" w:themeColor="text1"/>
                 <w:sz w:val="20"/>
                 <w:szCs w:val="20"/>
                 <w:lang w:eastAsia="es-PE"/>
               </w:rPr>
-            </w:pPr>
-            <w:r>
-              <w:rPr>
-                <w:rFonts w:ascii="Times New Roman" w:eastAsia="Times New Roman" w:hAnsi="Times New Roman" w:cs="Times New Roman"/>
-                <w:bCs/>
+              <w:t xml:space="preserve"/>
+            </w:r>
+          </w:p>
+        </w:tc>
+        <w:tc>
+          <w:tcPr>
+            <w:tcW w:w="284" w:type="dxa"/>
+            <w:tcBorders>
+              <w:left w:val="nil"/>
+              <w:bottom w:val="nil"/>
+              <w:right w:val="nil"/>
+            </w:tcBorders>
+            <w:noWrap/>
+            <w:hideMark/>
+          </w:tcPr>
+          <w:p>
+            <w:pPr>
+              <w:jc w:val="center"/>
+              <w:cnfStyle w:val="000000100000" w:firstRow="0" w:lastRow="0" w:firstColumn="0" w:lastColumn="0" w:oddVBand="0" w:evenVBand="0" w:oddHBand="1" w:evenHBand="0" w:firstRowFirstColumn="0" w:firstRowLastColumn="0" w:lastRowFirstColumn="0" w:lastRowLastColumn="0"/>
+              <w:rPr>
+                <w:rFonts w:ascii="Times New Roman" w:eastAsia="Times New Roman" w:hAnsi="Times New Roman" w:cs="Times New Roman"/>
                 <w:color w:val="000000" w:themeColor="text1"/>
                 <w:sz w:val="20"/>
                 <w:szCs w:val="20"/>
                 <w:lang w:eastAsia="es-PE"/>
               </w:rPr>
-              <w:t xml:space="preserve">18</w:t>
-            </w:r>
-          </w:p>
-        </w:tc>
-        <w:tc>
-          <w:tcPr>
-            <w:tcW w:w="1279" w:type="dxa"/>
-            <w:tcBorders>
-              <w:top w:val="nil"/>
-              <w:left w:val="nil"/>
-              <w:bottom w:val="nil"/>
-            </w:tcBorders>
-            <w:noWrap/>
-            <w:hideMark/>
-          </w:tcPr>
-          <w:p>
-            <w:pPr>
-              <w:jc w:val="center"/>
-              <w:cnfStyle w:val="000000100000" w:firstRow="0" w:lastRow="0" w:firstColumn="0" w:lastColumn="0" w:oddVBand="0" w:evenVBand="0" w:oddHBand="1" w:evenHBand="0" w:firstRowFirstColumn="0" w:firstRowLastColumn="0" w:lastRowFirstColumn="0" w:lastRowLastColumn="0"/>
-              <w:rPr>
-                <w:rFonts w:ascii="Times New Roman" w:eastAsia="Times New Roman" w:hAnsi="Times New Roman" w:cs="Times New Roman"/>
-                <w:bCs/>
+            </w:pPr>
+            <w:r>
+              <w:rPr>
+                <w:rFonts w:ascii="Times New Roman" w:eastAsia="Times New Roman" w:hAnsi="Times New Roman" w:cs="Times New Roman"/>
                 <w:color w:val="000000" w:themeColor="text1"/>
                 <w:sz w:val="20"/>
                 <w:szCs w:val="20"/>
                 <w:lang w:eastAsia="es-PE"/>
               </w:rPr>
-            </w:pPr>
-            <w:r>
-              <w:rPr>
-                <w:rFonts w:ascii="Times New Roman" w:eastAsia="Times New Roman" w:hAnsi="Times New Roman" w:cs="Times New Roman"/>
-                <w:bCs/>
+              <w:t xml:space="preserve">19</w:t>
+            </w:r>
+          </w:p>
+        </w:tc>
+        <w:tc>
+          <w:tcPr>
+            <w:tcW w:w="1279" w:type="dxa"/>
+            <w:tcBorders>
+              <w:left w:val="nil"/>
+              <w:bottom w:val="nil"/>
+            </w:tcBorders>
+            <w:noWrap/>
+            <w:hideMark/>
+          </w:tcPr>
+          <w:p>
+            <w:pPr>
+              <w:jc w:val="center"/>
+              <w:cnfStyle w:val="000000100000" w:firstRow="0" w:lastRow="0" w:firstColumn="0" w:lastColumn="0" w:oddVBand="0" w:evenVBand="0" w:oddHBand="1" w:evenHBand="0" w:firstRowFirstColumn="0" w:firstRowLastColumn="0" w:lastRowFirstColumn="0" w:lastRowLastColumn="0"/>
+              <w:rPr>
+                <w:rFonts w:ascii="Times New Roman" w:eastAsia="Times New Roman" w:hAnsi="Times New Roman" w:cs="Times New Roman"/>
                 <w:color w:val="000000" w:themeColor="text1"/>
                 <w:sz w:val="20"/>
                 <w:szCs w:val="20"/>
                 <w:lang w:eastAsia="es-PE"/>
               </w:rPr>
-              <w:t xml:space="preserve">3.1</w:t>
+            </w:pPr>
+            <w:r>
+              <w:rPr>
+                <w:rFonts w:ascii="Times New Roman" w:eastAsia="Times New Roman" w:hAnsi="Times New Roman" w:cs="Times New Roman"/>
+                <w:color w:val="000000" w:themeColor="text1"/>
+                <w:sz w:val="20"/>
+                <w:szCs w:val="20"/>
+                <w:lang w:eastAsia="es-PE"/>
+              </w:rPr>
+              <w:t xml:space="preserve">3.2</w:t>
             </w:r>
           </w:p>
         </w:tc>
@@ -12709,7 +12745,7 @@
                 <w:szCs w:val="20"/>
                 <w:lang w:eastAsia="es-PE"/>
               </w:rPr>
-              <w:t xml:space="preserve">Contabilidad</w:t>
+              <w:t xml:space="preserve">Estomatología</w:t>
             </w:r>
           </w:p>
         </w:tc>
@@ -12732,7 +12768,6 @@
               <w:cnfStyle w:val="000000000000" w:firstRow="0" w:lastRow="0" w:firstColumn="0" w:lastColumn="0" w:oddVBand="0" w:evenVBand="0" w:oddHBand="0" w:evenHBand="0" w:firstRowFirstColumn="0" w:firstRowLastColumn="0" w:lastRowFirstColumn="0" w:lastRowLastColumn="0"/>
               <w:rPr>
                 <w:rFonts w:ascii="Times New Roman" w:eastAsia="Times New Roman" w:hAnsi="Times New Roman" w:cs="Times New Roman"/>
-                <w:bCs/>
                 <w:color w:val="000000" w:themeColor="text1"/>
                 <w:sz w:val="20"/>
                 <w:szCs w:val="20"/>
@@ -12742,13 +12777,12 @@
             <w:r>
               <w:rPr>
                 <w:rFonts w:ascii="Times New Roman" w:eastAsia="Times New Roman" w:hAnsi="Times New Roman" w:cs="Times New Roman"/>
-                <w:bCs/>
                 <w:color w:val="000000" w:themeColor="text1"/>
                 <w:sz w:val="20"/>
                 <w:szCs w:val="20"/>
                 <w:lang w:eastAsia="es-PE"/>
               </w:rPr>
-              <w:t xml:space="preserve">18</w:t>
+              <w:t xml:space="preserve">17</w:t>
             </w:r>
           </w:p>
         </w:tc>
@@ -12770,7 +12804,6 @@
               <w:cnfStyle w:val="000000000000" w:firstRow="0" w:lastRow="0" w:firstColumn="0" w:lastColumn="0" w:oddVBand="0" w:evenVBand="0" w:oddHBand="0" w:evenHBand="0" w:firstRowFirstColumn="0" w:firstRowLastColumn="0" w:lastRowFirstColumn="0" w:lastRowLastColumn="0"/>
               <w:rPr>
                 <w:rFonts w:ascii="Times New Roman" w:eastAsia="Times New Roman" w:hAnsi="Times New Roman" w:cs="Times New Roman"/>
-                <w:bCs/>
                 <w:color w:val="000000" w:themeColor="text1"/>
                 <w:sz w:val="20"/>
                 <w:szCs w:val="20"/>
@@ -12780,13 +12813,12 @@
             <w:r>
               <w:rPr>
                 <w:rFonts w:ascii="Times New Roman" w:eastAsia="Times New Roman" w:hAnsi="Times New Roman" w:cs="Times New Roman"/>
-                <w:bCs/>
                 <w:color w:val="000000" w:themeColor="text1"/>
                 <w:sz w:val="20"/>
                 <w:szCs w:val="20"/>
                 <w:lang w:eastAsia="es-PE"/>
               </w:rPr>
-              <w:t xml:space="preserve">3.1</w:t>
+              <w:t xml:space="preserve">2.9</w:t>
             </w:r>
           </w:p>
         </w:tc>
@@ -12802,7 +12834,6 @@
             <w:cnfStyle w:val="001000000000" w:firstRow="0" w:lastRow="0" w:firstColumn="1" w:lastColumn="0" w:oddVBand="0" w:evenVBand="0" w:oddHBand="0" w:evenHBand="0" w:firstRowFirstColumn="0" w:firstRowLastColumn="0" w:lastRowFirstColumn="0" w:lastRowLastColumn="0"/>
             <w:tcW w:w="6804" w:type="dxa"/>
             <w:tcBorders>
-              <w:top w:val="nil"/>
               <w:bottom w:val="nil"/>
               <w:right w:val="nil"/>
             </w:tcBorders>
@@ -12828,7 +12859,7 @@
                 <w:szCs w:val="20"/>
                 <w:lang w:eastAsia="es-PE"/>
               </w:rPr>
-              <w:t xml:space="preserve">Ciencias de la Comunicación</w:t>
+              <w:t xml:space="preserve">Contabilidad</w:t>
             </w:r>
             <w:r>
               <w:rPr>
@@ -12839,7 +12870,7 @@
                 <w:szCs w:val="20"/>
                 <w:lang w:eastAsia="es-PE"/>
               </w:rPr>
-              <w:t/>
+              <w:t xml:space="preserve"/>
             </w:r>
           </w:p>
         </w:tc>
@@ -12847,7 +12878,6 @@
           <w:tcPr>
             <w:tcW w:w="284" w:type="dxa"/>
             <w:tcBorders>
-              <w:top w:val="nil"/>
               <w:left w:val="nil"/>
               <w:bottom w:val="nil"/>
               <w:right w:val="nil"/>
@@ -12861,7 +12891,6 @@
               <w:cnfStyle w:val="000000100000" w:firstRow="0" w:lastRow="0" w:firstColumn="0" w:lastColumn="0" w:oddVBand="0" w:evenVBand="0" w:oddHBand="1" w:evenHBand="0" w:firstRowFirstColumn="0" w:firstRowLastColumn="0" w:lastRowFirstColumn="0" w:lastRowLastColumn="0"/>
               <w:rPr>
                 <w:rFonts w:ascii="Times New Roman" w:eastAsia="Times New Roman" w:hAnsi="Times New Roman" w:cs="Times New Roman"/>
-                <w:bCs/>
                 <w:color w:val="000000" w:themeColor="text1"/>
                 <w:sz w:val="20"/>
                 <w:szCs w:val="20"/>
@@ -12871,7 +12900,6 @@
             <w:r>
               <w:rPr>
                 <w:rFonts w:ascii="Times New Roman" w:eastAsia="Times New Roman" w:hAnsi="Times New Roman" w:cs="Times New Roman"/>
-                <w:bCs/>
                 <w:color w:val="000000" w:themeColor="text1"/>
                 <w:sz w:val="20"/>
                 <w:szCs w:val="20"/>
@@ -12885,7 +12913,6 @@
           <w:tcPr>
             <w:tcW w:w="1279" w:type="dxa"/>
             <w:tcBorders>
-              <w:top w:val="nil"/>
               <w:left w:val="nil"/>
               <w:bottom w:val="nil"/>
             </w:tcBorders>
@@ -12898,7 +12925,6 @@
               <w:cnfStyle w:val="000000100000" w:firstRow="0" w:lastRow="0" w:firstColumn="0" w:lastColumn="0" w:oddVBand="0" w:evenVBand="0" w:oddHBand="1" w:evenHBand="0" w:firstRowFirstColumn="0" w:firstRowLastColumn="0" w:lastRowFirstColumn="0" w:lastRowLastColumn="0"/>
               <w:rPr>
                 <w:rFonts w:ascii="Times New Roman" w:eastAsia="Times New Roman" w:hAnsi="Times New Roman" w:cs="Times New Roman"/>
-                <w:bCs/>
                 <w:color w:val="000000" w:themeColor="text1"/>
                 <w:sz w:val="20"/>
                 <w:szCs w:val="20"/>
@@ -12908,7 +12934,6 @@
             <w:r>
               <w:rPr>
                 <w:rFonts w:ascii="Times New Roman" w:eastAsia="Times New Roman" w:hAnsi="Times New Roman" w:cs="Times New Roman"/>
-                <w:bCs/>
                 <w:color w:val="000000" w:themeColor="text1"/>
                 <w:sz w:val="20"/>
                 <w:szCs w:val="20"/>
@@ -12956,130 +12981,80 @@
                 <w:szCs w:val="20"/>
                 <w:lang w:eastAsia="es-PE"/>
               </w:rPr>
-              <w:t xml:space="preserve">Tecnología Médica con especialidad en terapia física y rehabilitación</w:t>
-            </w:r>
-            <w:r>
-              <w:rPr>
-                <w:rFonts w:ascii="Times New Roman" w:eastAsia="Times New Roman" w:hAnsi="Times New Roman" w:cs="Times New Roman"/>
-                <w:b w:val="0"/>
+              <w:t xml:space="preserve">Ciencias de la Comunicación</w:t>
+            </w:r>
+          </w:p>
+        </w:tc>
+        <w:tc>
+          <w:tcPr>
+            <w:tcW w:w="284" w:type="dxa"/>
+            <w:tcBorders>
+              <w:top w:val="nil"/>
+              <w:left w:val="nil"/>
+              <w:bottom w:val="nil"/>
+              <w:right w:val="nil"/>
+            </w:tcBorders>
+            <w:shd w:val="clear" w:color="auto" w:fill="D9D9D9" w:themeFill="background1" w:themeFillShade="D9"/>
+            <w:noWrap/>
+            <w:hideMark/>
+          </w:tcPr>
+          <w:p>
+            <w:pPr>
+              <w:jc w:val="center"/>
+              <w:cnfStyle w:val="000000000000" w:firstRow="0" w:lastRow="0" w:firstColumn="0" w:lastColumn="0" w:oddVBand="0" w:evenVBand="0" w:oddHBand="0" w:evenHBand="0" w:firstRowFirstColumn="0" w:firstRowLastColumn="0" w:lastRowFirstColumn="0" w:lastRowLastColumn="0"/>
+              <w:rPr>
+                <w:rFonts w:ascii="Times New Roman" w:eastAsia="Times New Roman" w:hAnsi="Times New Roman" w:cs="Times New Roman"/>
                 <w:color w:val="000000" w:themeColor="text1"/>
                 <w:sz w:val="20"/>
                 <w:szCs w:val="20"/>
                 <w:lang w:eastAsia="es-PE"/>
               </w:rPr>
-              <w:t xml:space="preserve"/>
-            </w:r>
-            <w:r>
-              <w:rPr>
-                <w:rFonts w:ascii="Times New Roman" w:eastAsia="Times New Roman" w:hAnsi="Times New Roman" w:cs="Times New Roman"/>
-                <w:b w:val="0"/>
+            </w:pPr>
+            <w:r>
+              <w:rPr>
+                <w:rFonts w:ascii="Times New Roman" w:eastAsia="Times New Roman" w:hAnsi="Times New Roman" w:cs="Times New Roman"/>
                 <w:color w:val="000000" w:themeColor="text1"/>
                 <w:sz w:val="20"/>
                 <w:szCs w:val="20"/>
                 <w:lang w:eastAsia="es-PE"/>
               </w:rPr>
-              <w:t/>
-            </w:r>
-            <w:r>
-              <w:rPr>
-                <w:rFonts w:ascii="Times New Roman" w:eastAsia="Times New Roman" w:hAnsi="Times New Roman" w:cs="Times New Roman"/>
-                <w:b w:val="0"/>
+              <w:t xml:space="preserve">16</w:t>
+            </w:r>
+          </w:p>
+        </w:tc>
+        <w:tc>
+          <w:tcPr>
+            <w:tcW w:w="1279" w:type="dxa"/>
+            <w:tcBorders>
+              <w:top w:val="nil"/>
+              <w:left w:val="nil"/>
+              <w:bottom w:val="nil"/>
+            </w:tcBorders>
+            <w:shd w:val="clear" w:color="auto" w:fill="D9D9D9" w:themeFill="background1" w:themeFillShade="D9"/>
+            <w:noWrap/>
+            <w:hideMark/>
+          </w:tcPr>
+          <w:p>
+            <w:pPr>
+              <w:jc w:val="center"/>
+              <w:cnfStyle w:val="000000000000" w:firstRow="0" w:lastRow="0" w:firstColumn="0" w:lastColumn="0" w:oddVBand="0" w:evenVBand="0" w:oddHBand="0" w:evenHBand="0" w:firstRowFirstColumn="0" w:firstRowLastColumn="0" w:lastRowFirstColumn="0" w:lastRowLastColumn="0"/>
+              <w:rPr>
+                <w:rFonts w:ascii="Times New Roman" w:eastAsia="Times New Roman" w:hAnsi="Times New Roman" w:cs="Times New Roman"/>
                 <w:color w:val="000000" w:themeColor="text1"/>
                 <w:sz w:val="20"/>
                 <w:szCs w:val="20"/>
                 <w:lang w:eastAsia="es-PE"/>
               </w:rPr>
-              <w:t xml:space="preserve"/>
-            </w:r>
-            <w:r>
-              <w:rPr>
-                <w:rFonts w:ascii="Times New Roman" w:eastAsia="Times New Roman" w:hAnsi="Times New Roman" w:cs="Times New Roman"/>
-                <w:b w:val="0"/>
+            </w:pPr>
+            <w:r>
+              <w:rPr>
+                <w:rFonts w:ascii="Times New Roman" w:eastAsia="Times New Roman" w:hAnsi="Times New Roman" w:cs="Times New Roman"/>
                 <w:color w:val="000000" w:themeColor="text1"/>
                 <w:sz w:val="20"/>
                 <w:szCs w:val="20"/>
                 <w:lang w:eastAsia="es-PE"/>
               </w:rPr>
-              <w:t/>
-            </w:r>
-          </w:p>
-        </w:tc>
-        <w:tc>
-          <w:tcPr>
-            <w:tcW w:w="284" w:type="dxa"/>
-            <w:tcBorders>
-              <w:top w:val="nil"/>
-              <w:left w:val="nil"/>
-              <w:bottom w:val="nil"/>
-              <w:right w:val="nil"/>
-            </w:tcBorders>
-            <w:shd w:val="clear" w:color="auto" w:fill="D9D9D9" w:themeFill="background1" w:themeFillShade="D9"/>
-            <w:noWrap/>
-            <w:vAlign w:val="center"/>
-            <w:hideMark/>
-          </w:tcPr>
-          <w:p>
-            <w:pPr>
-              <w:jc w:val="center"/>
-              <w:cnfStyle w:val="000000000000" w:firstRow="0" w:lastRow="0" w:firstColumn="0" w:lastColumn="0" w:oddVBand="0" w:evenVBand="0" w:oddHBand="0" w:evenHBand="0" w:firstRowFirstColumn="0" w:firstRowLastColumn="0" w:lastRowFirstColumn="0" w:lastRowLastColumn="0"/>
-              <w:rPr>
-                <w:rFonts w:ascii="Times New Roman" w:eastAsia="Times New Roman" w:hAnsi="Times New Roman" w:cs="Times New Roman"/>
-                <w:bCs/>
-                <w:color w:val="000000" w:themeColor="text1"/>
-                <w:sz w:val="20"/>
-                <w:szCs w:val="20"/>
-                <w:lang w:eastAsia="es-PE"/>
-              </w:rPr>
-            </w:pPr>
-            <w:r>
-              <w:rPr>
-                <w:rFonts w:ascii="Times New Roman" w:eastAsia="Times New Roman" w:hAnsi="Times New Roman" w:cs="Times New Roman"/>
-                <w:bCs/>
-                <w:color w:val="000000" w:themeColor="text1"/>
-                <w:sz w:val="20"/>
-                <w:szCs w:val="20"/>
-                <w:lang w:eastAsia="es-PE"/>
-              </w:rPr>
-              <w:t xml:space="preserve">15</w:t>
-            </w:r>
-          </w:p>
-        </w:tc>
-        <w:tc>
-          <w:tcPr>
-            <w:tcW w:w="1279" w:type="dxa"/>
-            <w:tcBorders>
-              <w:top w:val="nil"/>
-              <w:left w:val="nil"/>
-              <w:bottom w:val="nil"/>
-            </w:tcBorders>
-            <w:shd w:val="clear" w:color="auto" w:fill="D9D9D9" w:themeFill="background1" w:themeFillShade="D9"/>
-            <w:noWrap/>
-            <w:vAlign w:val="center"/>
-            <w:hideMark/>
-          </w:tcPr>
-          <w:p>
-            <w:pPr>
-              <w:jc w:val="center"/>
-              <w:cnfStyle w:val="000000000000" w:firstRow="0" w:lastRow="0" w:firstColumn="0" w:lastColumn="0" w:oddVBand="0" w:evenVBand="0" w:oddHBand="0" w:evenHBand="0" w:firstRowFirstColumn="0" w:firstRowLastColumn="0" w:lastRowFirstColumn="0" w:lastRowLastColumn="0"/>
-              <w:rPr>
-                <w:rFonts w:ascii="Times New Roman" w:eastAsia="Times New Roman" w:hAnsi="Times New Roman" w:cs="Times New Roman"/>
-                <w:bCs/>
-                <w:color w:val="000000" w:themeColor="text1"/>
-                <w:sz w:val="20"/>
-                <w:szCs w:val="20"/>
-                <w:lang w:eastAsia="es-PE"/>
-              </w:rPr>
-            </w:pPr>
-            <w:r>
-              <w:rPr>
-                <w:rFonts w:ascii="Times New Roman" w:eastAsia="Times New Roman" w:hAnsi="Times New Roman" w:cs="Times New Roman"/>
-                <w:bCs/>
-                <w:color w:val="000000" w:themeColor="text1"/>
-                <w:sz w:val="20"/>
-                <w:szCs w:val="20"/>
-                <w:lang w:eastAsia="es-PE"/>
-              </w:rPr>
-              <w:t xml:space="preserve">2.6</w:t>
+              <w:t xml:space="preserve">2.7</w:t>
             </w:r>
           </w:p>
         </w:tc>
@@ -13095,7 +13070,6 @@
             <w:cnfStyle w:val="001000000000" w:firstRow="0" w:lastRow="0" w:firstColumn="1" w:lastColumn="0" w:oddVBand="0" w:evenVBand="0" w:oddHBand="0" w:evenHBand="0" w:firstRowFirstColumn="0" w:firstRowLastColumn="0" w:lastRowFirstColumn="0" w:lastRowLastColumn="0"/>
             <w:tcW w:w="6804" w:type="dxa"/>
             <w:tcBorders>
-              <w:top w:val="nil"/>
               <w:bottom w:val="nil"/>
               <w:right w:val="nil"/>
             </w:tcBorders>
@@ -13121,7 +13095,7 @@
                 <w:szCs w:val="20"/>
                 <w:lang w:eastAsia="es-PE"/>
               </w:rPr>
-              <w:t xml:space="preserve">Ing. Mecánica Eléctrica</w:t>
+              <w:t xml:space="preserve">Tecnología Médica con especialidad en terapia física y rehabilitación</w:t>
             </w:r>
             <w:r>
               <w:rPr>
@@ -13132,40 +13106,51 @@
                 <w:szCs w:val="20"/>
                 <w:lang w:eastAsia="es-PE"/>
               </w:rPr>
-              <w:t/>
-            </w:r>
-            <w:r>
-              <w:rPr>
-                <w:rFonts w:ascii="Times New Roman" w:eastAsia="Times New Roman" w:hAnsi="Times New Roman" w:cs="Times New Roman"/>
-                <w:b w:val="0"/>
+              <w:t xml:space="preserve"/>
+            </w:r>
+          </w:p>
+        </w:tc>
+        <w:tc>
+          <w:tcPr>
+            <w:tcW w:w="284" w:type="dxa"/>
+            <w:tcBorders>
+              <w:left w:val="nil"/>
+              <w:bottom w:val="nil"/>
+              <w:right w:val="nil"/>
+            </w:tcBorders>
+            <w:noWrap/>
+            <w:hideMark/>
+          </w:tcPr>
+          <w:p>
+            <w:pPr>
+              <w:jc w:val="center"/>
+              <w:cnfStyle w:val="000000100000" w:firstRow="0" w:lastRow="0" w:firstColumn="0" w:lastColumn="0" w:oddVBand="0" w:evenVBand="0" w:oddHBand="1" w:evenHBand="0" w:firstRowFirstColumn="0" w:firstRowLastColumn="0" w:lastRowFirstColumn="0" w:lastRowLastColumn="0"/>
+              <w:rPr>
+                <w:rFonts w:ascii="Times New Roman" w:eastAsia="Times New Roman" w:hAnsi="Times New Roman" w:cs="Times New Roman"/>
                 <w:color w:val="000000" w:themeColor="text1"/>
                 <w:sz w:val="20"/>
                 <w:szCs w:val="20"/>
                 <w:lang w:eastAsia="es-PE"/>
               </w:rPr>
-              <w:t xml:space="preserve"/>
-            </w:r>
-            <w:r>
-              <w:rPr>
-                <w:rFonts w:ascii="Times New Roman" w:eastAsia="Times New Roman" w:hAnsi="Times New Roman" w:cs="Times New Roman"/>
-                <w:b w:val="0"/>
+            </w:pPr>
+            <w:r>
+              <w:rPr>
+                <w:rFonts w:ascii="Times New Roman" w:eastAsia="Times New Roman" w:hAnsi="Times New Roman" w:cs="Times New Roman"/>
                 <w:color w:val="000000" w:themeColor="text1"/>
                 <w:sz w:val="20"/>
                 <w:szCs w:val="20"/>
                 <w:lang w:eastAsia="es-PE"/>
               </w:rPr>
-              <w:t/>
-            </w:r>
-          </w:p>
-        </w:tc>
-        <w:tc>
-          <w:tcPr>
-            <w:tcW w:w="284" w:type="dxa"/>
-            <w:tcBorders>
-              <w:top w:val="nil"/>
+              <w:t xml:space="preserve">14</w:t>
+            </w:r>
+          </w:p>
+        </w:tc>
+        <w:tc>
+          <w:tcPr>
+            <w:tcW w:w="1279" w:type="dxa"/>
+            <w:tcBorders>
               <w:left w:val="nil"/>
               <w:bottom w:val="nil"/>
-              <w:right w:val="nil"/>
             </w:tcBorders>
             <w:noWrap/>
             <w:hideMark/>
@@ -13176,7 +13161,6 @@
               <w:cnfStyle w:val="000000100000" w:firstRow="0" w:lastRow="0" w:firstColumn="0" w:lastColumn="0" w:oddVBand="0" w:evenVBand="0" w:oddHBand="1" w:evenHBand="0" w:firstRowFirstColumn="0" w:firstRowLastColumn="0" w:lastRowFirstColumn="0" w:lastRowLastColumn="0"/>
               <w:rPr>
                 <w:rFonts w:ascii="Times New Roman" w:eastAsia="Times New Roman" w:hAnsi="Times New Roman" w:cs="Times New Roman"/>
-                <w:bCs/>
                 <w:color w:val="000000" w:themeColor="text1"/>
                 <w:sz w:val="20"/>
                 <w:szCs w:val="20"/>
@@ -13186,50 +13170,12 @@
             <w:r>
               <w:rPr>
                 <w:rFonts w:ascii="Times New Roman" w:eastAsia="Times New Roman" w:hAnsi="Times New Roman" w:cs="Times New Roman"/>
-                <w:bCs/>
                 <w:color w:val="000000" w:themeColor="text1"/>
                 <w:sz w:val="20"/>
                 <w:szCs w:val="20"/>
                 <w:lang w:eastAsia="es-PE"/>
               </w:rPr>
-              <w:t xml:space="preserve">15</w:t>
-            </w:r>
-          </w:p>
-        </w:tc>
-        <w:tc>
-          <w:tcPr>
-            <w:tcW w:w="1279" w:type="dxa"/>
-            <w:tcBorders>
-              <w:top w:val="nil"/>
-              <w:left w:val="nil"/>
-              <w:bottom w:val="nil"/>
-            </w:tcBorders>
-            <w:noWrap/>
-            <w:hideMark/>
-          </w:tcPr>
-          <w:p>
-            <w:pPr>
-              <w:jc w:val="center"/>
-              <w:cnfStyle w:val="000000100000" w:firstRow="0" w:lastRow="0" w:firstColumn="0" w:lastColumn="0" w:oddVBand="0" w:evenVBand="0" w:oddHBand="1" w:evenHBand="0" w:firstRowFirstColumn="0" w:firstRowLastColumn="0" w:lastRowFirstColumn="0" w:lastRowLastColumn="0"/>
-              <w:rPr>
-                <w:rFonts w:ascii="Times New Roman" w:eastAsia="Times New Roman" w:hAnsi="Times New Roman" w:cs="Times New Roman"/>
-                <w:bCs/>
-                <w:color w:val="000000" w:themeColor="text1"/>
-                <w:sz w:val="20"/>
-                <w:szCs w:val="20"/>
-                <w:lang w:eastAsia="es-PE"/>
-              </w:rPr>
-            </w:pPr>
-            <w:r>
-              <w:rPr>
-                <w:rFonts w:ascii="Times New Roman" w:eastAsia="Times New Roman" w:hAnsi="Times New Roman" w:cs="Times New Roman"/>
-                <w:bCs/>
-                <w:color w:val="000000" w:themeColor="text1"/>
-                <w:sz w:val="20"/>
-                <w:szCs w:val="20"/>
-                <w:lang w:eastAsia="es-PE"/>
-              </w:rPr>
-              <w:t xml:space="preserve">2.6</w:t>
+              <w:t xml:space="preserve">2.4</w:t>
             </w:r>
           </w:p>
         </w:tc>
@@ -13255,67 +13201,23 @@
             <w:pPr>
               <w:rPr>
                 <w:rFonts w:ascii="Times New Roman" w:eastAsia="Times New Roman" w:hAnsi="Times New Roman" w:cs="Times New Roman"/>
-                <w:bCs w:val="0"/>
-                <w:color w:val="000000" w:themeColor="text1"/>
-                <w:sz w:val="24"/>
-                <w:szCs w:val="24"/>
-                <w:lang w:eastAsia="es-PE"/>
-              </w:rPr>
-            </w:pPr>
-            <w:r>
-              <w:rPr>
-                <w:rFonts w:ascii="Times New Roman" w:eastAsia="Times New Roman" w:hAnsi="Times New Roman" w:cs="Times New Roman"/>
-                <w:bCs w:val="0"/>
-                <w:color w:val="000000" w:themeColor="text1"/>
-                <w:sz w:val="24"/>
-                <w:szCs w:val="24"/>
-                <w:lang w:eastAsia="es-PE"/>
-              </w:rPr>
-              <w:t xml:space="preserve">Farmacia y Bioquímica</w:t>
-            </w:r>
-            <w:r>
-              <w:rPr>
-                <w:rFonts w:ascii="Times New Roman" w:eastAsia="Times New Roman" w:hAnsi="Times New Roman" w:cs="Times New Roman"/>
-                <w:bCs w:val="0"/>
-                <w:color w:val="000000" w:themeColor="text1"/>
-                <w:sz w:val="24"/>
-                <w:szCs w:val="24"/>
-                <w:lang w:eastAsia="es-PE"/>
-              </w:rPr>
-              <w:t xml:space="preserve"/>
-            </w:r>
-            <w:r>
-              <w:rPr>
-                <w:rFonts w:ascii="Times New Roman" w:eastAsia="Times New Roman" w:hAnsi="Times New Roman" w:cs="Times New Roman"/>
-                <w:bCs w:val="0"/>
-                <w:color w:val="000000" w:themeColor="text1"/>
-                <w:sz w:val="24"/>
-                <w:szCs w:val="24"/>
-                <w:lang w:eastAsia="es-PE"/>
-              </w:rPr>
-              <w:t xml:space="preserve"/>
-            </w:r>
-            <w:r>
-              <w:rPr>
-                <w:rFonts w:ascii="Times New Roman" w:eastAsia="Times New Roman" w:hAnsi="Times New Roman" w:cs="Times New Roman"/>
-                <w:bCs w:val="0"/>
-                <w:color w:val="000000" w:themeColor="text1"/>
-                <w:sz w:val="24"/>
-                <w:szCs w:val="24"/>
-                <w:lang w:eastAsia="es-PE"/>
-              </w:rPr>
-              <w:t xml:space="preserve"/>
-            </w:r>
-            <w:r>
-              <w:rPr>
-                <w:rFonts w:ascii="Times New Roman" w:eastAsia="Times New Roman" w:hAnsi="Times New Roman" w:cs="Times New Roman"/>
-                <w:bCs w:val="0"/>
-                <w:color w:val="000000" w:themeColor="text1"/>
-                <w:sz w:val="24"/>
-                <w:szCs w:val="24"/>
-                <w:lang w:eastAsia="es-PE"/>
-              </w:rPr>
-              <w:t xml:space="preserve"/>
+                <w:b w:val="0"/>
+                <w:color w:val="000000" w:themeColor="text1"/>
+                <w:sz w:val="20"/>
+                <w:szCs w:val="20"/>
+                <w:lang w:eastAsia="es-PE"/>
+              </w:rPr>
+            </w:pPr>
+            <w:r>
+              <w:rPr>
+                <w:rFonts w:ascii="Times New Roman" w:eastAsia="Times New Roman" w:hAnsi="Times New Roman" w:cs="Times New Roman"/>
+                <w:b w:val="0"/>
+                <w:color w:val="000000" w:themeColor="text1"/>
+                <w:sz w:val="20"/>
+                <w:szCs w:val="20"/>
+                <w:lang w:eastAsia="es-PE"/>
+              </w:rPr>
+              <w:t xml:space="preserve">Ing. Mecánica Eléctrica</w:t>
             </w:r>
           </w:p>
         </w:tc>
@@ -13330,7 +13232,6 @@
             </w:tcBorders>
             <w:shd w:val="clear" w:color="auto" w:fill="D9D9D9" w:themeFill="background1" w:themeFillShade="D9"/>
             <w:noWrap/>
-            <w:vAlign w:val="center"/>
             <w:hideMark/>
           </w:tcPr>
           <w:p>
@@ -13339,20 +13240,18 @@
               <w:cnfStyle w:val="000000000000" w:firstRow="0" w:lastRow="0" w:firstColumn="0" w:lastColumn="0" w:oddVBand="0" w:evenVBand="0" w:oddHBand="0" w:evenHBand="0" w:firstRowFirstColumn="0" w:firstRowLastColumn="0" w:lastRowFirstColumn="0" w:lastRowLastColumn="0"/>
               <w:rPr>
                 <w:rFonts w:ascii="Times New Roman" w:eastAsia="Times New Roman" w:hAnsi="Times New Roman" w:cs="Times New Roman"/>
-                <w:b/>
-                <w:color w:val="000000" w:themeColor="text1"/>
-                <w:sz w:val="24"/>
-                <w:szCs w:val="24"/>
-                <w:lang w:eastAsia="es-PE"/>
-              </w:rPr>
-            </w:pPr>
-            <w:r>
-              <w:rPr>
-                <w:rFonts w:ascii="Times New Roman" w:eastAsia="Times New Roman" w:hAnsi="Times New Roman" w:cs="Times New Roman"/>
-                <w:b/>
-                <w:color w:val="000000" w:themeColor="text1"/>
-                <w:sz w:val="24"/>
-                <w:szCs w:val="24"/>
+                <w:color w:val="000000" w:themeColor="text1"/>
+                <w:sz w:val="20"/>
+                <w:szCs w:val="20"/>
+                <w:lang w:eastAsia="es-PE"/>
+              </w:rPr>
+            </w:pPr>
+            <w:r>
+              <w:rPr>
+                <w:rFonts w:ascii="Times New Roman" w:eastAsia="Times New Roman" w:hAnsi="Times New Roman" w:cs="Times New Roman"/>
+                <w:color w:val="000000" w:themeColor="text1"/>
+                <w:sz w:val="20"/>
+                <w:szCs w:val="20"/>
                 <w:lang w:eastAsia="es-PE"/>
               </w:rPr>
               <w:t xml:space="preserve">14</w:t>
@@ -13369,7 +13268,6 @@
             </w:tcBorders>
             <w:shd w:val="clear" w:color="auto" w:fill="D9D9D9" w:themeFill="background1" w:themeFillShade="D9"/>
             <w:noWrap/>
-            <w:vAlign w:val="center"/>
             <w:hideMark/>
           </w:tcPr>
           <w:p>
@@ -13378,20 +13276,18 @@
               <w:cnfStyle w:val="000000000000" w:firstRow="0" w:lastRow="0" w:firstColumn="0" w:lastColumn="0" w:oddVBand="0" w:evenVBand="0" w:oddHBand="0" w:evenHBand="0" w:firstRowFirstColumn="0" w:firstRowLastColumn="0" w:lastRowFirstColumn="0" w:lastRowLastColumn="0"/>
               <w:rPr>
                 <w:rFonts w:ascii="Times New Roman" w:eastAsia="Times New Roman" w:hAnsi="Times New Roman" w:cs="Times New Roman"/>
-                <w:b/>
-                <w:color w:val="000000" w:themeColor="text1"/>
-                <w:sz w:val="24"/>
-                <w:szCs w:val="24"/>
-                <w:lang w:eastAsia="es-PE"/>
-              </w:rPr>
-            </w:pPr>
-            <w:r>
-              <w:rPr>
-                <w:rFonts w:ascii="Times New Roman" w:eastAsia="Times New Roman" w:hAnsi="Times New Roman" w:cs="Times New Roman"/>
-                <w:b/>
-                <w:color w:val="000000" w:themeColor="text1"/>
-                <w:sz w:val="24"/>
-                <w:szCs w:val="24"/>
+                <w:color w:val="000000" w:themeColor="text1"/>
+                <w:sz w:val="20"/>
+                <w:szCs w:val="20"/>
+                <w:lang w:eastAsia="es-PE"/>
+              </w:rPr>
+            </w:pPr>
+            <w:r>
+              <w:rPr>
+                <w:rFonts w:ascii="Times New Roman" w:eastAsia="Times New Roman" w:hAnsi="Times New Roman" w:cs="Times New Roman"/>
+                <w:color w:val="000000" w:themeColor="text1"/>
+                <w:sz w:val="20"/>
+                <w:szCs w:val="20"/>
                 <w:lang w:eastAsia="es-PE"/>
               </w:rPr>
               <w:t xml:space="preserve">2.4</w:t>
@@ -13410,7 +13306,6 @@
             <w:cnfStyle w:val="001000000000" w:firstRow="0" w:lastRow="0" w:firstColumn="1" w:lastColumn="0" w:oddVBand="0" w:evenVBand="0" w:oddHBand="0" w:evenHBand="0" w:firstRowFirstColumn="0" w:firstRowLastColumn="0" w:lastRowFirstColumn="0" w:lastRowLastColumn="0"/>
             <w:tcW w:w="6804" w:type="dxa"/>
             <w:tcBorders>
-              <w:top w:val="nil"/>
               <w:bottom w:val="nil"/>
               <w:right w:val="nil"/>
             </w:tcBorders>
@@ -13436,7 +13331,7 @@
                 <w:szCs w:val="20"/>
                 <w:lang w:eastAsia="es-PE"/>
               </w:rPr>
-              <w:t xml:space="preserve">Tecnología Médica con especialidad en Radiología</w:t>
+              <w:t xml:space="preserve">Tecnología Médica con especialidad en laboratorio clínico</w:t>
             </w:r>
             <w:r>
               <w:rPr>
@@ -13449,115 +13344,74 @@
               </w:rPr>
               <w:t xml:space="preserve"/>
             </w:r>
-            <w:r>
-              <w:rPr>
-                <w:rFonts w:ascii="Times New Roman" w:eastAsia="Times New Roman" w:hAnsi="Times New Roman" w:cs="Times New Roman"/>
-                <w:b w:val="0"/>
+          </w:p>
+        </w:tc>
+        <w:tc>
+          <w:tcPr>
+            <w:tcW w:w="284" w:type="dxa"/>
+            <w:tcBorders>
+              <w:left w:val="nil"/>
+              <w:bottom w:val="nil"/>
+              <w:right w:val="nil"/>
+            </w:tcBorders>
+            <w:noWrap/>
+            <w:hideMark/>
+          </w:tcPr>
+          <w:p>
+            <w:pPr>
+              <w:jc w:val="center"/>
+              <w:cnfStyle w:val="000000100000" w:firstRow="0" w:lastRow="0" w:firstColumn="0" w:lastColumn="0" w:oddVBand="0" w:evenVBand="0" w:oddHBand="1" w:evenHBand="0" w:firstRowFirstColumn="0" w:firstRowLastColumn="0" w:lastRowFirstColumn="0" w:lastRowLastColumn="0"/>
+              <w:rPr>
+                <w:rFonts w:ascii="Times New Roman" w:eastAsia="Times New Roman" w:hAnsi="Times New Roman" w:cs="Times New Roman"/>
                 <w:color w:val="000000" w:themeColor="text1"/>
                 <w:sz w:val="20"/>
                 <w:szCs w:val="20"/>
                 <w:lang w:eastAsia="es-PE"/>
               </w:rPr>
-              <w:t xml:space="preserve"/>
-            </w:r>
-            <w:r>
-              <w:rPr>
-                <w:rFonts w:ascii="Times New Roman" w:eastAsia="Times New Roman" w:hAnsi="Times New Roman" w:cs="Times New Roman"/>
-                <w:b w:val="0"/>
+            </w:pPr>
+            <w:r>
+              <w:rPr>
+                <w:rFonts w:ascii="Times New Roman" w:eastAsia="Times New Roman" w:hAnsi="Times New Roman" w:cs="Times New Roman"/>
                 <w:color w:val="000000" w:themeColor="text1"/>
                 <w:sz w:val="20"/>
                 <w:szCs w:val="20"/>
                 <w:lang w:eastAsia="es-PE"/>
               </w:rPr>
-              <w:t xml:space="preserve"/>
-            </w:r>
-            <w:r>
-              <w:rPr>
-                <w:rFonts w:ascii="Times New Roman" w:eastAsia="Times New Roman" w:hAnsi="Times New Roman" w:cs="Times New Roman"/>
-                <w:b w:val="0"/>
+              <w:t xml:space="preserve">14</w:t>
+            </w:r>
+          </w:p>
+        </w:tc>
+        <w:tc>
+          <w:tcPr>
+            <w:tcW w:w="1279" w:type="dxa"/>
+            <w:tcBorders>
+              <w:left w:val="nil"/>
+              <w:bottom w:val="nil"/>
+            </w:tcBorders>
+            <w:noWrap/>
+            <w:hideMark/>
+          </w:tcPr>
+          <w:p>
+            <w:pPr>
+              <w:jc w:val="center"/>
+              <w:cnfStyle w:val="000000100000" w:firstRow="0" w:lastRow="0" w:firstColumn="0" w:lastColumn="0" w:oddVBand="0" w:evenVBand="0" w:oddHBand="1" w:evenHBand="0" w:firstRowFirstColumn="0" w:firstRowLastColumn="0" w:lastRowFirstColumn="0" w:lastRowLastColumn="0"/>
+              <w:rPr>
+                <w:rFonts w:ascii="Times New Roman" w:eastAsia="Times New Roman" w:hAnsi="Times New Roman" w:cs="Times New Roman"/>
                 <w:color w:val="000000" w:themeColor="text1"/>
                 <w:sz w:val="20"/>
                 <w:szCs w:val="20"/>
                 <w:lang w:eastAsia="es-PE"/>
               </w:rPr>
-              <w:t/>
-            </w:r>
-          </w:p>
-        </w:tc>
-        <w:tc>
-          <w:tcPr>
-            <w:tcW w:w="284" w:type="dxa"/>
-            <w:tcBorders>
-              <w:top w:val="nil"/>
-              <w:left w:val="nil"/>
-              <w:bottom w:val="nil"/>
-              <w:right w:val="nil"/>
-            </w:tcBorders>
-            <w:noWrap/>
-            <w:vAlign w:val="center"/>
-            <w:hideMark/>
-          </w:tcPr>
-          <w:p>
-            <w:pPr>
-              <w:jc w:val="center"/>
-              <w:cnfStyle w:val="000000100000" w:firstRow="0" w:lastRow="0" w:firstColumn="0" w:lastColumn="0" w:oddVBand="0" w:evenVBand="0" w:oddHBand="1" w:evenHBand="0" w:firstRowFirstColumn="0" w:firstRowLastColumn="0" w:lastRowFirstColumn="0" w:lastRowLastColumn="0"/>
-              <w:rPr>
-                <w:rFonts w:ascii="Times New Roman" w:eastAsia="Times New Roman" w:hAnsi="Times New Roman" w:cs="Times New Roman"/>
-                <w:bCs/>
+            </w:pPr>
+            <w:r>
+              <w:rPr>
+                <w:rFonts w:ascii="Times New Roman" w:eastAsia="Times New Roman" w:hAnsi="Times New Roman" w:cs="Times New Roman"/>
                 <w:color w:val="000000" w:themeColor="text1"/>
                 <w:sz w:val="20"/>
                 <w:szCs w:val="20"/>
                 <w:lang w:eastAsia="es-PE"/>
               </w:rPr>
-            </w:pPr>
-            <w:r>
-              <w:rPr>
-                <w:rFonts w:ascii="Times New Roman" w:eastAsia="Times New Roman" w:hAnsi="Times New Roman" w:cs="Times New Roman"/>
-                <w:bCs/>
-                <w:color w:val="000000" w:themeColor="text1"/>
-                <w:sz w:val="20"/>
-                <w:szCs w:val="20"/>
-                <w:lang w:eastAsia="es-PE"/>
-              </w:rPr>
-              <w:t xml:space="preserve">13</w:t>
-            </w:r>
-          </w:p>
-        </w:tc>
-        <w:tc>
-          <w:tcPr>
-            <w:tcW w:w="1279" w:type="dxa"/>
-            <w:tcBorders>
-              <w:top w:val="nil"/>
-              <w:left w:val="nil"/>
-              <w:bottom w:val="nil"/>
-            </w:tcBorders>
-            <w:noWrap/>
-            <w:vAlign w:val="center"/>
-            <w:hideMark/>
-          </w:tcPr>
-          <w:p>
-            <w:pPr>
-              <w:jc w:val="center"/>
-              <w:cnfStyle w:val="000000100000" w:firstRow="0" w:lastRow="0" w:firstColumn="0" w:lastColumn="0" w:oddVBand="0" w:evenVBand="0" w:oddHBand="1" w:evenHBand="0" w:firstRowFirstColumn="0" w:firstRowLastColumn="0" w:lastRowFirstColumn="0" w:lastRowLastColumn="0"/>
-              <w:rPr>
-                <w:rFonts w:ascii="Times New Roman" w:eastAsia="Times New Roman" w:hAnsi="Times New Roman" w:cs="Times New Roman"/>
-                <w:bCs/>
-                <w:color w:val="000000" w:themeColor="text1"/>
-                <w:sz w:val="20"/>
-                <w:szCs w:val="20"/>
-                <w:lang w:eastAsia="es-PE"/>
-              </w:rPr>
-            </w:pPr>
-            <w:r>
-              <w:rPr>
-                <w:rFonts w:ascii="Times New Roman" w:eastAsia="Times New Roman" w:hAnsi="Times New Roman" w:cs="Times New Roman"/>
-                <w:bCs/>
-                <w:color w:val="000000" w:themeColor="text1"/>
-                <w:sz w:val="20"/>
-                <w:szCs w:val="20"/>
-                <w:lang w:eastAsia="es-PE"/>
-              </w:rPr>
-              <w:t xml:space="preserve">2.2</w:t>
+              <w:t xml:space="preserve">2.4</w:t>
             </w:r>
           </w:p>
         </w:tc>
@@ -13599,40 +13453,54 @@
                 <w:szCs w:val="20"/>
                 <w:lang w:eastAsia="es-PE"/>
               </w:rPr>
-              <w:t xml:space="preserve">Arte y Diseño Gráfico Empresarial</w:t>
-            </w:r>
-            <w:r>
-              <w:rPr>
-                <w:rFonts w:ascii="Times New Roman" w:eastAsia="Times New Roman" w:hAnsi="Times New Roman" w:cs="Times New Roman"/>
-                <w:b w:val="0"/>
+              <w:t xml:space="preserve">Tecnología Médica con especialidad en Radiología</w:t>
+            </w:r>
+          </w:p>
+        </w:tc>
+        <w:tc>
+          <w:tcPr>
+            <w:tcW w:w="284" w:type="dxa"/>
+            <w:tcBorders>
+              <w:top w:val="nil"/>
+              <w:left w:val="nil"/>
+              <w:bottom w:val="nil"/>
+              <w:right w:val="nil"/>
+            </w:tcBorders>
+            <w:shd w:val="clear" w:color="auto" w:fill="D9D9D9" w:themeFill="background1" w:themeFillShade="D9"/>
+            <w:noWrap/>
+            <w:hideMark/>
+          </w:tcPr>
+          <w:p>
+            <w:pPr>
+              <w:jc w:val="center"/>
+              <w:cnfStyle w:val="000000000000" w:firstRow="0" w:lastRow="0" w:firstColumn="0" w:lastColumn="0" w:oddVBand="0" w:evenVBand="0" w:oddHBand="0" w:evenHBand="0" w:firstRowFirstColumn="0" w:firstRowLastColumn="0" w:lastRowFirstColumn="0" w:lastRowLastColumn="0"/>
+              <w:rPr>
+                <w:rFonts w:ascii="Times New Roman" w:eastAsia="Times New Roman" w:hAnsi="Times New Roman" w:cs="Times New Roman"/>
                 <w:color w:val="000000" w:themeColor="text1"/>
                 <w:sz w:val="20"/>
                 <w:szCs w:val="20"/>
                 <w:lang w:eastAsia="es-PE"/>
               </w:rPr>
-              <w:t/>
-            </w:r>
-            <w:r>
-              <w:rPr>
-                <w:rFonts w:ascii="Times New Roman" w:eastAsia="Times New Roman" w:hAnsi="Times New Roman" w:cs="Times New Roman"/>
-                <w:b w:val="0"/>
+            </w:pPr>
+            <w:r>
+              <w:rPr>
+                <w:rFonts w:ascii="Times New Roman" w:eastAsia="Times New Roman" w:hAnsi="Times New Roman" w:cs="Times New Roman"/>
                 <w:color w:val="000000" w:themeColor="text1"/>
                 <w:sz w:val="20"/>
                 <w:szCs w:val="20"/>
                 <w:lang w:eastAsia="es-PE"/>
               </w:rPr>
-              <w:t xml:space="preserve"/>
-            </w:r>
-          </w:p>
-        </w:tc>
-        <w:tc>
-          <w:tcPr>
-            <w:tcW w:w="284" w:type="dxa"/>
+              <w:t xml:space="preserve">12</w:t>
+            </w:r>
+          </w:p>
+        </w:tc>
+        <w:tc>
+          <w:tcPr>
+            <w:tcW w:w="1279" w:type="dxa"/>
             <w:tcBorders>
               <w:top w:val="nil"/>
               <w:left w:val="nil"/>
               <w:bottom w:val="nil"/>
-              <w:right w:val="nil"/>
             </w:tcBorders>
             <w:shd w:val="clear" w:color="auto" w:fill="D9D9D9" w:themeFill="background1" w:themeFillShade="D9"/>
             <w:noWrap/>
@@ -13644,7 +13512,6 @@
               <w:cnfStyle w:val="000000000000" w:firstRow="0" w:lastRow="0" w:firstColumn="0" w:lastColumn="0" w:oddVBand="0" w:evenVBand="0" w:oddHBand="0" w:evenHBand="0" w:firstRowFirstColumn="0" w:firstRowLastColumn="0" w:lastRowFirstColumn="0" w:lastRowLastColumn="0"/>
               <w:rPr>
                 <w:rFonts w:ascii="Times New Roman" w:eastAsia="Times New Roman" w:hAnsi="Times New Roman" w:cs="Times New Roman"/>
-                <w:bCs/>
                 <w:color w:val="000000" w:themeColor="text1"/>
                 <w:sz w:val="20"/>
                 <w:szCs w:val="20"/>
@@ -13654,45 +13521,6 @@
             <w:r>
               <w:rPr>
                 <w:rFonts w:ascii="Times New Roman" w:eastAsia="Times New Roman" w:hAnsi="Times New Roman" w:cs="Times New Roman"/>
-                <w:bCs/>
-                <w:color w:val="000000" w:themeColor="text1"/>
-                <w:sz w:val="20"/>
-                <w:szCs w:val="20"/>
-                <w:lang w:eastAsia="es-PE"/>
-              </w:rPr>
-              <w:t xml:space="preserve">12</w:t>
-            </w:r>
-          </w:p>
-        </w:tc>
-        <w:tc>
-          <w:tcPr>
-            <w:tcW w:w="1279" w:type="dxa"/>
-            <w:tcBorders>
-              <w:top w:val="nil"/>
-              <w:left w:val="nil"/>
-              <w:bottom w:val="nil"/>
-            </w:tcBorders>
-            <w:shd w:val="clear" w:color="auto" w:fill="D9D9D9" w:themeFill="background1" w:themeFillShade="D9"/>
-            <w:noWrap/>
-            <w:hideMark/>
-          </w:tcPr>
-          <w:p>
-            <w:pPr>
-              <w:jc w:val="center"/>
-              <w:cnfStyle w:val="000000000000" w:firstRow="0" w:lastRow="0" w:firstColumn="0" w:lastColumn="0" w:oddVBand="0" w:evenVBand="0" w:oddHBand="0" w:evenHBand="0" w:firstRowFirstColumn="0" w:firstRowLastColumn="0" w:lastRowFirstColumn="0" w:lastRowLastColumn="0"/>
-              <w:rPr>
-                <w:rFonts w:ascii="Times New Roman" w:eastAsia="Times New Roman" w:hAnsi="Times New Roman" w:cs="Times New Roman"/>
-                <w:bCs/>
-                <w:color w:val="000000" w:themeColor="text1"/>
-                <w:sz w:val="20"/>
-                <w:szCs w:val="20"/>
-                <w:lang w:eastAsia="es-PE"/>
-              </w:rPr>
-            </w:pPr>
-            <w:r>
-              <w:rPr>
-                <w:rFonts w:ascii="Times New Roman" w:eastAsia="Times New Roman" w:hAnsi="Times New Roman" w:cs="Times New Roman"/>
-                <w:bCs/>
                 <w:color w:val="000000" w:themeColor="text1"/>
                 <w:sz w:val="20"/>
                 <w:szCs w:val="20"/>
@@ -13714,7 +13542,6 @@
             <w:cnfStyle w:val="001000000000" w:firstRow="0" w:lastRow="0" w:firstColumn="1" w:lastColumn="0" w:oddVBand="0" w:evenVBand="0" w:oddHBand="0" w:evenHBand="0" w:firstRowFirstColumn="0" w:firstRowLastColumn="0" w:lastRowFirstColumn="0" w:lastRowLastColumn="0"/>
             <w:tcW w:w="6804" w:type="dxa"/>
             <w:tcBorders>
-              <w:top w:val="nil"/>
               <w:bottom w:val="nil"/>
               <w:right w:val="nil"/>
             </w:tcBorders>
@@ -13740,82 +13567,87 @@
                 <w:szCs w:val="20"/>
                 <w:lang w:eastAsia="es-PE"/>
               </w:rPr>
-              <w:t xml:space="preserve">Arquitectura y Diseño de Interiores</w:t>
-            </w:r>
-          </w:p>
-        </w:tc>
-        <w:tc>
-          <w:tcPr>
-            <w:tcW w:w="284" w:type="dxa"/>
-            <w:tcBorders>
-              <w:top w:val="nil"/>
-              <w:left w:val="nil"/>
-              <w:bottom w:val="nil"/>
-              <w:right w:val="nil"/>
-            </w:tcBorders>
-            <w:noWrap/>
-            <w:hideMark/>
-          </w:tcPr>
-          <w:p>
-            <w:pPr>
-              <w:jc w:val="center"/>
-              <w:cnfStyle w:val="000000100000" w:firstRow="0" w:lastRow="0" w:firstColumn="0" w:lastColumn="0" w:oddVBand="0" w:evenVBand="0" w:oddHBand="1" w:evenHBand="0" w:firstRowFirstColumn="0" w:firstRowLastColumn="0" w:lastRowFirstColumn="0" w:lastRowLastColumn="0"/>
-              <w:rPr>
-                <w:rFonts w:ascii="Times New Roman" w:eastAsia="Times New Roman" w:hAnsi="Times New Roman" w:cs="Times New Roman"/>
-                <w:bCs/>
+              <w:t xml:space="preserve">Arte y Diseño Gráfico Empresarial</w:t>
+            </w:r>
+            <w:r>
+              <w:rPr>
+                <w:rFonts w:ascii="Times New Roman" w:eastAsia="Times New Roman" w:hAnsi="Times New Roman" w:cs="Times New Roman"/>
+                <w:b w:val="0"/>
                 <w:color w:val="000000" w:themeColor="text1"/>
                 <w:sz w:val="20"/>
                 <w:szCs w:val="20"/>
                 <w:lang w:eastAsia="es-PE"/>
               </w:rPr>
-            </w:pPr>
-            <w:r>
-              <w:rPr>
-                <w:rFonts w:ascii="Times New Roman" w:eastAsia="Times New Roman" w:hAnsi="Times New Roman" w:cs="Times New Roman"/>
-                <w:bCs/>
+              <w:t xml:space="preserve"/>
+            </w:r>
+          </w:p>
+        </w:tc>
+        <w:tc>
+          <w:tcPr>
+            <w:tcW w:w="284" w:type="dxa"/>
+            <w:tcBorders>
+              <w:left w:val="nil"/>
+              <w:bottom w:val="nil"/>
+              <w:right w:val="nil"/>
+            </w:tcBorders>
+            <w:noWrap/>
+            <w:hideMark/>
+          </w:tcPr>
+          <w:p>
+            <w:pPr>
+              <w:jc w:val="center"/>
+              <w:cnfStyle w:val="000000100000" w:firstRow="0" w:lastRow="0" w:firstColumn="0" w:lastColumn="0" w:oddVBand="0" w:evenVBand="0" w:oddHBand="1" w:evenHBand="0" w:firstRowFirstColumn="0" w:firstRowLastColumn="0" w:lastRowFirstColumn="0" w:lastRowLastColumn="0"/>
+              <w:rPr>
+                <w:rFonts w:ascii="Times New Roman" w:eastAsia="Times New Roman" w:hAnsi="Times New Roman" w:cs="Times New Roman"/>
                 <w:color w:val="000000" w:themeColor="text1"/>
                 <w:sz w:val="20"/>
                 <w:szCs w:val="20"/>
                 <w:lang w:eastAsia="es-PE"/>
               </w:rPr>
-              <w:t xml:space="preserve">9</w:t>
-            </w:r>
-          </w:p>
-        </w:tc>
-        <w:tc>
-          <w:tcPr>
-            <w:tcW w:w="1279" w:type="dxa"/>
-            <w:tcBorders>
-              <w:top w:val="nil"/>
-              <w:left w:val="nil"/>
-              <w:bottom w:val="nil"/>
-            </w:tcBorders>
-            <w:noWrap/>
-            <w:hideMark/>
-          </w:tcPr>
-          <w:p>
-            <w:pPr>
-              <w:jc w:val="center"/>
-              <w:cnfStyle w:val="000000100000" w:firstRow="0" w:lastRow="0" w:firstColumn="0" w:lastColumn="0" w:oddVBand="0" w:evenVBand="0" w:oddHBand="1" w:evenHBand="0" w:firstRowFirstColumn="0" w:firstRowLastColumn="0" w:lastRowFirstColumn="0" w:lastRowLastColumn="0"/>
-              <w:rPr>
-                <w:rFonts w:ascii="Times New Roman" w:eastAsia="Times New Roman" w:hAnsi="Times New Roman" w:cs="Times New Roman"/>
-                <w:bCs/>
+            </w:pPr>
+            <w:r>
+              <w:rPr>
+                <w:rFonts w:ascii="Times New Roman" w:eastAsia="Times New Roman" w:hAnsi="Times New Roman" w:cs="Times New Roman"/>
                 <w:color w:val="000000" w:themeColor="text1"/>
                 <w:sz w:val="20"/>
                 <w:szCs w:val="20"/>
                 <w:lang w:eastAsia="es-PE"/>
               </w:rPr>
-            </w:pPr>
-            <w:r>
-              <w:rPr>
-                <w:rFonts w:ascii="Times New Roman" w:eastAsia="Times New Roman" w:hAnsi="Times New Roman" w:cs="Times New Roman"/>
-                <w:bCs/>
+              <w:t xml:space="preserve">11</w:t>
+            </w:r>
+          </w:p>
+        </w:tc>
+        <w:tc>
+          <w:tcPr>
+            <w:tcW w:w="1279" w:type="dxa"/>
+            <w:tcBorders>
+              <w:left w:val="nil"/>
+              <w:bottom w:val="nil"/>
+            </w:tcBorders>
+            <w:noWrap/>
+            <w:hideMark/>
+          </w:tcPr>
+          <w:p>
+            <w:pPr>
+              <w:jc w:val="center"/>
+              <w:cnfStyle w:val="000000100000" w:firstRow="0" w:lastRow="0" w:firstColumn="0" w:lastColumn="0" w:oddVBand="0" w:evenVBand="0" w:oddHBand="1" w:evenHBand="0" w:firstRowFirstColumn="0" w:firstRowLastColumn="0" w:lastRowFirstColumn="0" w:lastRowLastColumn="0"/>
+              <w:rPr>
+                <w:rFonts w:ascii="Times New Roman" w:eastAsia="Times New Roman" w:hAnsi="Times New Roman" w:cs="Times New Roman"/>
                 <w:color w:val="000000" w:themeColor="text1"/>
                 <w:sz w:val="20"/>
                 <w:szCs w:val="20"/>
                 <w:lang w:eastAsia="es-PE"/>
               </w:rPr>
-              <w:t xml:space="preserve">1.5</w:t>
+            </w:pPr>
+            <w:r>
+              <w:rPr>
+                <w:rFonts w:ascii="Times New Roman" w:eastAsia="Times New Roman" w:hAnsi="Times New Roman" w:cs="Times New Roman"/>
+                <w:color w:val="000000" w:themeColor="text1"/>
+                <w:sz w:val="20"/>
+                <w:szCs w:val="20"/>
+                <w:lang w:eastAsia="es-PE"/>
+              </w:rPr>
+              <w:t xml:space="preserve">1.9</w:t>
             </w:r>
           </w:p>
         </w:tc>
@@ -13857,7 +13689,7 @@
                 <w:szCs w:val="20"/>
                 <w:lang w:eastAsia="es-PE"/>
               </w:rPr>
-              <w:t xml:space="preserve">Ing. de Software</w:t>
+              <w:t xml:space="preserve">Arquitectura y Diseño de Interiores</w:t>
             </w:r>
           </w:p>
         </w:tc>
@@ -13880,7 +13712,6 @@
               <w:cnfStyle w:val="000000000000" w:firstRow="0" w:lastRow="0" w:firstColumn="0" w:lastColumn="0" w:oddVBand="0" w:evenVBand="0" w:oddHBand="0" w:evenHBand="0" w:firstRowFirstColumn="0" w:firstRowLastColumn="0" w:lastRowFirstColumn="0" w:lastRowLastColumn="0"/>
               <w:rPr>
                 <w:rFonts w:ascii="Times New Roman" w:eastAsia="Times New Roman" w:hAnsi="Times New Roman" w:cs="Times New Roman"/>
-                <w:bCs/>
                 <w:color w:val="000000" w:themeColor="text1"/>
                 <w:sz w:val="20"/>
                 <w:szCs w:val="20"/>
@@ -13890,13 +13721,12 @@
             <w:r>
               <w:rPr>
                 <w:rFonts w:ascii="Times New Roman" w:eastAsia="Times New Roman" w:hAnsi="Times New Roman" w:cs="Times New Roman"/>
-                <w:bCs/>
                 <w:color w:val="000000" w:themeColor="text1"/>
                 <w:sz w:val="20"/>
                 <w:szCs w:val="20"/>
                 <w:lang w:eastAsia="es-PE"/>
               </w:rPr>
-              <w:t xml:space="preserve">6</w:t>
+              <w:t xml:space="preserve">8</w:t>
             </w:r>
           </w:p>
         </w:tc>
@@ -13918,7 +13748,6 @@
               <w:cnfStyle w:val="000000000000" w:firstRow="0" w:lastRow="0" w:firstColumn="0" w:lastColumn="0" w:oddVBand="0" w:evenVBand="0" w:oddHBand="0" w:evenHBand="0" w:firstRowFirstColumn="0" w:firstRowLastColumn="0" w:lastRowFirstColumn="0" w:lastRowLastColumn="0"/>
               <w:rPr>
                 <w:rFonts w:ascii="Times New Roman" w:eastAsia="Times New Roman" w:hAnsi="Times New Roman" w:cs="Times New Roman"/>
-                <w:bCs/>
                 <w:color w:val="000000" w:themeColor="text1"/>
                 <w:sz w:val="20"/>
                 <w:szCs w:val="20"/>
@@ -13928,13 +13757,12 @@
             <w:r>
               <w:rPr>
                 <w:rFonts w:ascii="Times New Roman" w:eastAsia="Times New Roman" w:hAnsi="Times New Roman" w:cs="Times New Roman"/>
-                <w:bCs/>
                 <w:color w:val="000000" w:themeColor="text1"/>
                 <w:sz w:val="20"/>
                 <w:szCs w:val="20"/>
                 <w:lang w:eastAsia="es-PE"/>
               </w:rPr>
-              <w:t xml:space="preserve">1.0</w:t>
+              <w:t xml:space="preserve">1.4</w:t>
             </w:r>
           </w:p>
         </w:tc>
@@ -13950,7 +13778,6 @@
             <w:cnfStyle w:val="001000000000" w:firstRow="0" w:lastRow="0" w:firstColumn="1" w:lastColumn="0" w:oddVBand="0" w:evenVBand="0" w:oddHBand="0" w:evenHBand="0" w:firstRowFirstColumn="0" w:firstRowLastColumn="0" w:lastRowFirstColumn="0" w:lastRowLastColumn="0"/>
             <w:tcW w:w="6804" w:type="dxa"/>
             <w:tcBorders>
-              <w:top w:val="nil"/>
               <w:bottom w:val="nil"/>
               <w:right w:val="nil"/>
             </w:tcBorders>
@@ -13976,76 +13803,81 @@
                 <w:szCs w:val="20"/>
                 <w:lang w:eastAsia="es-PE"/>
               </w:rPr>
-              <w:t xml:space="preserve">Turismo y Negocios</w:t>
-            </w:r>
-          </w:p>
-        </w:tc>
-        <w:tc>
-          <w:tcPr>
-            <w:tcW w:w="284" w:type="dxa"/>
-            <w:tcBorders>
-              <w:top w:val="nil"/>
-              <w:left w:val="nil"/>
-              <w:bottom w:val="nil"/>
-              <w:right w:val="nil"/>
-            </w:tcBorders>
-            <w:noWrap/>
-            <w:hideMark/>
-          </w:tcPr>
-          <w:p>
-            <w:pPr>
-              <w:jc w:val="center"/>
-              <w:cnfStyle w:val="000000100000" w:firstRow="0" w:lastRow="0" w:firstColumn="0" w:lastColumn="0" w:oddVBand="0" w:evenVBand="0" w:oddHBand="1" w:evenHBand="0" w:firstRowFirstColumn="0" w:firstRowLastColumn="0" w:lastRowFirstColumn="0" w:lastRowLastColumn="0"/>
-              <w:rPr>
-                <w:rFonts w:ascii="Times New Roman" w:eastAsia="Times New Roman" w:hAnsi="Times New Roman" w:cs="Times New Roman"/>
-                <w:bCs/>
+              <w:t xml:space="preserve">Ing. de Software</w:t>
+            </w:r>
+            <w:r>
+              <w:rPr>
+                <w:rFonts w:ascii="Times New Roman" w:eastAsia="Times New Roman" w:hAnsi="Times New Roman" w:cs="Times New Roman"/>
+                <w:b w:val="0"/>
                 <w:color w:val="000000" w:themeColor="text1"/>
                 <w:sz w:val="20"/>
                 <w:szCs w:val="20"/>
                 <w:lang w:eastAsia="es-PE"/>
               </w:rPr>
-            </w:pPr>
-            <w:r>
-              <w:rPr>
-                <w:rFonts w:ascii="Times New Roman" w:eastAsia="Times New Roman" w:hAnsi="Times New Roman" w:cs="Times New Roman"/>
-                <w:bCs/>
+              <w:t xml:space="preserve"/>
+            </w:r>
+          </w:p>
+        </w:tc>
+        <w:tc>
+          <w:tcPr>
+            <w:tcW w:w="284" w:type="dxa"/>
+            <w:tcBorders>
+              <w:left w:val="nil"/>
+              <w:bottom w:val="nil"/>
+              <w:right w:val="nil"/>
+            </w:tcBorders>
+            <w:noWrap/>
+            <w:hideMark/>
+          </w:tcPr>
+          <w:p>
+            <w:pPr>
+              <w:jc w:val="center"/>
+              <w:cnfStyle w:val="000000100000" w:firstRow="0" w:lastRow="0" w:firstColumn="0" w:lastColumn="0" w:oddVBand="0" w:evenVBand="0" w:oddHBand="1" w:evenHBand="0" w:firstRowFirstColumn="0" w:firstRowLastColumn="0" w:lastRowFirstColumn="0" w:lastRowLastColumn="0"/>
+              <w:rPr>
+                <w:rFonts w:ascii="Times New Roman" w:eastAsia="Times New Roman" w:hAnsi="Times New Roman" w:cs="Times New Roman"/>
                 <w:color w:val="000000" w:themeColor="text1"/>
                 <w:sz w:val="20"/>
                 <w:szCs w:val="20"/>
                 <w:lang w:eastAsia="es-PE"/>
               </w:rPr>
-              <w:t xml:space="preserve">6</w:t>
-            </w:r>
-          </w:p>
-        </w:tc>
-        <w:tc>
-          <w:tcPr>
-            <w:tcW w:w="1279" w:type="dxa"/>
-            <w:tcBorders>
-              <w:top w:val="nil"/>
-              <w:left w:val="nil"/>
-              <w:bottom w:val="nil"/>
-            </w:tcBorders>
-            <w:noWrap/>
-            <w:hideMark/>
-          </w:tcPr>
-          <w:p>
-            <w:pPr>
-              <w:jc w:val="center"/>
-              <w:cnfStyle w:val="000000100000" w:firstRow="0" w:lastRow="0" w:firstColumn="0" w:lastColumn="0" w:oddVBand="0" w:evenVBand="0" w:oddHBand="1" w:evenHBand="0" w:firstRowFirstColumn="0" w:firstRowLastColumn="0" w:lastRowFirstColumn="0" w:lastRowLastColumn="0"/>
-              <w:rPr>
-                <w:rFonts w:ascii="Times New Roman" w:eastAsia="Times New Roman" w:hAnsi="Times New Roman" w:cs="Times New Roman"/>
-                <w:bCs/>
+            </w:pPr>
+            <w:r>
+              <w:rPr>
+                <w:rFonts w:ascii="Times New Roman" w:eastAsia="Times New Roman" w:hAnsi="Times New Roman" w:cs="Times New Roman"/>
                 <w:color w:val="000000" w:themeColor="text1"/>
                 <w:sz w:val="20"/>
                 <w:szCs w:val="20"/>
                 <w:lang w:eastAsia="es-PE"/>
               </w:rPr>
-            </w:pPr>
-            <w:r>
-              <w:rPr>
-                <w:rFonts w:ascii="Times New Roman" w:eastAsia="Times New Roman" w:hAnsi="Times New Roman" w:cs="Times New Roman"/>
-                <w:bCs/>
+              <w:t xml:space="preserve">6</w:t>
+            </w:r>
+          </w:p>
+        </w:tc>
+        <w:tc>
+          <w:tcPr>
+            <w:tcW w:w="1279" w:type="dxa"/>
+            <w:tcBorders>
+              <w:left w:val="nil"/>
+              <w:bottom w:val="nil"/>
+            </w:tcBorders>
+            <w:noWrap/>
+            <w:hideMark/>
+          </w:tcPr>
+          <w:p>
+            <w:pPr>
+              <w:jc w:val="center"/>
+              <w:cnfStyle w:val="000000100000" w:firstRow="0" w:lastRow="0" w:firstColumn="0" w:lastColumn="0" w:oddVBand="0" w:evenVBand="0" w:oddHBand="1" w:evenHBand="0" w:firstRowFirstColumn="0" w:firstRowLastColumn="0" w:lastRowFirstColumn="0" w:lastRowLastColumn="0"/>
+              <w:rPr>
+                <w:rFonts w:ascii="Times New Roman" w:eastAsia="Times New Roman" w:hAnsi="Times New Roman" w:cs="Times New Roman"/>
+                <w:color w:val="000000" w:themeColor="text1"/>
+                <w:sz w:val="20"/>
+                <w:szCs w:val="20"/>
+                <w:lang w:eastAsia="es-PE"/>
+              </w:rPr>
+            </w:pPr>
+            <w:r>
+              <w:rPr>
+                <w:rFonts w:ascii="Times New Roman" w:eastAsia="Times New Roman" w:hAnsi="Times New Roman" w:cs="Times New Roman"/>
                 <w:color w:val="000000" w:themeColor="text1"/>
                 <w:sz w:val="20"/>
                 <w:szCs w:val="20"/>
@@ -14093,7 +13925,7 @@
                 <w:szCs w:val="20"/>
                 <w:lang w:eastAsia="es-PE"/>
               </w:rPr>
-              <w:t xml:space="preserve">Ing. Agroindustrial y Comercio Exterior</w:t>
+              <w:t xml:space="preserve">Turismo y Negocios</w:t>
             </w:r>
           </w:p>
         </w:tc>
@@ -14116,7 +13948,6 @@
               <w:cnfStyle w:val="000000000000" w:firstRow="0" w:lastRow="0" w:firstColumn="0" w:lastColumn="0" w:oddVBand="0" w:evenVBand="0" w:oddHBand="0" w:evenHBand="0" w:firstRowFirstColumn="0" w:firstRowLastColumn="0" w:lastRowFirstColumn="0" w:lastRowLastColumn="0"/>
               <w:rPr>
                 <w:rFonts w:ascii="Times New Roman" w:eastAsia="Times New Roman" w:hAnsi="Times New Roman" w:cs="Times New Roman"/>
-                <w:bCs/>
                 <w:color w:val="000000" w:themeColor="text1"/>
                 <w:sz w:val="20"/>
                 <w:szCs w:val="20"/>
@@ -14126,13 +13957,12 @@
             <w:r>
               <w:rPr>
                 <w:rFonts w:ascii="Times New Roman" w:eastAsia="Times New Roman" w:hAnsi="Times New Roman" w:cs="Times New Roman"/>
-                <w:bCs/>
                 <w:color w:val="000000" w:themeColor="text1"/>
                 <w:sz w:val="20"/>
                 <w:szCs w:val="20"/>
                 <w:lang w:eastAsia="es-PE"/>
               </w:rPr>
-              <w:t xml:space="preserve">4</w:t>
+              <w:t xml:space="preserve">6</w:t>
             </w:r>
           </w:p>
         </w:tc>
@@ -14154,7 +13984,6 @@
               <w:cnfStyle w:val="000000000000" w:firstRow="0" w:lastRow="0" w:firstColumn="0" w:lastColumn="0" w:oddVBand="0" w:evenVBand="0" w:oddHBand="0" w:evenHBand="0" w:firstRowFirstColumn="0" w:firstRowLastColumn="0" w:lastRowFirstColumn="0" w:lastRowLastColumn="0"/>
               <w:rPr>
                 <w:rFonts w:ascii="Times New Roman" w:eastAsia="Times New Roman" w:hAnsi="Times New Roman" w:cs="Times New Roman"/>
-                <w:bCs/>
                 <w:color w:val="000000" w:themeColor="text1"/>
                 <w:sz w:val="20"/>
                 <w:szCs w:val="20"/>
@@ -14164,13 +13993,12 @@
             <w:r>
               <w:rPr>
                 <w:rFonts w:ascii="Times New Roman" w:eastAsia="Times New Roman" w:hAnsi="Times New Roman" w:cs="Times New Roman"/>
-                <w:bCs/>
                 <w:color w:val="000000" w:themeColor="text1"/>
                 <w:sz w:val="20"/>
                 <w:szCs w:val="20"/>
                 <w:lang w:eastAsia="es-PE"/>
               </w:rPr>
-              <w:t xml:space="preserve">0.7</w:t>
+              <w:t xml:space="preserve">1.0</w:t>
             </w:r>
           </w:p>
         </w:tc>
@@ -14186,7 +14014,6 @@
             <w:cnfStyle w:val="001000000000" w:firstRow="0" w:lastRow="0" w:firstColumn="1" w:lastColumn="0" w:oddVBand="0" w:evenVBand="0" w:oddHBand="0" w:evenHBand="0" w:firstRowFirstColumn="0" w:firstRowLastColumn="0" w:lastRowFirstColumn="0" w:lastRowLastColumn="0"/>
             <w:tcW w:w="6804" w:type="dxa"/>
             <w:tcBorders>
-              <w:top w:val="nil"/>
               <w:bottom w:val="nil"/>
               <w:right w:val="nil"/>
             </w:tcBorders>
@@ -14212,82 +14039,87 @@
                 <w:szCs w:val="20"/>
                 <w:lang w:eastAsia="es-PE"/>
               </w:rPr>
-              <w:t xml:space="preserve">Trabajo Social</w:t>
-            </w:r>
-          </w:p>
-        </w:tc>
-        <w:tc>
-          <w:tcPr>
-            <w:tcW w:w="284" w:type="dxa"/>
-            <w:tcBorders>
-              <w:top w:val="nil"/>
-              <w:left w:val="nil"/>
-              <w:bottom w:val="nil"/>
-              <w:right w:val="nil"/>
-            </w:tcBorders>
-            <w:noWrap/>
-            <w:hideMark/>
-          </w:tcPr>
-          <w:p>
-            <w:pPr>
-              <w:jc w:val="center"/>
-              <w:cnfStyle w:val="000000100000" w:firstRow="0" w:lastRow="0" w:firstColumn="0" w:lastColumn="0" w:oddVBand="0" w:evenVBand="0" w:oddHBand="1" w:evenHBand="0" w:firstRowFirstColumn="0" w:firstRowLastColumn="0" w:lastRowFirstColumn="0" w:lastRowLastColumn="0"/>
-              <w:rPr>
-                <w:rFonts w:ascii="Times New Roman" w:eastAsia="Times New Roman" w:hAnsi="Times New Roman" w:cs="Times New Roman"/>
-                <w:bCs/>
+              <w:t xml:space="preserve">Ing. Agroindustrial y Comercio Exterior</w:t>
+            </w:r>
+            <w:r>
+              <w:rPr>
+                <w:rFonts w:ascii="Times New Roman" w:eastAsia="Times New Roman" w:hAnsi="Times New Roman" w:cs="Times New Roman"/>
+                <w:b w:val="0"/>
                 <w:color w:val="000000" w:themeColor="text1"/>
                 <w:sz w:val="20"/>
                 <w:szCs w:val="20"/>
                 <w:lang w:eastAsia="es-PE"/>
               </w:rPr>
-            </w:pPr>
-            <w:r>
-              <w:rPr>
-                <w:rFonts w:ascii="Times New Roman" w:eastAsia="Times New Roman" w:hAnsi="Times New Roman" w:cs="Times New Roman"/>
-                <w:bCs/>
+              <w:t xml:space="preserve"/>
+            </w:r>
+          </w:p>
+        </w:tc>
+        <w:tc>
+          <w:tcPr>
+            <w:tcW w:w="284" w:type="dxa"/>
+            <w:tcBorders>
+              <w:left w:val="nil"/>
+              <w:bottom w:val="nil"/>
+              <w:right w:val="nil"/>
+            </w:tcBorders>
+            <w:noWrap/>
+            <w:hideMark/>
+          </w:tcPr>
+          <w:p>
+            <w:pPr>
+              <w:jc w:val="center"/>
+              <w:cnfStyle w:val="000000100000" w:firstRow="0" w:lastRow="0" w:firstColumn="0" w:lastColumn="0" w:oddVBand="0" w:evenVBand="0" w:oddHBand="1" w:evenHBand="0" w:firstRowFirstColumn="0" w:firstRowLastColumn="0" w:lastRowFirstColumn="0" w:lastRowLastColumn="0"/>
+              <w:rPr>
+                <w:rFonts w:ascii="Times New Roman" w:eastAsia="Times New Roman" w:hAnsi="Times New Roman" w:cs="Times New Roman"/>
                 <w:color w:val="000000" w:themeColor="text1"/>
                 <w:sz w:val="20"/>
                 <w:szCs w:val="20"/>
                 <w:lang w:eastAsia="es-PE"/>
               </w:rPr>
-              <w:t xml:space="preserve">3</w:t>
-            </w:r>
-          </w:p>
-        </w:tc>
-        <w:tc>
-          <w:tcPr>
-            <w:tcW w:w="1279" w:type="dxa"/>
-            <w:tcBorders>
-              <w:top w:val="nil"/>
-              <w:left w:val="nil"/>
-              <w:bottom w:val="nil"/>
-            </w:tcBorders>
-            <w:noWrap/>
-            <w:hideMark/>
-          </w:tcPr>
-          <w:p>
-            <w:pPr>
-              <w:jc w:val="center"/>
-              <w:cnfStyle w:val="000000100000" w:firstRow="0" w:lastRow="0" w:firstColumn="0" w:lastColumn="0" w:oddVBand="0" w:evenVBand="0" w:oddHBand="1" w:evenHBand="0" w:firstRowFirstColumn="0" w:firstRowLastColumn="0" w:lastRowFirstColumn="0" w:lastRowLastColumn="0"/>
-              <w:rPr>
-                <w:rFonts w:ascii="Times New Roman" w:eastAsia="Times New Roman" w:hAnsi="Times New Roman" w:cs="Times New Roman"/>
-                <w:bCs/>
+            </w:pPr>
+            <w:r>
+              <w:rPr>
+                <w:rFonts w:ascii="Times New Roman" w:eastAsia="Times New Roman" w:hAnsi="Times New Roman" w:cs="Times New Roman"/>
                 <w:color w:val="000000" w:themeColor="text1"/>
                 <w:sz w:val="20"/>
                 <w:szCs w:val="20"/>
                 <w:lang w:eastAsia="es-PE"/>
               </w:rPr>
-            </w:pPr>
-            <w:r>
-              <w:rPr>
-                <w:rFonts w:ascii="Times New Roman" w:eastAsia="Times New Roman" w:hAnsi="Times New Roman" w:cs="Times New Roman"/>
-                <w:bCs/>
+              <w:t xml:space="preserve">4</w:t>
+            </w:r>
+          </w:p>
+        </w:tc>
+        <w:tc>
+          <w:tcPr>
+            <w:tcW w:w="1279" w:type="dxa"/>
+            <w:tcBorders>
+              <w:left w:val="nil"/>
+              <w:bottom w:val="nil"/>
+            </w:tcBorders>
+            <w:noWrap/>
+            <w:hideMark/>
+          </w:tcPr>
+          <w:p>
+            <w:pPr>
+              <w:jc w:val="center"/>
+              <w:cnfStyle w:val="000000100000" w:firstRow="0" w:lastRow="0" w:firstColumn="0" w:lastColumn="0" w:oddVBand="0" w:evenVBand="0" w:oddHBand="1" w:evenHBand="0" w:firstRowFirstColumn="0" w:firstRowLastColumn="0" w:lastRowFirstColumn="0" w:lastRowLastColumn="0"/>
+              <w:rPr>
+                <w:rFonts w:ascii="Times New Roman" w:eastAsia="Times New Roman" w:hAnsi="Times New Roman" w:cs="Times New Roman"/>
                 <w:color w:val="000000" w:themeColor="text1"/>
                 <w:sz w:val="20"/>
                 <w:szCs w:val="20"/>
                 <w:lang w:eastAsia="es-PE"/>
               </w:rPr>
-              <w:t xml:space="preserve">0.5</w:t>
+            </w:pPr>
+            <w:r>
+              <w:rPr>
+                <w:rFonts w:ascii="Times New Roman" w:eastAsia="Times New Roman" w:hAnsi="Times New Roman" w:cs="Times New Roman"/>
+                <w:color w:val="000000" w:themeColor="text1"/>
+                <w:sz w:val="20"/>
+                <w:szCs w:val="20"/>
+                <w:lang w:eastAsia="es-PE"/>
+              </w:rPr>
+              <w:t xml:space="preserve">0.7</w:t>
             </w:r>
           </w:p>
         </w:tc>
@@ -14329,7 +14161,7 @@
                 <w:szCs w:val="20"/>
                 <w:lang w:eastAsia="es-PE"/>
               </w:rPr>
-              <w:t xml:space="preserve">Indeciso</w:t>
+              <w:t xml:space="preserve">Trabajo Social</w:t>
             </w:r>
           </w:p>
         </w:tc>
@@ -14352,7 +14184,6 @@
               <w:cnfStyle w:val="000000000000" w:firstRow="0" w:lastRow="0" w:firstColumn="0" w:lastColumn="0" w:oddVBand="0" w:evenVBand="0" w:oddHBand="0" w:evenHBand="0" w:firstRowFirstColumn="0" w:firstRowLastColumn="0" w:lastRowFirstColumn="0" w:lastRowLastColumn="0"/>
               <w:rPr>
                 <w:rFonts w:ascii="Times New Roman" w:eastAsia="Times New Roman" w:hAnsi="Times New Roman" w:cs="Times New Roman"/>
-                <w:bCs/>
                 <w:color w:val="000000" w:themeColor="text1"/>
                 <w:sz w:val="20"/>
                 <w:szCs w:val="20"/>
@@ -14362,13 +14193,12 @@
             <w:r>
               <w:rPr>
                 <w:rFonts w:ascii="Times New Roman" w:eastAsia="Times New Roman" w:hAnsi="Times New Roman" w:cs="Times New Roman"/>
-                <w:bCs/>
                 <w:color w:val="000000" w:themeColor="text1"/>
                 <w:sz w:val="20"/>
                 <w:szCs w:val="20"/>
                 <w:lang w:eastAsia="es-PE"/>
               </w:rPr>
-              <w:t xml:space="preserve">2</w:t>
+              <w:t xml:space="preserve">3</w:t>
             </w:r>
           </w:p>
         </w:tc>
@@ -14390,7 +14220,6 @@
               <w:cnfStyle w:val="000000000000" w:firstRow="0" w:lastRow="0" w:firstColumn="0" w:lastColumn="0" w:oddVBand="0" w:evenVBand="0" w:oddHBand="0" w:evenHBand="0" w:firstRowFirstColumn="0" w:firstRowLastColumn="0" w:lastRowFirstColumn="0" w:lastRowLastColumn="0"/>
               <w:rPr>
                 <w:rFonts w:ascii="Times New Roman" w:eastAsia="Times New Roman" w:hAnsi="Times New Roman" w:cs="Times New Roman"/>
-                <w:bCs/>
                 <w:color w:val="000000" w:themeColor="text1"/>
                 <w:sz w:val="20"/>
                 <w:szCs w:val="20"/>
@@ -14400,13 +14229,12 @@
             <w:r>
               <w:rPr>
                 <w:rFonts w:ascii="Times New Roman" w:eastAsia="Times New Roman" w:hAnsi="Times New Roman" w:cs="Times New Roman"/>
-                <w:bCs/>
                 <w:color w:val="000000" w:themeColor="text1"/>
                 <w:sz w:val="20"/>
                 <w:szCs w:val="20"/>
                 <w:lang w:eastAsia="es-PE"/>
               </w:rPr>
-              <w:t xml:space="preserve">0.3</w:t>
+              <w:t xml:space="preserve">0.5</w:t>
             </w:r>
           </w:p>
         </w:tc>
@@ -14422,7 +14250,7 @@
             <w:cnfStyle w:val="001000000000" w:firstRow="0" w:lastRow="0" w:firstColumn="1" w:lastColumn="0" w:oddVBand="0" w:evenVBand="0" w:oddHBand="0" w:evenHBand="0" w:firstRowFirstColumn="0" w:firstRowLastColumn="0" w:lastRowFirstColumn="0" w:lastRowLastColumn="0"/>
             <w:tcW w:w="6804" w:type="dxa"/>
             <w:tcBorders>
-              <w:top w:val="nil"/>
+              <w:bottom w:val="nil"/>
               <w:right w:val="nil"/>
             </w:tcBorders>
             <w:hideMark/>
@@ -14447,80 +14275,87 @@
                 <w:szCs w:val="20"/>
                 <w:lang w:eastAsia="es-PE"/>
               </w:rPr>
-              <w:t xml:space="preserve">Ninguna</w:t>
-            </w:r>
-          </w:p>
-        </w:tc>
-        <w:tc>
-          <w:tcPr>
-            <w:tcW w:w="284" w:type="dxa"/>
-            <w:tcBorders>
-              <w:top w:val="nil"/>
-              <w:left w:val="nil"/>
-              <w:right w:val="nil"/>
-            </w:tcBorders>
-            <w:noWrap/>
-            <w:hideMark/>
-          </w:tcPr>
-          <w:p>
-            <w:pPr>
-              <w:jc w:val="center"/>
-              <w:cnfStyle w:val="000000100000" w:firstRow="0" w:lastRow="0" w:firstColumn="0" w:lastColumn="0" w:oddVBand="0" w:evenVBand="0" w:oddHBand="1" w:evenHBand="0" w:firstRowFirstColumn="0" w:firstRowLastColumn="0" w:lastRowFirstColumn="0" w:lastRowLastColumn="0"/>
-              <w:rPr>
-                <w:rFonts w:ascii="Times New Roman" w:eastAsia="Times New Roman" w:hAnsi="Times New Roman" w:cs="Times New Roman"/>
-                <w:bCs/>
+              <w:t xml:space="preserve">Indeciso</w:t>
+            </w:r>
+            <w:r>
+              <w:rPr>
+                <w:rFonts w:ascii="Times New Roman" w:eastAsia="Times New Roman" w:hAnsi="Times New Roman" w:cs="Times New Roman"/>
+                <w:b w:val="0"/>
                 <w:color w:val="000000" w:themeColor="text1"/>
                 <w:sz w:val="20"/>
                 <w:szCs w:val="20"/>
                 <w:lang w:eastAsia="es-PE"/>
               </w:rPr>
-            </w:pPr>
-            <w:r>
-              <w:rPr>
-                <w:rFonts w:ascii="Times New Roman" w:eastAsia="Times New Roman" w:hAnsi="Times New Roman" w:cs="Times New Roman"/>
-                <w:bCs/>
+              <w:t xml:space="preserve"/>
+            </w:r>
+          </w:p>
+        </w:tc>
+        <w:tc>
+          <w:tcPr>
+            <w:tcW w:w="284" w:type="dxa"/>
+            <w:tcBorders>
+              <w:left w:val="nil"/>
+              <w:bottom w:val="nil"/>
+              <w:right w:val="nil"/>
+            </w:tcBorders>
+            <w:noWrap/>
+            <w:hideMark/>
+          </w:tcPr>
+          <w:p>
+            <w:pPr>
+              <w:jc w:val="center"/>
+              <w:cnfStyle w:val="000000100000" w:firstRow="0" w:lastRow="0" w:firstColumn="0" w:lastColumn="0" w:oddVBand="0" w:evenVBand="0" w:oddHBand="1" w:evenHBand="0" w:firstRowFirstColumn="0" w:firstRowLastColumn="0" w:lastRowFirstColumn="0" w:lastRowLastColumn="0"/>
+              <w:rPr>
+                <w:rFonts w:ascii="Times New Roman" w:eastAsia="Times New Roman" w:hAnsi="Times New Roman" w:cs="Times New Roman"/>
                 <w:color w:val="000000" w:themeColor="text1"/>
                 <w:sz w:val="20"/>
                 <w:szCs w:val="20"/>
                 <w:lang w:eastAsia="es-PE"/>
               </w:rPr>
-              <w:t xml:space="preserve">1</w:t>
-            </w:r>
-          </w:p>
-        </w:tc>
-        <w:tc>
-          <w:tcPr>
-            <w:tcW w:w="1279" w:type="dxa"/>
-            <w:tcBorders>
-              <w:top w:val="nil"/>
-              <w:left w:val="nil"/>
-            </w:tcBorders>
-            <w:noWrap/>
-            <w:hideMark/>
-          </w:tcPr>
-          <w:p>
-            <w:pPr>
-              <w:jc w:val="center"/>
-              <w:cnfStyle w:val="000000100000" w:firstRow="0" w:lastRow="0" w:firstColumn="0" w:lastColumn="0" w:oddVBand="0" w:evenVBand="0" w:oddHBand="1" w:evenHBand="0" w:firstRowFirstColumn="0" w:firstRowLastColumn="0" w:lastRowFirstColumn="0" w:lastRowLastColumn="0"/>
-              <w:rPr>
-                <w:rFonts w:ascii="Times New Roman" w:eastAsia="Times New Roman" w:hAnsi="Times New Roman" w:cs="Times New Roman"/>
-                <w:bCs/>
+            </w:pPr>
+            <w:r>
+              <w:rPr>
+                <w:rFonts w:ascii="Times New Roman" w:eastAsia="Times New Roman" w:hAnsi="Times New Roman" w:cs="Times New Roman"/>
                 <w:color w:val="000000" w:themeColor="text1"/>
                 <w:sz w:val="20"/>
                 <w:szCs w:val="20"/>
                 <w:lang w:eastAsia="es-PE"/>
               </w:rPr>
-            </w:pPr>
-            <w:r>
-              <w:rPr>
-                <w:rFonts w:ascii="Times New Roman" w:eastAsia="Times New Roman" w:hAnsi="Times New Roman" w:cs="Times New Roman"/>
-                <w:bCs/>
+              <w:t xml:space="preserve">2</w:t>
+            </w:r>
+          </w:p>
+        </w:tc>
+        <w:tc>
+          <w:tcPr>
+            <w:tcW w:w="1279" w:type="dxa"/>
+            <w:tcBorders>
+              <w:left w:val="nil"/>
+              <w:bottom w:val="nil"/>
+            </w:tcBorders>
+            <w:noWrap/>
+            <w:hideMark/>
+          </w:tcPr>
+          <w:p>
+            <w:pPr>
+              <w:jc w:val="center"/>
+              <w:cnfStyle w:val="000000100000" w:firstRow="0" w:lastRow="0" w:firstColumn="0" w:lastColumn="0" w:oddVBand="0" w:evenVBand="0" w:oddHBand="1" w:evenHBand="0" w:firstRowFirstColumn="0" w:firstRowLastColumn="0" w:lastRowFirstColumn="0" w:lastRowLastColumn="0"/>
+              <w:rPr>
+                <w:rFonts w:ascii="Times New Roman" w:eastAsia="Times New Roman" w:hAnsi="Times New Roman" w:cs="Times New Roman"/>
                 <w:color w:val="000000" w:themeColor="text1"/>
                 <w:sz w:val="20"/>
                 <w:szCs w:val="20"/>
                 <w:lang w:eastAsia="es-PE"/>
               </w:rPr>
-              <w:t xml:space="preserve">0.2</w:t>
+            </w:pPr>
+            <w:r>
+              <w:rPr>
+                <w:rFonts w:ascii="Times New Roman" w:eastAsia="Times New Roman" w:hAnsi="Times New Roman" w:cs="Times New Roman"/>
+                <w:color w:val="000000" w:themeColor="text1"/>
+                <w:sz w:val="20"/>
+                <w:szCs w:val="20"/>
+                <w:lang w:eastAsia="es-PE"/>
+              </w:rPr>
+              <w:t xml:space="preserve">0.3</w:t>
             </w:r>
           </w:p>
         </w:tc>
@@ -14534,6 +14369,121 @@
           <w:tcPr>
             <w:cnfStyle w:val="001000000000" w:firstRow="0" w:lastRow="0" w:firstColumn="1" w:lastColumn="0" w:oddVBand="0" w:evenVBand="0" w:oddHBand="0" w:evenHBand="0" w:firstRowFirstColumn="0" w:firstRowLastColumn="0" w:lastRowFirstColumn="0" w:lastRowLastColumn="0"/>
             <w:tcW w:w="6804" w:type="dxa"/>
+            <w:tcBorders>
+              <w:top w:val="nil"/>
+              <w:bottom w:val="nil"/>
+              <w:right w:val="nil"/>
+            </w:tcBorders>
+            <w:shd w:val="clear" w:color="auto" w:fill="D9D9D9" w:themeFill="background1" w:themeFillShade="D9"/>
+            <w:hideMark/>
+          </w:tcPr>
+          <w:p>
+            <w:pPr>
+              <w:rPr>
+                <w:rFonts w:ascii="Times New Roman" w:eastAsia="Times New Roman" w:hAnsi="Times New Roman" w:cs="Times New Roman"/>
+                <w:b w:val="0"/>
+                <w:color w:val="000000" w:themeColor="text1"/>
+                <w:sz w:val="20"/>
+                <w:szCs w:val="20"/>
+                <w:lang w:eastAsia="es-PE"/>
+              </w:rPr>
+            </w:pPr>
+            <w:r>
+              <w:rPr>
+                <w:rFonts w:ascii="Times New Roman" w:eastAsia="Times New Roman" w:hAnsi="Times New Roman" w:cs="Times New Roman"/>
+                <w:b w:val="0"/>
+                <w:color w:val="000000" w:themeColor="text1"/>
+                <w:sz w:val="20"/>
+                <w:szCs w:val="20"/>
+                <w:lang w:eastAsia="es-PE"/>
+              </w:rPr>
+              <w:t xml:space="preserve">Ninguna</w:t>
+            </w:r>
+          </w:p>
+        </w:tc>
+        <w:tc>
+          <w:tcPr>
+            <w:tcW w:w="284" w:type="dxa"/>
+            <w:tcBorders>
+              <w:top w:val="nil"/>
+              <w:left w:val="nil"/>
+              <w:bottom w:val="nil"/>
+              <w:right w:val="nil"/>
+            </w:tcBorders>
+            <w:shd w:val="clear" w:color="auto" w:fill="D9D9D9" w:themeFill="background1" w:themeFillShade="D9"/>
+            <w:noWrap/>
+            <w:hideMark/>
+          </w:tcPr>
+          <w:p>
+            <w:pPr>
+              <w:jc w:val="center"/>
+              <w:cnfStyle w:val="000000000000" w:firstRow="0" w:lastRow="0" w:firstColumn="0" w:lastColumn="0" w:oddVBand="0" w:evenVBand="0" w:oddHBand="0" w:evenHBand="0" w:firstRowFirstColumn="0" w:firstRowLastColumn="0" w:lastRowFirstColumn="0" w:lastRowLastColumn="0"/>
+              <w:rPr>
+                <w:rFonts w:ascii="Times New Roman" w:eastAsia="Times New Roman" w:hAnsi="Times New Roman" w:cs="Times New Roman"/>
+                <w:color w:val="000000" w:themeColor="text1"/>
+                <w:sz w:val="20"/>
+                <w:szCs w:val="20"/>
+                <w:lang w:eastAsia="es-PE"/>
+              </w:rPr>
+            </w:pPr>
+            <w:r>
+              <w:rPr>
+                <w:rFonts w:ascii="Times New Roman" w:eastAsia="Times New Roman" w:hAnsi="Times New Roman" w:cs="Times New Roman"/>
+                <w:color w:val="000000" w:themeColor="text1"/>
+                <w:sz w:val="20"/>
+                <w:szCs w:val="20"/>
+                <w:lang w:eastAsia="es-PE"/>
+              </w:rPr>
+              <w:t xml:space="preserve">1</w:t>
+            </w:r>
+          </w:p>
+        </w:tc>
+        <w:tc>
+          <w:tcPr>
+            <w:tcW w:w="1279" w:type="dxa"/>
+            <w:tcBorders>
+              <w:top w:val="nil"/>
+              <w:left w:val="nil"/>
+              <w:bottom w:val="nil"/>
+            </w:tcBorders>
+            <w:shd w:val="clear" w:color="auto" w:fill="D9D9D9" w:themeFill="background1" w:themeFillShade="D9"/>
+            <w:noWrap/>
+            <w:hideMark/>
+          </w:tcPr>
+          <w:p>
+            <w:pPr>
+              <w:jc w:val="center"/>
+              <w:cnfStyle w:val="000000000000" w:firstRow="0" w:lastRow="0" w:firstColumn="0" w:lastColumn="0" w:oddVBand="0" w:evenVBand="0" w:oddHBand="0" w:evenHBand="0" w:firstRowFirstColumn="0" w:firstRowLastColumn="0" w:lastRowFirstColumn="0" w:lastRowLastColumn="0"/>
+              <w:rPr>
+                <w:rFonts w:ascii="Times New Roman" w:eastAsia="Times New Roman" w:hAnsi="Times New Roman" w:cs="Times New Roman"/>
+                <w:color w:val="000000" w:themeColor="text1"/>
+                <w:sz w:val="20"/>
+                <w:szCs w:val="20"/>
+                <w:lang w:eastAsia="es-PE"/>
+              </w:rPr>
+            </w:pPr>
+            <w:r>
+              <w:rPr>
+                <w:rFonts w:ascii="Times New Roman" w:eastAsia="Times New Roman" w:hAnsi="Times New Roman" w:cs="Times New Roman"/>
+                <w:color w:val="000000" w:themeColor="text1"/>
+                <w:sz w:val="20"/>
+                <w:szCs w:val="20"/>
+                <w:lang w:eastAsia="es-PE"/>
+              </w:rPr>
+              <w:t xml:space="preserve">0.2</w:t>
+            </w:r>
+          </w:p>
+        </w:tc>
+      </w:tr>
+      <w:tr>
+        <w:trPr>
+          <w:trHeight w:val="20"/>
+          <w:jc w:val="center"/>
+        </w:trPr>
+        <w:tc>
+          <w:tcPr>
+            <w:cnfStyle w:val="001000000000" w:firstRow="0" w:lastRow="0" w:firstColumn="1" w:lastColumn="0" w:oddVBand="0" w:evenVBand="0" w:oddHBand="0" w:evenHBand="0" w:firstRowFirstColumn="0" w:firstRowLastColumn="0" w:lastRowFirstColumn="0" w:lastRowLastColumn="0"/>
+            <w:tcW w:w="6804" w:type="dxa"/>
             <w:shd w:val="clear" w:color="auto" w:fill="92D050"/>
             <w:hideMark/>
           </w:tcPr>
@@ -14721,7 +14671,7 @@
           <w:sz w:val="24"/>
           <w:szCs w:val="24"/>
         </w:rPr>
-        <w:t xml:space="preserve">De acuerdo con los datos sobre la preferencia de carreras universitarias entre los estudiantes de quinto año de secundaria, se puede observar que la carrera de Farmacia y Bioquímica representa el 2.4% de las preferencias (14 estudiantes), ubicándose en el puesto 16 de las carreras listadas, por debajo de Medicina Humana (15.6%), Derecho (13.3%) y Enfermería (3.4%), pero al mismo nivel que otras carreras del área de la salud. Dado que en la región Lambayeque solo una universidad licenciada ofrece la carrera desde el año 2025, esta preferencia podría ser un indicio de una demanda latente y creciente, una vez se dé a conocer y se promueva adecuadamente la oferta educativa. La falta de familiaridad o conocimiento sobre la carrera entre los estudiantes puede presentar una oportunidad para la universidad de posicionarla como una opción atractiva y necesaria en el campo de la salud, respondiendo así a una posible demanda no satisfecha en la región.</w:t>
+        <w:t xml:space="preserve">De acuerdo con los datos sobre la preferencia de carreras universitarias entre los estudiantes de quinto año de secundaria, se puede observar que la carrera de Farmacia y Bioquímica representa el 5.8% de las preferencias (34 estudiantes), ubicándose en el puesto 6 de las carreras listadas, solo por debajo de Medicina Humana (14.6%), Derecho (12.4%), Ing. Civil (8.0%), Arquitectura (6.5%) y Administración (5.6%), y por encima de Negocios Internacionales (5.3%), Psicología (5.3%) y Enfermería (3.2%), entre otras carreras del área de la salud. Dado que en la región Lambayeque solo una universidad licenciada ofrece la carrera desde el año 2025, esta preferencia constituye un indicio de una demanda latente y creciente, una vez se dé a conocer y se promueva adecuadamente la oferta educativa. La falta de familiaridad o conocimiento sobre la carrera entre los estudiantes puede presentar una oportunidad para la universidad de posicionarla como una opción atractiva y necesaria en el campo de la salud, respondiendo así a una posible demanda no satisfecha en la región.</w:t>
       </w:r>
       <w:r>
         <w:rPr>
@@ -15015,7 +14965,7 @@
                 <w:color w:val="000000" w:themeColor="text1"/>
                 <w:lang w:eastAsia="es-PE"/>
               </w:rPr>
-              <w:t xml:space="preserve">9</w:t>
+              <w:t xml:space="preserve">21</w:t>
             </w:r>
           </w:p>
         </w:tc>
@@ -15113,7 +15063,7 @@
                 <w:color w:val="000000" w:themeColor="text1"/>
                 <w:lang w:eastAsia="es-PE"/>
               </w:rPr>
-              <w:t xml:space="preserve">5</w:t>
+              <w:t xml:space="preserve">13</w:t>
             </w:r>
           </w:p>
         </w:tc>
@@ -15205,7 +15155,7 @@
                 <w:color w:val="000000" w:themeColor="text1"/>
                 <w:lang w:eastAsia="es-PE"/>
               </w:rPr>
-              <w:t xml:space="preserve">14</w:t>
+              <w:t xml:space="preserve">34</w:t>
             </w:r>
           </w:p>
         </w:tc>
@@ -15964,7 +15914,7 @@
                 <w:color w:val="000000"/>
                 <w:lang w:eastAsia="es-PE"/>
               </w:rPr>
-              <w:t xml:space="preserve">4</w:t>
+              <w:t xml:space="preserve">10</w:t>
             </w:r>
           </w:p>
         </w:tc>
@@ -16069,7 +16019,7 @@
                 <w:color w:val="000000"/>
                 <w:lang w:eastAsia="es-PE"/>
               </w:rPr>
-              <w:t xml:space="preserve">3</w:t>
+              <w:t xml:space="preserve">7</w:t>
             </w:r>
           </w:p>
         </w:tc>
@@ -16110,7 +16060,7 @@
       </w:tr>
       <w:tr>
         <w:trPr>
-          <w:trHeight w:val="139"/>
+          <w:trHeight w:val="189"/>
         </w:trPr>
         <w:tc>
           <w:tcPr>
@@ -16121,7 +16071,7 @@
               <w:bottom w:val="nil"/>
               <w:right w:val="nil"/>
             </w:tcBorders>
-            <w:shd w:val="clear" w:color="auto" w:fill="FFFFFF" w:themeFill="background1"/>
+            <w:shd w:val="clear" w:color="000000" w:fill="FFFFFF"/>
             <w:vAlign w:val="center"/>
             <w:hideMark/>
           </w:tcPr>
@@ -16153,7 +16103,7 @@
               <w:bottom w:val="nil"/>
               <w:right w:val="nil"/>
             </w:tcBorders>
-            <w:shd w:val="clear" w:color="auto" w:fill="FFFFFF" w:themeFill="background1"/>
+            <w:shd w:val="clear" w:color="auto" w:fill="auto"/>
             <w:noWrap/>
             <w:vAlign w:val="center"/>
             <w:hideMark/>
@@ -16174,7 +16124,7 @@
                 <w:color w:val="000000"/>
                 <w:lang w:eastAsia="es-PE"/>
               </w:rPr>
-              <w:t xml:space="preserve">1</w:t>
+              <w:t xml:space="preserve">2</w:t>
             </w:r>
           </w:p>
         </w:tc>
@@ -16187,7 +16137,7 @@
               <w:bottom w:val="nil"/>
               <w:right w:val="nil"/>
             </w:tcBorders>
-            <w:shd w:val="clear" w:color="auto" w:fill="FFFFFF" w:themeFill="background1"/>
+            <w:shd w:val="clear" w:color="auto" w:fill="auto"/>
             <w:noWrap/>
             <w:vAlign w:val="center"/>
             <w:hideMark/>
@@ -16215,7 +16165,7 @@
       </w:tr>
       <w:tr>
         <w:trPr>
-          <w:trHeight w:val="228"/>
+          <w:trHeight w:val="233"/>
         </w:trPr>
         <w:tc>
           <w:tcPr>
@@ -16279,7 +16229,7 @@
                 <w:color w:val="000000"/>
                 <w:lang w:eastAsia="es-PE"/>
               </w:rPr>
-              <w:t xml:space="preserve">1</w:t>
+              <w:t xml:space="preserve">3</w:t>
             </w:r>
           </w:p>
         </w:tc>
@@ -16320,7 +16270,7 @@
       </w:tr>
       <w:tr>
         <w:trPr>
-          <w:trHeight w:val="228"/>
+          <w:trHeight w:val="189"/>
         </w:trPr>
         <w:tc>
           <w:tcPr>
@@ -16331,7 +16281,7 @@
               <w:bottom w:val="nil"/>
               <w:right w:val="nil"/>
             </w:tcBorders>
-            <w:shd w:val="clear" w:color="auto" w:fill="FFFFFF" w:themeFill="background1"/>
+            <w:shd w:val="clear" w:color="000000" w:fill="FFFFFF"/>
             <w:vAlign w:val="center"/>
             <w:hideMark/>
           </w:tcPr>
@@ -16363,7 +16313,7 @@
               <w:bottom w:val="nil"/>
               <w:right w:val="nil"/>
             </w:tcBorders>
-            <w:shd w:val="clear" w:color="auto" w:fill="FFFFFF" w:themeFill="background1"/>
+            <w:shd w:val="clear" w:color="auto" w:fill="auto"/>
             <w:noWrap/>
             <w:vAlign w:val="center"/>
             <w:hideMark/>
@@ -16384,7 +16334,7 @@
                 <w:color w:val="000000"/>
                 <w:lang w:eastAsia="es-PE"/>
               </w:rPr>
-              <w:t xml:space="preserve">1</w:t>
+              <w:t xml:space="preserve">2</w:t>
             </w:r>
           </w:p>
         </w:tc>
@@ -16397,7 +16347,7 @@
               <w:bottom w:val="nil"/>
               <w:right w:val="nil"/>
             </w:tcBorders>
-            <w:shd w:val="clear" w:color="auto" w:fill="FFFFFF" w:themeFill="background1"/>
+            <w:shd w:val="clear" w:color="auto" w:fill="auto"/>
             <w:noWrap/>
             <w:vAlign w:val="center"/>
             <w:hideMark/>
@@ -16419,6 +16369,216 @@
                 <w:lang w:eastAsia="es-PE"/>
               </w:rPr>
               <w:t xml:space="preserve">7.0</w:t>
+            </w:r>
+          </w:p>
+        </w:tc>
+      </w:tr>
+      <w:tr>
+        <w:trPr>
+          <w:trHeight w:val="233"/>
+        </w:trPr>
+        <w:tc>
+          <w:tcPr>
+            <w:tcW w:w="2088" w:type="dxa"/>
+            <w:tcBorders>
+              <w:top w:val="nil"/>
+              <w:left w:val="nil"/>
+              <w:bottom w:val="nil"/>
+              <w:right w:val="nil"/>
+            </w:tcBorders>
+            <w:shd w:val="clear" w:color="auto" w:fill="D9D9D9" w:themeFill="background1" w:themeFillShade="D9"/>
+            <w:vAlign w:val="center"/>
+            <w:hideMark/>
+          </w:tcPr>
+          <w:p>
+            <w:pPr>
+              <w:spacing w:after="0" w:line="240" w:lineRule="auto"/>
+              <w:rPr>
+                <w:rFonts w:ascii="Times New Roman" w:eastAsia="Times New Roman" w:hAnsi="Times New Roman" w:cs="Times New Roman"/>
+                <w:color w:val="000000"/>
+                <w:lang w:eastAsia="es-PE"/>
+              </w:rPr>
+            </w:pPr>
+            <w:r>
+              <w:rPr>
+                <w:rFonts w:ascii="Times New Roman" w:eastAsia="Times New Roman" w:hAnsi="Times New Roman" w:cs="Times New Roman"/>
+                <w:color w:val="000000"/>
+                <w:lang w:eastAsia="es-PE"/>
+              </w:rPr>
+              <w:t xml:space="preserve">De 1000 a más</w:t>
+            </w:r>
+          </w:p>
+        </w:tc>
+        <w:tc>
+          <w:tcPr>
+            <w:tcW w:w="889" w:type="dxa"/>
+            <w:tcBorders>
+              <w:top w:val="nil"/>
+              <w:left w:val="nil"/>
+              <w:bottom w:val="nil"/>
+              <w:right w:val="nil"/>
+            </w:tcBorders>
+            <w:shd w:val="clear" w:color="auto" w:fill="D9D9D9" w:themeFill="background1" w:themeFillShade="D9"/>
+            <w:noWrap/>
+            <w:vAlign w:val="center"/>
+            <w:hideMark/>
+          </w:tcPr>
+          <w:p>
+            <w:pPr>
+              <w:spacing w:after="0" w:line="240" w:lineRule="auto"/>
+              <w:jc w:val="center"/>
+              <w:rPr>
+                <w:rFonts w:ascii="Times New Roman" w:eastAsia="Times New Roman" w:hAnsi="Times New Roman" w:cs="Times New Roman"/>
+                <w:color w:val="000000"/>
+                <w:lang w:eastAsia="es-PE"/>
+              </w:rPr>
+            </w:pPr>
+            <w:r>
+              <w:rPr>
+                <w:rFonts w:ascii="Times New Roman" w:eastAsia="Times New Roman" w:hAnsi="Times New Roman" w:cs="Times New Roman"/>
+                <w:color w:val="000000"/>
+                <w:lang w:eastAsia="es-PE"/>
+              </w:rPr>
+              <w:t xml:space="preserve">7</w:t>
+            </w:r>
+          </w:p>
+        </w:tc>
+        <w:tc>
+          <w:tcPr>
+            <w:tcW w:w="1276" w:type="dxa"/>
+            <w:tcBorders>
+              <w:top w:val="nil"/>
+              <w:left w:val="nil"/>
+              <w:bottom w:val="nil"/>
+              <w:right w:val="nil"/>
+            </w:tcBorders>
+            <w:shd w:val="clear" w:color="auto" w:fill="D9D9D9" w:themeFill="background1" w:themeFillShade="D9"/>
+            <w:noWrap/>
+            <w:vAlign w:val="center"/>
+            <w:hideMark/>
+          </w:tcPr>
+          <w:p>
+            <w:pPr>
+              <w:spacing w:after="0" w:line="240" w:lineRule="auto"/>
+              <w:jc w:val="center"/>
+              <w:rPr>
+                <w:rFonts w:ascii="Times New Roman" w:eastAsia="Times New Roman" w:hAnsi="Times New Roman" w:cs="Times New Roman"/>
+                <w:color w:val="000000"/>
+                <w:lang w:eastAsia="es-PE"/>
+              </w:rPr>
+            </w:pPr>
+            <w:r>
+              <w:rPr>
+                <w:rFonts w:ascii="Times New Roman" w:eastAsia="Times New Roman" w:hAnsi="Times New Roman" w:cs="Times New Roman"/>
+                <w:color w:val="000000"/>
+                <w:lang w:eastAsia="es-PE"/>
+              </w:rPr>
+              <w:t xml:space="preserve">19.1</w:t>
+            </w:r>
+          </w:p>
+        </w:tc>
+      </w:tr>
+      <w:tr>
+        <w:trPr>
+          <w:trHeight w:val="189"/>
+        </w:trPr>
+        <w:tc>
+          <w:tcPr>
+            <w:tcW w:w="2088" w:type="dxa"/>
+            <w:tcBorders>
+              <w:top w:val="nil"/>
+              <w:left w:val="nil"/>
+              <w:bottom w:val="nil"/>
+              <w:right w:val="nil"/>
+            </w:tcBorders>
+            <w:shd w:val="clear" w:color="000000" w:fill="FFFFFF"/>
+            <w:vAlign w:val="center"/>
+            <w:hideMark/>
+          </w:tcPr>
+          <w:p>
+            <w:pPr>
+              <w:spacing w:after="0" w:line="240" w:lineRule="auto"/>
+              <w:rPr>
+                <w:rFonts w:ascii="Times New Roman" w:eastAsia="Times New Roman" w:hAnsi="Times New Roman" w:cs="Times New Roman"/>
+                <w:color w:val="000000"/>
+                <w:lang w:eastAsia="es-PE"/>
+              </w:rPr>
+            </w:pPr>
+            <w:r>
+              <w:rPr>
+                <w:rFonts w:ascii="Times New Roman" w:eastAsia="Times New Roman" w:hAnsi="Times New Roman" w:cs="Times New Roman"/>
+                <w:color w:val="000000"/>
+                <w:lang w:eastAsia="es-PE"/>
+              </w:rPr>
+              <w:t xml:space="preserve">No opina</w:t>
+            </w:r>
+          </w:p>
+        </w:tc>
+        <w:tc>
+          <w:tcPr>
+            <w:tcW w:w="889" w:type="dxa"/>
+            <w:tcBorders>
+              <w:top w:val="nil"/>
+              <w:left w:val="nil"/>
+              <w:bottom w:val="nil"/>
+              <w:right w:val="nil"/>
+            </w:tcBorders>
+            <w:shd w:val="clear" w:color="auto" w:fill="auto"/>
+            <w:noWrap/>
+            <w:vAlign w:val="center"/>
+            <w:hideMark/>
+          </w:tcPr>
+          <w:p>
+            <w:pPr>
+              <w:spacing w:after="0" w:line="240" w:lineRule="auto"/>
+              <w:jc w:val="center"/>
+              <w:rPr>
+                <w:rFonts w:ascii="Times New Roman" w:eastAsia="Times New Roman" w:hAnsi="Times New Roman" w:cs="Times New Roman"/>
+                <w:color w:val="000000"/>
+                <w:lang w:eastAsia="es-PE"/>
+              </w:rPr>
+            </w:pPr>
+            <w:r>
+              <w:rPr>
+                <w:rFonts w:ascii="Times New Roman" w:eastAsia="Times New Roman" w:hAnsi="Times New Roman" w:cs="Times New Roman"/>
+                <w:color w:val="000000"/>
+                <w:lang w:eastAsia="es-PE"/>
+              </w:rPr>
+              <w:t xml:space="preserve">3</w:t>
+            </w:r>
+          </w:p>
+        </w:tc>
+        <w:tc>
+          <w:tcPr>
+            <w:tcW w:w="1276" w:type="dxa"/>
+            <w:tcBorders>
+              <w:top w:val="nil"/>
+              <w:left w:val="nil"/>
+              <w:bottom w:val="nil"/>
+              <w:right w:val="nil"/>
+            </w:tcBorders>
+            <w:shd w:val="clear" w:color="auto" w:fill="auto"/>
+            <w:noWrap/>
+            <w:vAlign w:val="center"/>
+            <w:hideMark/>
+          </w:tcPr>
+          <w:p>
+            <w:pPr>
+              <w:spacing w:after="0" w:line="240" w:lineRule="auto"/>
+              <w:jc w:val="center"/>
+              <w:rPr>
+                <w:rFonts w:ascii="Times New Roman" w:eastAsia="Times New Roman" w:hAnsi="Times New Roman" w:cs="Times New Roman"/>
+                <w:color w:val="000000"/>
+                <w:lang w:eastAsia="es-PE"/>
+              </w:rPr>
+            </w:pPr>
+            <w:r>
+              <w:rPr>
+                <w:rFonts w:ascii="Times New Roman" w:eastAsia="Times New Roman" w:hAnsi="Times New Roman" w:cs="Times New Roman"/>
+                <w:color w:val="000000"/>
+                <w:lang w:eastAsia="es-PE"/>
+              </w:rPr>
+              <w:t xml:space="preserve">9.5</w:t>
             </w:r>
           </w:p>
         </w:tc>
@@ -16431,216 +16591,6 @@
           <w:tcPr>
             <w:tcW w:w="2088" w:type="dxa"/>
             <w:tcBorders>
-              <w:top w:val="nil"/>
-              <w:left w:val="nil"/>
-              <w:bottom w:val="nil"/>
-              <w:right w:val="nil"/>
-            </w:tcBorders>
-            <w:shd w:val="clear" w:color="auto" w:fill="D9D9D9" w:themeFill="background1" w:themeFillShade="D9"/>
-            <w:vAlign w:val="center"/>
-            <w:hideMark/>
-          </w:tcPr>
-          <w:p>
-            <w:pPr>
-              <w:spacing w:after="0" w:line="240" w:lineRule="auto"/>
-              <w:rPr>
-                <w:rFonts w:ascii="Times New Roman" w:eastAsia="Times New Roman" w:hAnsi="Times New Roman" w:cs="Times New Roman"/>
-                <w:color w:val="000000"/>
-                <w:lang w:eastAsia="es-PE"/>
-              </w:rPr>
-            </w:pPr>
-            <w:r>
-              <w:rPr>
-                <w:rFonts w:ascii="Times New Roman" w:eastAsia="Times New Roman" w:hAnsi="Times New Roman" w:cs="Times New Roman"/>
-                <w:color w:val="000000"/>
-                <w:lang w:eastAsia="es-PE"/>
-              </w:rPr>
-              <w:t xml:space="preserve">De 1000 a más</w:t>
-            </w:r>
-          </w:p>
-        </w:tc>
-        <w:tc>
-          <w:tcPr>
-            <w:tcW w:w="889" w:type="dxa"/>
-            <w:tcBorders>
-              <w:top w:val="nil"/>
-              <w:left w:val="nil"/>
-              <w:bottom w:val="nil"/>
-              <w:right w:val="nil"/>
-            </w:tcBorders>
-            <w:shd w:val="clear" w:color="auto" w:fill="D9D9D9" w:themeFill="background1" w:themeFillShade="D9"/>
-            <w:noWrap/>
-            <w:vAlign w:val="center"/>
-            <w:hideMark/>
-          </w:tcPr>
-          <w:p>
-            <w:pPr>
-              <w:spacing w:after="0" w:line="240" w:lineRule="auto"/>
-              <w:jc w:val="center"/>
-              <w:rPr>
-                <w:rFonts w:ascii="Times New Roman" w:eastAsia="Times New Roman" w:hAnsi="Times New Roman" w:cs="Times New Roman"/>
-                <w:color w:val="000000"/>
-                <w:lang w:eastAsia="es-PE"/>
-              </w:rPr>
-            </w:pPr>
-            <w:r>
-              <w:rPr>
-                <w:rFonts w:ascii="Times New Roman" w:eastAsia="Times New Roman" w:hAnsi="Times New Roman" w:cs="Times New Roman"/>
-                <w:color w:val="000000"/>
-                <w:lang w:eastAsia="es-PE"/>
-              </w:rPr>
-              <w:t xml:space="preserve">3</w:t>
-            </w:r>
-          </w:p>
-        </w:tc>
-        <w:tc>
-          <w:tcPr>
-            <w:tcW w:w="1276" w:type="dxa"/>
-            <w:tcBorders>
-              <w:top w:val="nil"/>
-              <w:left w:val="nil"/>
-              <w:bottom w:val="nil"/>
-              <w:right w:val="nil"/>
-            </w:tcBorders>
-            <w:shd w:val="clear" w:color="auto" w:fill="D9D9D9" w:themeFill="background1" w:themeFillShade="D9"/>
-            <w:noWrap/>
-            <w:vAlign w:val="center"/>
-            <w:hideMark/>
-          </w:tcPr>
-          <w:p>
-            <w:pPr>
-              <w:spacing w:after="0" w:line="240" w:lineRule="auto"/>
-              <w:jc w:val="center"/>
-              <w:rPr>
-                <w:rFonts w:ascii="Times New Roman" w:eastAsia="Times New Roman" w:hAnsi="Times New Roman" w:cs="Times New Roman"/>
-                <w:color w:val="000000"/>
-                <w:lang w:eastAsia="es-PE"/>
-              </w:rPr>
-            </w:pPr>
-            <w:r>
-              <w:rPr>
-                <w:rFonts w:ascii="Times New Roman" w:eastAsia="Times New Roman" w:hAnsi="Times New Roman" w:cs="Times New Roman"/>
-                <w:color w:val="000000"/>
-                <w:lang w:eastAsia="es-PE"/>
-              </w:rPr>
-              <w:t xml:space="preserve">19.1</w:t>
-            </w:r>
-          </w:p>
-        </w:tc>
-      </w:tr>
-      <w:tr>
-        <w:trPr>
-          <w:trHeight w:val="189"/>
-        </w:trPr>
-        <w:tc>
-          <w:tcPr>
-            <w:tcW w:w="2088" w:type="dxa"/>
-            <w:tcBorders>
-              <w:top w:val="nil"/>
-              <w:left w:val="nil"/>
-              <w:bottom w:val="nil"/>
-              <w:right w:val="nil"/>
-            </w:tcBorders>
-            <w:shd w:val="clear" w:color="000000" w:fill="FFFFFF"/>
-            <w:vAlign w:val="center"/>
-            <w:hideMark/>
-          </w:tcPr>
-          <w:p>
-            <w:pPr>
-              <w:spacing w:after="0" w:line="240" w:lineRule="auto"/>
-              <w:rPr>
-                <w:rFonts w:ascii="Times New Roman" w:eastAsia="Times New Roman" w:hAnsi="Times New Roman" w:cs="Times New Roman"/>
-                <w:color w:val="000000"/>
-                <w:lang w:eastAsia="es-PE"/>
-              </w:rPr>
-            </w:pPr>
-            <w:r>
-              <w:rPr>
-                <w:rFonts w:ascii="Times New Roman" w:eastAsia="Times New Roman" w:hAnsi="Times New Roman" w:cs="Times New Roman"/>
-                <w:color w:val="000000"/>
-                <w:lang w:eastAsia="es-PE"/>
-              </w:rPr>
-              <w:t xml:space="preserve">No opina</w:t>
-            </w:r>
-          </w:p>
-        </w:tc>
-        <w:tc>
-          <w:tcPr>
-            <w:tcW w:w="889" w:type="dxa"/>
-            <w:tcBorders>
-              <w:top w:val="nil"/>
-              <w:left w:val="nil"/>
-              <w:bottom w:val="nil"/>
-              <w:right w:val="nil"/>
-            </w:tcBorders>
-            <w:shd w:val="clear" w:color="auto" w:fill="auto"/>
-            <w:noWrap/>
-            <w:vAlign w:val="center"/>
-            <w:hideMark/>
-          </w:tcPr>
-          <w:p>
-            <w:pPr>
-              <w:spacing w:after="0" w:line="240" w:lineRule="auto"/>
-              <w:jc w:val="center"/>
-              <w:rPr>
-                <w:rFonts w:ascii="Times New Roman" w:eastAsia="Times New Roman" w:hAnsi="Times New Roman" w:cs="Times New Roman"/>
-                <w:color w:val="000000"/>
-                <w:lang w:eastAsia="es-PE"/>
-              </w:rPr>
-            </w:pPr>
-            <w:r>
-              <w:rPr>
-                <w:rFonts w:ascii="Times New Roman" w:eastAsia="Times New Roman" w:hAnsi="Times New Roman" w:cs="Times New Roman"/>
-                <w:color w:val="000000"/>
-                <w:lang w:eastAsia="es-PE"/>
-              </w:rPr>
-              <w:t xml:space="preserve">1</w:t>
-            </w:r>
-          </w:p>
-        </w:tc>
-        <w:tc>
-          <w:tcPr>
-            <w:tcW w:w="1276" w:type="dxa"/>
-            <w:tcBorders>
-              <w:top w:val="nil"/>
-              <w:left w:val="nil"/>
-              <w:bottom w:val="nil"/>
-              <w:right w:val="nil"/>
-            </w:tcBorders>
-            <w:shd w:val="clear" w:color="auto" w:fill="auto"/>
-            <w:noWrap/>
-            <w:vAlign w:val="center"/>
-            <w:hideMark/>
-          </w:tcPr>
-          <w:p>
-            <w:pPr>
-              <w:spacing w:after="0" w:line="240" w:lineRule="auto"/>
-              <w:jc w:val="center"/>
-              <w:rPr>
-                <w:rFonts w:ascii="Times New Roman" w:eastAsia="Times New Roman" w:hAnsi="Times New Roman" w:cs="Times New Roman"/>
-                <w:color w:val="000000"/>
-                <w:lang w:eastAsia="es-PE"/>
-              </w:rPr>
-            </w:pPr>
-            <w:r>
-              <w:rPr>
-                <w:rFonts w:ascii="Times New Roman" w:eastAsia="Times New Roman" w:hAnsi="Times New Roman" w:cs="Times New Roman"/>
-                <w:color w:val="000000"/>
-                <w:lang w:eastAsia="es-PE"/>
-              </w:rPr>
-              <w:t xml:space="preserve">9.5</w:t>
-            </w:r>
-          </w:p>
-        </w:tc>
-      </w:tr>
-      <w:tr>
-        <w:trPr>
-          <w:trHeight w:val="237"/>
-        </w:trPr>
-        <w:tc>
-          <w:tcPr>
-            <w:tcW w:w="2088" w:type="dxa"/>
-            <w:tcBorders>
               <w:top w:val="single" w:sz="4" w:space="0" w:color="auto"/>
               <w:left w:val="nil"/>
               <w:bottom w:val="single" w:sz="4" w:space="0" w:color="auto"/>
@@ -16704,7 +16654,7 @@
                 <w:color w:val="000000"/>
                 <w:lang w:eastAsia="es-PE"/>
               </w:rPr>
-              <w:t xml:space="preserve">14</w:t>
+              <w:t xml:space="preserve">34</w:t>
             </w:r>
           </w:p>
         </w:tc>
@@ -17402,7 +17352,7 @@
                 <w:color w:val="000000"/>
                 <w:lang w:eastAsia="es-PE"/>
               </w:rPr>
-              <w:t xml:space="preserve">7</w:t>
+              <w:t xml:space="preserve">17</w:t>
             </w:r>
           </w:p>
         </w:tc>
@@ -17507,7 +17457,7 @@
                 <w:color w:val="000000"/>
                 <w:lang w:eastAsia="es-PE"/>
               </w:rPr>
-              <w:t xml:space="preserve">1</w:t>
+              <w:t xml:space="preserve">3</w:t>
             </w:r>
           </w:p>
         </w:tc>
@@ -17542,6 +17492,111 @@
                 <w:lang w:eastAsia="es-PE"/>
               </w:rPr>
               <w:t xml:space="preserve">9.5</w:t>
+            </w:r>
+          </w:p>
+        </w:tc>
+      </w:tr>
+      <w:tr>
+        <w:trPr>
+          <w:trHeight w:val="309"/>
+        </w:trPr>
+        <w:tc>
+          <w:tcPr>
+            <w:tcW w:w="3678" w:type="dxa"/>
+            <w:tcBorders>
+              <w:top w:val="nil"/>
+              <w:left w:val="nil"/>
+              <w:bottom w:val="nil"/>
+              <w:right w:val="nil"/>
+            </w:tcBorders>
+            <w:shd w:val="clear" w:color="000000" w:fill="FFFFFF"/>
+            <w:vAlign w:val="center"/>
+            <w:hideMark/>
+          </w:tcPr>
+          <w:p>
+            <w:pPr>
+              <w:spacing w:after="0" w:line="240" w:lineRule="auto"/>
+              <w:rPr>
+                <w:rFonts w:ascii="Times New Roman" w:eastAsia="Times New Roman" w:hAnsi="Times New Roman" w:cs="Times New Roman"/>
+                <w:color w:val="000000"/>
+                <w:lang w:eastAsia="es-PE"/>
+              </w:rPr>
+            </w:pPr>
+            <w:r>
+              <w:rPr>
+                <w:rFonts w:ascii="Times New Roman" w:eastAsia="Times New Roman" w:hAnsi="Times New Roman" w:cs="Times New Roman"/>
+                <w:color w:val="000000"/>
+                <w:lang w:eastAsia="es-PE"/>
+              </w:rPr>
+              <w:t xml:space="preserve">No tiene atributos definidos</w:t>
+            </w:r>
+          </w:p>
+        </w:tc>
+        <w:tc>
+          <w:tcPr>
+            <w:tcW w:w="1186" w:type="dxa"/>
+            <w:tcBorders>
+              <w:top w:val="nil"/>
+              <w:left w:val="nil"/>
+              <w:bottom w:val="nil"/>
+              <w:right w:val="nil"/>
+            </w:tcBorders>
+            <w:shd w:val="clear" w:color="auto" w:fill="auto"/>
+            <w:noWrap/>
+            <w:vAlign w:val="center"/>
+            <w:hideMark/>
+          </w:tcPr>
+          <w:p>
+            <w:pPr>
+              <w:spacing w:after="0" w:line="240" w:lineRule="auto"/>
+              <w:jc w:val="center"/>
+              <w:rPr>
+                <w:rFonts w:ascii="Times New Roman" w:eastAsia="Times New Roman" w:hAnsi="Times New Roman" w:cs="Times New Roman"/>
+                <w:color w:val="000000"/>
+                <w:lang w:eastAsia="es-PE"/>
+              </w:rPr>
+            </w:pPr>
+            <w:r>
+              <w:rPr>
+                <w:rFonts w:ascii="Times New Roman" w:eastAsia="Times New Roman" w:hAnsi="Times New Roman" w:cs="Times New Roman"/>
+                <w:color w:val="000000"/>
+                <w:lang w:eastAsia="es-PE"/>
+              </w:rPr>
+              <w:t xml:space="preserve">5</w:t>
+            </w:r>
+          </w:p>
+        </w:tc>
+        <w:tc>
+          <w:tcPr>
+            <w:tcW w:w="569" w:type="dxa"/>
+            <w:tcBorders>
+              <w:top w:val="nil"/>
+              <w:left w:val="nil"/>
+              <w:bottom w:val="nil"/>
+              <w:right w:val="nil"/>
+            </w:tcBorders>
+            <w:shd w:val="clear" w:color="auto" w:fill="auto"/>
+            <w:noWrap/>
+            <w:vAlign w:val="center"/>
+            <w:hideMark/>
+          </w:tcPr>
+          <w:p>
+            <w:pPr>
+              <w:spacing w:after="0" w:line="240" w:lineRule="auto"/>
+              <w:jc w:val="center"/>
+              <w:rPr>
+                <w:rFonts w:ascii="Times New Roman" w:eastAsia="Times New Roman" w:hAnsi="Times New Roman" w:cs="Times New Roman"/>
+                <w:color w:val="000000"/>
+                <w:lang w:eastAsia="es-PE"/>
+              </w:rPr>
+            </w:pPr>
+            <w:r>
+              <w:rPr>
+                <w:rFonts w:ascii="Times New Roman" w:eastAsia="Times New Roman" w:hAnsi="Times New Roman" w:cs="Times New Roman"/>
+                <w:color w:val="000000"/>
+                <w:lang w:eastAsia="es-PE"/>
+              </w:rPr>
+              <w:t xml:space="preserve">14.4</w:t>
             </w:r>
           </w:p>
         </w:tc>
@@ -17559,6 +17614,111 @@
               <w:bottom w:val="nil"/>
               <w:right w:val="nil"/>
             </w:tcBorders>
+            <w:shd w:val="clear" w:color="auto" w:fill="D9D9D9" w:themeFill="background1" w:themeFillShade="D9"/>
+            <w:vAlign w:val="center"/>
+            <w:hideMark/>
+          </w:tcPr>
+          <w:p>
+            <w:pPr>
+              <w:spacing w:after="0" w:line="240" w:lineRule="auto"/>
+              <w:rPr>
+                <w:rFonts w:ascii="Times New Roman" w:eastAsia="Times New Roman" w:hAnsi="Times New Roman" w:cs="Times New Roman"/>
+                <w:color w:val="000000"/>
+                <w:lang w:eastAsia="es-PE"/>
+              </w:rPr>
+            </w:pPr>
+            <w:r>
+              <w:rPr>
+                <w:rFonts w:ascii="Times New Roman" w:eastAsia="Times New Roman" w:hAnsi="Times New Roman" w:cs="Times New Roman"/>
+                <w:color w:val="000000"/>
+                <w:lang w:eastAsia="es-PE"/>
+              </w:rPr>
+              <w:t xml:space="preserve">Plana docente calificada</w:t>
+            </w:r>
+          </w:p>
+        </w:tc>
+        <w:tc>
+          <w:tcPr>
+            <w:tcW w:w="1186" w:type="dxa"/>
+            <w:tcBorders>
+              <w:top w:val="nil"/>
+              <w:left w:val="nil"/>
+              <w:bottom w:val="nil"/>
+              <w:right w:val="nil"/>
+            </w:tcBorders>
+            <w:shd w:val="clear" w:color="auto" w:fill="D9D9D9" w:themeFill="background1" w:themeFillShade="D9"/>
+            <w:noWrap/>
+            <w:vAlign w:val="center"/>
+            <w:hideMark/>
+          </w:tcPr>
+          <w:p>
+            <w:pPr>
+              <w:spacing w:after="0" w:line="240" w:lineRule="auto"/>
+              <w:jc w:val="center"/>
+              <w:rPr>
+                <w:rFonts w:ascii="Times New Roman" w:eastAsia="Times New Roman" w:hAnsi="Times New Roman" w:cs="Times New Roman"/>
+                <w:color w:val="000000"/>
+                <w:lang w:eastAsia="es-PE"/>
+              </w:rPr>
+            </w:pPr>
+            <w:r>
+              <w:rPr>
+                <w:rFonts w:ascii="Times New Roman" w:eastAsia="Times New Roman" w:hAnsi="Times New Roman" w:cs="Times New Roman"/>
+                <w:color w:val="000000"/>
+                <w:lang w:eastAsia="es-PE"/>
+              </w:rPr>
+              <w:t xml:space="preserve">3</w:t>
+            </w:r>
+          </w:p>
+        </w:tc>
+        <w:tc>
+          <w:tcPr>
+            <w:tcW w:w="569" w:type="dxa"/>
+            <w:tcBorders>
+              <w:top w:val="nil"/>
+              <w:left w:val="nil"/>
+              <w:bottom w:val="nil"/>
+              <w:right w:val="nil"/>
+            </w:tcBorders>
+            <w:shd w:val="clear" w:color="auto" w:fill="D9D9D9" w:themeFill="background1" w:themeFillShade="D9"/>
+            <w:noWrap/>
+            <w:vAlign w:val="center"/>
+            <w:hideMark/>
+          </w:tcPr>
+          <w:p>
+            <w:pPr>
+              <w:spacing w:after="0" w:line="240" w:lineRule="auto"/>
+              <w:jc w:val="center"/>
+              <w:rPr>
+                <w:rFonts w:ascii="Times New Roman" w:eastAsia="Times New Roman" w:hAnsi="Times New Roman" w:cs="Times New Roman"/>
+                <w:color w:val="000000"/>
+                <w:lang w:eastAsia="es-PE"/>
+              </w:rPr>
+            </w:pPr>
+            <w:r>
+              <w:rPr>
+                <w:rFonts w:ascii="Times New Roman" w:eastAsia="Times New Roman" w:hAnsi="Times New Roman" w:cs="Times New Roman"/>
+                <w:color w:val="000000"/>
+                <w:lang w:eastAsia="es-PE"/>
+              </w:rPr>
+              <w:t xml:space="preserve">9.4</w:t>
+            </w:r>
+          </w:p>
+        </w:tc>
+      </w:tr>
+      <w:tr>
+        <w:trPr>
+          <w:trHeight w:val="309"/>
+        </w:trPr>
+        <w:tc>
+          <w:tcPr>
+            <w:tcW w:w="3678" w:type="dxa"/>
+            <w:tcBorders>
+              <w:top w:val="nil"/>
+              <w:left w:val="nil"/>
+              <w:bottom w:val="nil"/>
+              <w:right w:val="nil"/>
+            </w:tcBorders>
             <w:shd w:val="clear" w:color="000000" w:fill="FFFFFF"/>
             <w:vAlign w:val="center"/>
             <w:hideMark/>
@@ -17578,7 +17738,7 @@
                 <w:color w:val="000000"/>
                 <w:lang w:eastAsia="es-PE"/>
               </w:rPr>
-              <w:t xml:space="preserve">No tiene atributos definidos</w:t>
+              <w:t xml:space="preserve">Infraestructura adecuada y moderna</w:t>
             </w:r>
           </w:p>
         </w:tc>
@@ -17612,7 +17772,7 @@
                 <w:color w:val="000000"/>
                 <w:lang w:eastAsia="es-PE"/>
               </w:rPr>
-              <w:t xml:space="preserve">2</w:t>
+              <w:t xml:space="preserve">3</w:t>
             </w:r>
           </w:p>
         </w:tc>
@@ -17646,7 +17806,7 @@
                 <w:color w:val="000000"/>
                 <w:lang w:eastAsia="es-PE"/>
               </w:rPr>
-              <w:t xml:space="preserve">14.4</w:t>
+              <w:t xml:space="preserve">10.1</w:t>
             </w:r>
           </w:p>
         </w:tc>
@@ -17683,7 +17843,7 @@
                 <w:color w:val="000000"/>
                 <w:lang w:eastAsia="es-PE"/>
               </w:rPr>
-              <w:t xml:space="preserve">Plana docente calificada</w:t>
+              <w:t xml:space="preserve">Costos cómodos</w:t>
             </w:r>
           </w:p>
         </w:tc>
@@ -17717,7 +17877,7 @@
                 <w:color w:val="000000"/>
                 <w:lang w:eastAsia="es-PE"/>
               </w:rPr>
-              <w:t xml:space="preserve">1</w:t>
+              <w:t xml:space="preserve">2</w:t>
             </w:r>
           </w:p>
         </w:tc>
@@ -17751,7 +17911,112 @@
                 <w:color w:val="000000"/>
                 <w:lang w:eastAsia="es-PE"/>
               </w:rPr>
-              <w:t xml:space="preserve">9.4</w:t>
+              <w:t xml:space="preserve">4.8</w:t>
+            </w:r>
+          </w:p>
+        </w:tc>
+      </w:tr>
+      <w:tr>
+        <w:trPr>
+          <w:trHeight w:val="309"/>
+        </w:trPr>
+        <w:tc>
+          <w:tcPr>
+            <w:tcW w:w="3678" w:type="dxa"/>
+            <w:tcBorders>
+              <w:top w:val="nil"/>
+              <w:left w:val="nil"/>
+              <w:bottom w:val="nil"/>
+              <w:right w:val="nil"/>
+            </w:tcBorders>
+            <w:shd w:val="clear" w:color="000000" w:fill="FFFFFF"/>
+            <w:vAlign w:val="center"/>
+            <w:hideMark/>
+          </w:tcPr>
+          <w:p>
+            <w:pPr>
+              <w:spacing w:after="0" w:line="240" w:lineRule="auto"/>
+              <w:rPr>
+                <w:rFonts w:ascii="Times New Roman" w:eastAsia="Times New Roman" w:hAnsi="Times New Roman" w:cs="Times New Roman"/>
+                <w:color w:val="000000"/>
+                <w:lang w:eastAsia="es-PE"/>
+              </w:rPr>
+            </w:pPr>
+            <w:r>
+              <w:rPr>
+                <w:rFonts w:ascii="Times New Roman" w:eastAsia="Times New Roman" w:hAnsi="Times New Roman" w:cs="Times New Roman"/>
+                <w:color w:val="000000"/>
+                <w:lang w:eastAsia="es-PE"/>
+              </w:rPr>
+              <w:t xml:space="preserve">Otro</w:t>
+            </w:r>
+          </w:p>
+        </w:tc>
+        <w:tc>
+          <w:tcPr>
+            <w:tcW w:w="1186" w:type="dxa"/>
+            <w:tcBorders>
+              <w:top w:val="nil"/>
+              <w:left w:val="nil"/>
+              <w:bottom w:val="nil"/>
+              <w:right w:val="nil"/>
+            </w:tcBorders>
+            <w:shd w:val="clear" w:color="auto" w:fill="auto"/>
+            <w:noWrap/>
+            <w:vAlign w:val="center"/>
+            <w:hideMark/>
+          </w:tcPr>
+          <w:p>
+            <w:pPr>
+              <w:spacing w:after="0" w:line="240" w:lineRule="auto"/>
+              <w:jc w:val="center"/>
+              <w:rPr>
+                <w:rFonts w:ascii="Times New Roman" w:eastAsia="Times New Roman" w:hAnsi="Times New Roman" w:cs="Times New Roman"/>
+                <w:color w:val="000000"/>
+                <w:lang w:eastAsia="es-PE"/>
+              </w:rPr>
+            </w:pPr>
+            <w:r>
+              <w:rPr>
+                <w:rFonts w:ascii="Times New Roman" w:eastAsia="Times New Roman" w:hAnsi="Times New Roman" w:cs="Times New Roman"/>
+                <w:color w:val="000000"/>
+                <w:lang w:eastAsia="es-PE"/>
+              </w:rPr>
+              <w:t xml:space="preserve">1</w:t>
+            </w:r>
+          </w:p>
+        </w:tc>
+        <w:tc>
+          <w:tcPr>
+            <w:tcW w:w="569" w:type="dxa"/>
+            <w:tcBorders>
+              <w:top w:val="nil"/>
+              <w:left w:val="nil"/>
+              <w:bottom w:val="nil"/>
+              <w:right w:val="nil"/>
+            </w:tcBorders>
+            <w:shd w:val="clear" w:color="auto" w:fill="auto"/>
+            <w:noWrap/>
+            <w:vAlign w:val="center"/>
+            <w:hideMark/>
+          </w:tcPr>
+          <w:p>
+            <w:pPr>
+              <w:spacing w:after="0" w:line="240" w:lineRule="auto"/>
+              <w:jc w:val="center"/>
+              <w:rPr>
+                <w:rFonts w:ascii="Times New Roman" w:eastAsia="Times New Roman" w:hAnsi="Times New Roman" w:cs="Times New Roman"/>
+                <w:color w:val="000000"/>
+                <w:lang w:eastAsia="es-PE"/>
+              </w:rPr>
+            </w:pPr>
+            <w:r>
+              <w:rPr>
+                <w:rFonts w:ascii="Times New Roman" w:eastAsia="Times New Roman" w:hAnsi="Times New Roman" w:cs="Times New Roman"/>
+                <w:color w:val="000000"/>
+                <w:lang w:eastAsia="es-PE"/>
+              </w:rPr>
+              <w:t xml:space="preserve">2.6</w:t>
             </w:r>
           </w:p>
         </w:tc>
@@ -17764,321 +18029,6 @@
           <w:tcPr>
             <w:tcW w:w="3678" w:type="dxa"/>
             <w:tcBorders>
-              <w:top w:val="nil"/>
-              <w:left w:val="nil"/>
-              <w:bottom w:val="nil"/>
-              <w:right w:val="nil"/>
-            </w:tcBorders>
-            <w:shd w:val="clear" w:color="000000" w:fill="FFFFFF"/>
-            <w:vAlign w:val="center"/>
-            <w:hideMark/>
-          </w:tcPr>
-          <w:p>
-            <w:pPr>
-              <w:spacing w:after="0" w:line="240" w:lineRule="auto"/>
-              <w:rPr>
-                <w:rFonts w:ascii="Times New Roman" w:eastAsia="Times New Roman" w:hAnsi="Times New Roman" w:cs="Times New Roman"/>
-                <w:color w:val="000000"/>
-                <w:lang w:eastAsia="es-PE"/>
-              </w:rPr>
-            </w:pPr>
-            <w:r>
-              <w:rPr>
-                <w:rFonts w:ascii="Times New Roman" w:eastAsia="Times New Roman" w:hAnsi="Times New Roman" w:cs="Times New Roman"/>
-                <w:color w:val="000000"/>
-                <w:lang w:eastAsia="es-PE"/>
-              </w:rPr>
-              <w:t xml:space="preserve">Infraestructura adecuada y moderna</w:t>
-            </w:r>
-          </w:p>
-        </w:tc>
-        <w:tc>
-          <w:tcPr>
-            <w:tcW w:w="1186" w:type="dxa"/>
-            <w:tcBorders>
-              <w:top w:val="nil"/>
-              <w:left w:val="nil"/>
-              <w:bottom w:val="nil"/>
-              <w:right w:val="nil"/>
-            </w:tcBorders>
-            <w:shd w:val="clear" w:color="auto" w:fill="auto"/>
-            <w:noWrap/>
-            <w:vAlign w:val="center"/>
-            <w:hideMark/>
-          </w:tcPr>
-          <w:p>
-            <w:pPr>
-              <w:spacing w:after="0" w:line="240" w:lineRule="auto"/>
-              <w:jc w:val="center"/>
-              <w:rPr>
-                <w:rFonts w:ascii="Times New Roman" w:eastAsia="Times New Roman" w:hAnsi="Times New Roman" w:cs="Times New Roman"/>
-                <w:color w:val="000000"/>
-                <w:lang w:eastAsia="es-PE"/>
-              </w:rPr>
-            </w:pPr>
-            <w:r>
-              <w:rPr>
-                <w:rFonts w:ascii="Times New Roman" w:eastAsia="Times New Roman" w:hAnsi="Times New Roman" w:cs="Times New Roman"/>
-                <w:color w:val="000000"/>
-                <w:lang w:eastAsia="es-PE"/>
-              </w:rPr>
-              <w:t xml:space="preserve">2</w:t>
-            </w:r>
-          </w:p>
-        </w:tc>
-        <w:tc>
-          <w:tcPr>
-            <w:tcW w:w="569" w:type="dxa"/>
-            <w:tcBorders>
-              <w:top w:val="nil"/>
-              <w:left w:val="nil"/>
-              <w:bottom w:val="nil"/>
-              <w:right w:val="nil"/>
-            </w:tcBorders>
-            <w:shd w:val="clear" w:color="auto" w:fill="auto"/>
-            <w:noWrap/>
-            <w:vAlign w:val="center"/>
-            <w:hideMark/>
-          </w:tcPr>
-          <w:p>
-            <w:pPr>
-              <w:spacing w:after="0" w:line="240" w:lineRule="auto"/>
-              <w:jc w:val="center"/>
-              <w:rPr>
-                <w:rFonts w:ascii="Times New Roman" w:eastAsia="Times New Roman" w:hAnsi="Times New Roman" w:cs="Times New Roman"/>
-                <w:color w:val="000000"/>
-                <w:lang w:eastAsia="es-PE"/>
-              </w:rPr>
-            </w:pPr>
-            <w:r>
-              <w:rPr>
-                <w:rFonts w:ascii="Times New Roman" w:eastAsia="Times New Roman" w:hAnsi="Times New Roman" w:cs="Times New Roman"/>
-                <w:color w:val="000000"/>
-                <w:lang w:eastAsia="es-PE"/>
-              </w:rPr>
-              <w:t xml:space="preserve">10.1</w:t>
-            </w:r>
-          </w:p>
-        </w:tc>
-      </w:tr>
-      <w:tr>
-        <w:trPr>
-          <w:trHeight w:val="309"/>
-        </w:trPr>
-        <w:tc>
-          <w:tcPr>
-            <w:tcW w:w="3678" w:type="dxa"/>
-            <w:tcBorders>
-              <w:top w:val="nil"/>
-              <w:left w:val="nil"/>
-              <w:bottom w:val="nil"/>
-              <w:right w:val="nil"/>
-            </w:tcBorders>
-            <w:shd w:val="clear" w:color="000000" w:fill="FFFFFF"/>
-            <w:vAlign w:val="center"/>
-            <w:hideMark/>
-          </w:tcPr>
-          <w:p>
-            <w:pPr>
-              <w:spacing w:after="0" w:line="240" w:lineRule="auto"/>
-              <w:rPr>
-                <w:rFonts w:ascii="Times New Roman" w:eastAsia="Times New Roman" w:hAnsi="Times New Roman" w:cs="Times New Roman"/>
-                <w:color w:val="000000"/>
-                <w:lang w:eastAsia="es-PE"/>
-              </w:rPr>
-            </w:pPr>
-            <w:r>
-              <w:rPr>
-                <w:rFonts w:ascii="Times New Roman" w:eastAsia="Times New Roman" w:hAnsi="Times New Roman" w:cs="Times New Roman"/>
-                <w:color w:val="000000"/>
-                <w:lang w:eastAsia="es-PE"/>
-              </w:rPr>
-              <w:t xml:space="preserve">Costos cómodos</w:t>
-            </w:r>
-          </w:p>
-        </w:tc>
-        <w:tc>
-          <w:tcPr>
-            <w:tcW w:w="1186" w:type="dxa"/>
-            <w:tcBorders>
-              <w:top w:val="nil"/>
-              <w:left w:val="nil"/>
-              <w:bottom w:val="nil"/>
-              <w:right w:val="nil"/>
-            </w:tcBorders>
-            <w:shd w:val="clear" w:color="auto" w:fill="auto"/>
-            <w:noWrap/>
-            <w:vAlign w:val="center"/>
-            <w:hideMark/>
-          </w:tcPr>
-          <w:p>
-            <w:pPr>
-              <w:spacing w:after="0" w:line="240" w:lineRule="auto"/>
-              <w:jc w:val="center"/>
-              <w:rPr>
-                <w:rFonts w:ascii="Times New Roman" w:eastAsia="Times New Roman" w:hAnsi="Times New Roman" w:cs="Times New Roman"/>
-                <w:color w:val="000000"/>
-                <w:lang w:eastAsia="es-PE"/>
-              </w:rPr>
-            </w:pPr>
-            <w:r>
-              <w:rPr>
-                <w:rFonts w:ascii="Times New Roman" w:eastAsia="Times New Roman" w:hAnsi="Times New Roman" w:cs="Times New Roman"/>
-                <w:color w:val="000000"/>
-                <w:lang w:eastAsia="es-PE"/>
-              </w:rPr>
-              <w:t xml:space="preserve">1</w:t>
-            </w:r>
-          </w:p>
-        </w:tc>
-        <w:tc>
-          <w:tcPr>
-            <w:tcW w:w="569" w:type="dxa"/>
-            <w:tcBorders>
-              <w:top w:val="nil"/>
-              <w:left w:val="nil"/>
-              <w:bottom w:val="nil"/>
-              <w:right w:val="nil"/>
-            </w:tcBorders>
-            <w:shd w:val="clear" w:color="auto" w:fill="auto"/>
-            <w:noWrap/>
-            <w:vAlign w:val="center"/>
-            <w:hideMark/>
-          </w:tcPr>
-          <w:p>
-            <w:pPr>
-              <w:spacing w:after="0" w:line="240" w:lineRule="auto"/>
-              <w:jc w:val="center"/>
-              <w:rPr>
-                <w:rFonts w:ascii="Times New Roman" w:eastAsia="Times New Roman" w:hAnsi="Times New Roman" w:cs="Times New Roman"/>
-                <w:color w:val="000000"/>
-                <w:lang w:eastAsia="es-PE"/>
-              </w:rPr>
-            </w:pPr>
-            <w:r>
-              <w:rPr>
-                <w:rFonts w:ascii="Times New Roman" w:eastAsia="Times New Roman" w:hAnsi="Times New Roman" w:cs="Times New Roman"/>
-                <w:color w:val="000000"/>
-                <w:lang w:eastAsia="es-PE"/>
-              </w:rPr>
-              <w:t xml:space="preserve">4.8</w:t>
-            </w:r>
-          </w:p>
-        </w:tc>
-      </w:tr>
-      <w:tr>
-        <w:trPr>
-          <w:trHeight w:val="309"/>
-        </w:trPr>
-        <w:tc>
-          <w:tcPr>
-            <w:tcW w:w="3678" w:type="dxa"/>
-            <w:tcBorders>
-              <w:top w:val="nil"/>
-              <w:left w:val="nil"/>
-              <w:bottom w:val="nil"/>
-              <w:right w:val="nil"/>
-            </w:tcBorders>
-            <w:shd w:val="clear" w:color="000000" w:fill="FFFFFF"/>
-            <w:vAlign w:val="center"/>
-            <w:hideMark/>
-          </w:tcPr>
-          <w:p>
-            <w:pPr>
-              <w:spacing w:after="0" w:line="240" w:lineRule="auto"/>
-              <w:rPr>
-                <w:rFonts w:ascii="Times New Roman" w:eastAsia="Times New Roman" w:hAnsi="Times New Roman" w:cs="Times New Roman"/>
-                <w:color w:val="000000"/>
-                <w:lang w:eastAsia="es-PE"/>
-              </w:rPr>
-            </w:pPr>
-            <w:r>
-              <w:rPr>
-                <w:rFonts w:ascii="Times New Roman" w:eastAsia="Times New Roman" w:hAnsi="Times New Roman" w:cs="Times New Roman"/>
-                <w:color w:val="000000"/>
-                <w:lang w:eastAsia="es-PE"/>
-              </w:rPr>
-              <w:t xml:space="preserve">Otro</w:t>
-            </w:r>
-          </w:p>
-        </w:tc>
-        <w:tc>
-          <w:tcPr>
-            <w:tcW w:w="1186" w:type="dxa"/>
-            <w:tcBorders>
-              <w:top w:val="nil"/>
-              <w:left w:val="nil"/>
-              <w:bottom w:val="nil"/>
-              <w:right w:val="nil"/>
-            </w:tcBorders>
-            <w:shd w:val="clear" w:color="auto" w:fill="auto"/>
-            <w:noWrap/>
-            <w:vAlign w:val="center"/>
-            <w:hideMark/>
-          </w:tcPr>
-          <w:p>
-            <w:pPr>
-              <w:spacing w:after="0" w:line="240" w:lineRule="auto"/>
-              <w:jc w:val="center"/>
-              <w:rPr>
-                <w:rFonts w:ascii="Times New Roman" w:eastAsia="Times New Roman" w:hAnsi="Times New Roman" w:cs="Times New Roman"/>
-                <w:color w:val="000000"/>
-                <w:lang w:eastAsia="es-PE"/>
-              </w:rPr>
-            </w:pPr>
-            <w:r>
-              <w:rPr>
-                <w:rFonts w:ascii="Times New Roman" w:eastAsia="Times New Roman" w:hAnsi="Times New Roman" w:cs="Times New Roman"/>
-                <w:color w:val="000000"/>
-                <w:lang w:eastAsia="es-PE"/>
-              </w:rPr>
-              <w:t xml:space="preserve">0</w:t>
-            </w:r>
-          </w:p>
-        </w:tc>
-        <w:tc>
-          <w:tcPr>
-            <w:tcW w:w="569" w:type="dxa"/>
-            <w:tcBorders>
-              <w:top w:val="nil"/>
-              <w:left w:val="nil"/>
-              <w:bottom w:val="nil"/>
-              <w:right w:val="nil"/>
-            </w:tcBorders>
-            <w:shd w:val="clear" w:color="auto" w:fill="auto"/>
-            <w:noWrap/>
-            <w:vAlign w:val="center"/>
-            <w:hideMark/>
-          </w:tcPr>
-          <w:p>
-            <w:pPr>
-              <w:spacing w:after="0" w:line="240" w:lineRule="auto"/>
-              <w:jc w:val="center"/>
-              <w:rPr>
-                <w:rFonts w:ascii="Times New Roman" w:eastAsia="Times New Roman" w:hAnsi="Times New Roman" w:cs="Times New Roman"/>
-                <w:color w:val="000000"/>
-                <w:lang w:eastAsia="es-PE"/>
-              </w:rPr>
-            </w:pPr>
-            <w:r>
-              <w:rPr>
-                <w:rFonts w:ascii="Times New Roman" w:eastAsia="Times New Roman" w:hAnsi="Times New Roman" w:cs="Times New Roman"/>
-                <w:color w:val="000000"/>
-                <w:lang w:eastAsia="es-PE"/>
-              </w:rPr>
-              <w:t xml:space="preserve">2.6</w:t>
-            </w:r>
-          </w:p>
-        </w:tc>
-      </w:tr>
-      <w:tr>
-        <w:trPr>
-          <w:trHeight w:val="297"/>
-        </w:trPr>
-        <w:tc>
-          <w:tcPr>
-            <w:tcW w:w="3678" w:type="dxa"/>
-            <w:tcBorders>
               <w:top w:val="single" w:sz="4" w:space="0" w:color="auto"/>
               <w:left w:val="nil"/>
               <w:bottom w:val="single" w:sz="4" w:space="0" w:color="auto"/>
@@ -18142,7 +18092,7 @@
                 <w:color w:val="000000"/>
                 <w:lang w:eastAsia="es-PE"/>
               </w:rPr>
-              <w:t xml:space="preserve">14</w:t>
+              <w:t xml:space="preserve">34</w:t>
             </w:r>
           </w:p>
         </w:tc>
@@ -25623,7 +25573,7 @@
           <w:sz w:val="24"/>
           <w:szCs w:val="24"/>
         </w:rPr>
-        <w:t xml:space="preserve">La brecha entre la demanda y la oferta educativa en la región Lambayeque se estima contrastando la demanda con la oferta actual de la Universidad Tecnológica del Perú, única universidad licenciada de la región con la carrera. La demanda potencial (mercado objetivo) asciende a 4 938 jóvenes; aplicando el 62.4% de interés por estudiar la carrera en la Universidad Señor de Sipán (Tabla 5), la demanda efectiva es de 3 080 jóvenes. Frente a una oferta máxima de 240 ingresantes anuales (tope superior de la UTP a nivel nacional), la brecha o demanda insatisfecha asciende a 2 840 jóvenes. En un escenario conservador, tomando como demanda efectiva el 18.7% de estudiantes que prefiere estudiar en la USS cualquier carrera (Tabla 12), la demanda efectiva sería de 923 jóvenes y la brecha de 683 jóvenes. En ambos escenarios, la oferta regional resulta insuficiente para atender la demanda.</w:t>
+        <w:t xml:space="preserve">La brecha entre la demanda y la oferta educativa en la región Lambayeque se estima contrastando la demanda con la oferta actual de la Universidad Tecnológica del Perú, única universidad licenciada de la región con la carrera. La demanda potencial (mercado objetivo) asciende a 11 934 jóvenes; aplicando el 62.4% de interés por estudiar la carrera en la Universidad Señor de Sipán (Tabla 5), la demanda efectiva es de 7 445 jóvenes. Frente a una oferta de 240 ingresantes anuales de la UTP en Chiclayo (2025), la brecha o demanda insatisfecha asciende a 7 205 jóvenes. En un escenario conservador, tomando como demanda efectiva el 18.7% de estudiantes que prefiere estudiar en la USS cualquier carrera (Tabla 12), la demanda efectiva sería de 2 232 jóvenes y la brecha de 1 992 jóvenes. En ambos escenarios, la oferta regional resulta insuficiente para atender la demanda.</w:t>
       </w:r>
     </w:p>
     <w:p>
@@ -28812,7 +28762,7 @@
                 <w:color w:val="000000" w:themeColor="text1"/>
                 <w:lang w:eastAsia="es-PE"/>
               </w:rPr>
-              <w:t xml:space="preserve">4938</w:t>
+              <w:t xml:space="preserve">11934</w:t>
             </w:r>
           </w:p>
         </w:tc>
@@ -28838,7 +28788,7 @@
                 <w:color w:val="000000" w:themeColor="text1"/>
                 <w:lang w:eastAsia="es-PE"/>
               </w:rPr>
-              <w:t xml:space="preserve">2.4%</w:t>
+              <w:t xml:space="preserve">5.8%</w:t>
             </w:r>
             <w:r>
               <w:rPr>
@@ -28921,7 +28871,7 @@
           <w:sz w:val="24"/>
           <w:szCs w:val="24"/>
         </w:rPr>
-        <w:t xml:space="preserve">Del mismo modo, por medio de una muestra aleatoria de 588 estudiantes se realizó una estimación de la participación que tiene cada carrera evaluada. El mercado objetivo está conformado por los jóvenes de la región Lambayeque que tienen la intención de postular a la carrera de Farmacia y Bioquímica (2.4%), es decir, 4 938 personas (población de 16 a 25 años de 205 759 por 2.4%).</w:t>
+        <w:t xml:space="preserve">Del mismo modo, por medio de una muestra aleatoria de 588 estudiantes se realizó una estimación de la participación que tiene cada carrera evaluada. El mercado objetivo está conformado por los jóvenes de la región Lambayeque que tienen la intención de postular a la carrera de Farmacia y Bioquímica (5.8%), es decir, 11 934 personas (población de 16 a 25 años de 205 759 por 5.8%).</w:t>
       </w:r>
       <w:r>
         <w:rPr>

</xml_diff>

<commit_message>
Figura 3 with 2026 institutes, formula values line, updated sources list, AB/C title
Co-Authored-By: Claude Sonnet 5.5 <noreply@anthropic.com>
Claude-Session: https://claude.ai/code/session_01SPdMPfWMtqGAvnNeyJFNHL
</commit_message>
<xml_diff>
--- a/demanda/Demanda Social - FARMACIA Y BIOQUIMICA.docx
+++ b/demanda/Demanda Social - FARMACIA Y BIOQUIMICA.docx
@@ -8197,6 +8197,47 @@
           <w:sz w:val="24"/>
           <w:szCs w:val="24"/>
         </w:rPr>
+        <w:t xml:space="preserve">Donde N = 21 255 estudiantes de 5to de secundaria (SIAGIE, Reporte de Matrícula 2025), ΣWhPhQh = 0.25, e = 0.03985 (≈ 4%) y Z = 1.96 (95% de confianza), con lo cual V = 0.000413375, n0 = 604.8 ≈ 605 y n = 588 estudiantes.</w:t>
+      </w:r>
+      <w:r>
+        <w:rPr>
+          <w:rFonts w:ascii="Times New Roman" w:hAnsi="Times New Roman"/>
+          <w:color w:val="000000" w:themeColor="text1"/>
+          <w:sz w:val="24"/>
+          <w:szCs w:val="24"/>
+        </w:rPr>
+        <w:t xml:space="preserve"/>
+      </w:r>
+      <w:r>
+        <w:rPr>
+          <w:rFonts w:ascii="Times New Roman" w:hAnsi="Times New Roman"/>
+          <w:color w:val="000000" w:themeColor="text1"/>
+          <w:sz w:val="24"/>
+          <w:szCs w:val="24"/>
+        </w:rPr>
+        <w:t/>
+      </w:r>
+    </w:p>
+    <w:p>
+      <w:pPr>
+        <w:pStyle w:val="Sangra2detindependiente"/>
+        <w:spacing w:after="0" w:line="360" w:lineRule="auto"/>
+        <w:ind w:left="567"/>
+        <w:jc w:val="both"/>
+        <w:rPr>
+          <w:rFonts w:ascii="Times New Roman" w:hAnsi="Times New Roman"/>
+          <w:color w:val="000000" w:themeColor="text1"/>
+          <w:sz w:val="24"/>
+          <w:szCs w:val="24"/>
+        </w:rPr>
+      </w:pPr>
+      <w:r>
+        <w:rPr>
+          <w:rFonts w:ascii="Times New Roman" w:hAnsi="Times New Roman"/>
+          <w:color w:val="000000" w:themeColor="text1"/>
+          <w:sz w:val="24"/>
+          <w:szCs w:val="24"/>
+        </w:rPr>
         <w:t>Cabe indicar, que el número de Instituciones Educativas a visitadas hasta completar la muestra de estudiantes de 5to de secundaria (</w:t>
       </w:r>
       <w:r>
@@ -8367,7 +8408,7 @@
           <w:rFonts w:ascii="Times New Roman" w:hAnsi="Times New Roman" w:cs="Times New Roman"/>
           <w:color w:val="000000" w:themeColor="text1"/>
         </w:rPr>
-        <w:t xml:space="preserve">INEI (2013 - 2018) Módulos de Educación, Empleo e Ingresos y Miembros del Hogar de la Encuesta Nacional de Hogares. http://iinei.inei.gob.pe/microdatos/ </w:t>
+        <w:t xml:space="preserve">APEIM (2025). Niveles Socioeconómicos 2025 – Informe completo (data ENAHO 2024). Lima.</w:t>
       </w:r>
     </w:p>
     <w:p>
@@ -8390,7 +8431,7 @@
           <w:rFonts w:ascii="Times New Roman" w:hAnsi="Times New Roman" w:cs="Times New Roman"/>
           <w:color w:val="000000" w:themeColor="text1"/>
         </w:rPr>
-        <w:t xml:space="preserve">Naciones Unidas (2015). “Transformar nuestro mundo: la Agenda 2030 para el Desarrollo Sostenible”. A/RES/70/1. Consultado el 18 de octubre de 2018. </w:t>
+        <w:t xml:space="preserve">BCRP – Sucursal Piura (2025). Caracterización del departamento de Lambayeque.</w:t>
       </w:r>
     </w:p>
     <w:p>
@@ -8413,7 +8454,7 @@
           <w:rFonts w:ascii="Times New Roman" w:hAnsi="Times New Roman" w:cs="Times New Roman"/>
           <w:color w:val="000000" w:themeColor="text1"/>
         </w:rPr>
-        <w:t xml:space="preserve">PRODUCE (2016). Padrón de empresas </w:t>
+        <w:t xml:space="preserve">Colegio Químico Farmacéutico Departamental de Lambayeque (2024). Memoria de Gestión, Consejo Directivo 2023-2024.</w:t>
       </w:r>
     </w:p>
     <w:p>
@@ -8436,7 +8477,7 @@
           <w:rFonts w:ascii="Times New Roman" w:hAnsi="Times New Roman" w:cs="Times New Roman"/>
           <w:color w:val="000000" w:themeColor="text1"/>
         </w:rPr>
-        <w:t xml:space="preserve">INEI (2017) Estructura empresarial en el Perú, Informe Técnico. </w:t>
+        <w:t xml:space="preserve">CPI Research (2025). Market Report N° 003 – Proyecciones Poblacionales 2025.</w:t>
       </w:r>
     </w:p>
     <w:p>
@@ -8459,7 +8500,7 @@
           <w:rFonts w:ascii="Times New Roman" w:hAnsi="Times New Roman" w:cs="Times New Roman"/>
           <w:color w:val="000000" w:themeColor="text1"/>
         </w:rPr>
-        <w:t xml:space="preserve">MEF (2018) Política Nacional de Competitividad y Productividad </w:t>
+        <w:t xml:space="preserve">DIGEMID/MINSA (2026). Establecimientos farmacéuticos privados autorizados hasta el 30 de junio de 2026 (Boletín N° 11).</w:t>
       </w:r>
     </w:p>
     <w:p>
@@ -8482,7 +8523,7 @@
           <w:rFonts w:ascii="Times New Roman" w:hAnsi="Times New Roman" w:cs="Times New Roman"/>
           <w:color w:val="000000" w:themeColor="text1"/>
         </w:rPr>
-        <w:t xml:space="preserve">MINTRA (2018). Planillas electrónicas. </w:t>
+        <w:t xml:space="preserve">Ficha de Diagnóstico Lambayeque 2024 (22 de enero de 2025).</w:t>
       </w:r>
     </w:p>
     <w:p>
@@ -8505,7 +8546,7 @@
           <w:rFonts w:ascii="Times New Roman" w:hAnsi="Times New Roman" w:cs="Times New Roman"/>
           <w:color w:val="000000" w:themeColor="text1"/>
         </w:rPr>
-        <w:t xml:space="preserve">SUNAT (2018). Padrón de contribuyentes. </w:t>
+        <w:t xml:space="preserve">GRTPE – OSEL Lambayeque (2025). Mercado laboral de los jóvenes en la región Lambayeque (ENAHO 2024 y SIRTOD-INEI).</w:t>
       </w:r>
     </w:p>
     <w:p>
@@ -8528,7 +8569,7 @@
           <w:rFonts w:ascii="Times New Roman" w:hAnsi="Times New Roman" w:cs="Times New Roman"/>
           <w:color w:val="000000" w:themeColor="text1"/>
         </w:rPr>
-        <w:t xml:space="preserve">MINEDU (2018). Portal Ponte en Carrera. </w:t>
+        <w:t xml:space="preserve">INEI (2018). Censos Nacionales 2017: XII de Población, VII de Vivienda y III de Comunidades Indígenas.</w:t>
       </w:r>
     </w:p>
     <w:p>
@@ -8551,7 +8592,7 @@
           <w:rFonts w:ascii="Times New Roman" w:hAnsi="Times New Roman" w:cs="Times New Roman"/>
           <w:color w:val="000000" w:themeColor="text1"/>
         </w:rPr>
-        <w:t xml:space="preserve">Arellano (2019) Estudio Dónde Quiero Estudiar </w:t>
+        <w:t xml:space="preserve">Ley N.° 29459 (2009). Ley de los Productos Farmacéuticos, Dispositivos Médicos y Productos Sanitarios; D.S. N.° 014-2011-SA, Reglamento de Establecimientos Farmacéuticos.</w:t>
       </w:r>
     </w:p>
     <w:p>
@@ -8574,7 +8615,7 @@
           <w:rFonts w:ascii="Times New Roman" w:hAnsi="Times New Roman" w:cs="Times New Roman"/>
           <w:color w:val="000000" w:themeColor="text1"/>
         </w:rPr>
-        <w:t xml:space="preserve">Arellano (2019) Encuesta Nacional de Consumidores Peruanos. </w:t>
+        <w:t xml:space="preserve">MINEDU (2025). SIAGIE – Reporte de Matrícula 2025.</w:t>
       </w:r>
     </w:p>
     <w:p>
@@ -8597,7 +8638,7 @@
           <w:rFonts w:ascii="Times New Roman" w:hAnsi="Times New Roman" w:cs="Times New Roman"/>
           <w:color w:val="000000" w:themeColor="text1"/>
         </w:rPr>
-        <w:t xml:space="preserve">CEPLAN (2019) Visión del Perú al 2050. </w:t>
+        <w:t xml:space="preserve">MTPE (2024). Demanda de ocupaciones en Lambayeque 2024 – Encuesta de Demanda Ocupacional (EDO).</w:t>
       </w:r>
     </w:p>
     <w:p>
@@ -8620,7 +8661,99 @@
           <w:rFonts w:ascii="Times New Roman" w:hAnsi="Times New Roman" w:cs="Times New Roman"/>
           <w:color w:val="000000" w:themeColor="text1"/>
         </w:rPr>
-        <w:t xml:space="preserve">CEPLAN (2019) Perú: Proyecciones Económicas y Sociales. </w:t>
+        <w:t xml:space="preserve">MTPE – OSEL Lambayeque (2024). Tríptico N° 02-2024: Lambayeque.</w:t>
+      </w:r>
+    </w:p>
+    <w:p>
+      <w:pPr>
+        <w:pStyle w:val="Default"/>
+        <w:numPr>
+          <w:ilvl w:val="0"/>
+          <w:numId w:val="9"/>
+        </w:numPr>
+        <w:spacing w:line="360" w:lineRule="auto"/>
+        <w:ind w:left="993"/>
+        <w:jc w:val="both"/>
+        <w:rPr>
+          <w:rFonts w:ascii="Times New Roman" w:hAnsi="Times New Roman" w:cs="Times New Roman"/>
+          <w:color w:val="000000" w:themeColor="text1"/>
+        </w:rPr>
+      </w:pPr>
+      <w:r>
+        <w:rPr>
+          <w:rFonts w:ascii="Times New Roman" w:hAnsi="Times New Roman" w:cs="Times New Roman"/>
+          <w:color w:val="000000" w:themeColor="text1"/>
+        </w:rPr>
+        <w:t xml:space="preserve">SUNEDU. Resoluciones de licenciamiento institucional y portal de programas licenciados.</w:t>
+      </w:r>
+    </w:p>
+    <w:p>
+      <w:pPr>
+        <w:pStyle w:val="Default"/>
+        <w:numPr>
+          <w:ilvl w:val="0"/>
+          <w:numId w:val="9"/>
+        </w:numPr>
+        <w:spacing w:line="360" w:lineRule="auto"/>
+        <w:ind w:left="993"/>
+        <w:jc w:val="both"/>
+        <w:rPr>
+          <w:rFonts w:ascii="Times New Roman" w:hAnsi="Times New Roman" w:cs="Times New Roman"/>
+          <w:color w:val="000000" w:themeColor="text1"/>
+        </w:rPr>
+      </w:pPr>
+      <w:r>
+        <w:rPr>
+          <w:rFonts w:ascii="Times New Roman" w:hAnsi="Times New Roman" w:cs="Times New Roman"/>
+          <w:color w:val="000000" w:themeColor="text1"/>
+        </w:rPr>
+        <w:t xml:space="preserve">Universidad Tecnológica del Perú (2025). Postulantes, ingresantes, matriculados y egresados pregrado 2022-2025 (datos al 31.10.2025).</w:t>
+      </w:r>
+    </w:p>
+    <w:p>
+      <w:pPr>
+        <w:pStyle w:val="Default"/>
+        <w:numPr>
+          <w:ilvl w:val="0"/>
+          <w:numId w:val="9"/>
+        </w:numPr>
+        <w:spacing w:line="360" w:lineRule="auto"/>
+        <w:ind w:left="993"/>
+        <w:jc w:val="both"/>
+        <w:rPr>
+          <w:rFonts w:ascii="Times New Roman" w:hAnsi="Times New Roman" w:cs="Times New Roman"/>
+          <w:color w:val="000000" w:themeColor="text1"/>
+        </w:rPr>
+      </w:pPr>
+      <w:r>
+        <w:rPr>
+          <w:rFonts w:ascii="Times New Roman" w:hAnsi="Times New Roman" w:cs="Times New Roman"/>
+          <w:color w:val="000000" w:themeColor="text1"/>
+        </w:rPr>
+        <w:t xml:space="preserve">Universidad Señor de Sipán – Área de Investigación de Mercado (2023). Encuesta a estudiantes de 5to año de secundaria de la Región Lambayeque (julio-setiembre 2023) e informes de Demanda Social de Laboratorio Clínico, Radiología y Terapia Física y Rehabilitación.</w:t>
+      </w:r>
+    </w:p>
+    <w:p>
+      <w:pPr>
+        <w:pStyle w:val="Default"/>
+        <w:numPr>
+          <w:ilvl w:val="0"/>
+          <w:numId w:val="9"/>
+        </w:numPr>
+        <w:spacing w:line="360" w:lineRule="auto"/>
+        <w:ind w:left="993"/>
+        <w:jc w:val="both"/>
+        <w:rPr>
+          <w:rFonts w:ascii="Times New Roman" w:hAnsi="Times New Roman" w:cs="Times New Roman"/>
+          <w:color w:val="000000" w:themeColor="text1"/>
+        </w:rPr>
+      </w:pPr>
+      <w:r>
+        <w:rPr>
+          <w:rFonts w:ascii="Times New Roman" w:hAnsi="Times New Roman" w:cs="Times New Roman"/>
+          <w:color w:val="000000" w:themeColor="text1"/>
+        </w:rPr>
+        <w:t xml:space="preserve">Portales institucionales de institutos y universidades de las provincias de Chiclayo, Lambayeque y Ferreñafe (2026).</w:t>
       </w:r>
     </w:p>
     <w:p>
@@ -27091,7 +27224,7 @@
           <w:sz w:val="24"/>
           <w:szCs w:val="24"/>
         </w:rPr>
-        <w:t>Población de nivel socioeconómico B y C a nivel regional</w:t>
+        <w:t xml:space="preserve">Población de nivel socioeconómico AB y C a nivel regional</w:t>
       </w:r>
       <w:r>
         <w:rPr>
@@ -29174,7 +29307,7 @@
           <w:szCs w:val="24"/>
           <w:lang w:eastAsia="es-PE"/>
         </w:rPr>
-        <w:t>Instituciones de educación superior según distritos.</w:t>
+        <w:t xml:space="preserve">Instituciones de educación superior según provincias de la Región Lambayeque, 2026.</w:t>
       </w:r>
     </w:p>
     <w:p>
@@ -29242,7 +29375,7 @@
           <w:szCs w:val="24"/>
           <w:lang w:val="es-MX"/>
         </w:rPr>
-        <w:t xml:space="preserve">En la figura 3, el distrito de Chiclayo cuenta con el 77% de instituciones de educación superior, Lambayeque con el 16% de instituciones de educación superior y Ferreñafe tiene 7% de instituciones de educación superior.</w:t>
+        <w:t xml:space="preserve">En la figura 3, la provincia de Chiclayo concentra el 100% de las instituciones de educación superior con oferta verificable en 2026 (6 instituciones): Manuel Mesones Muro – Master System, Pedro Cieza de León, Santa María Mazzarello – ISMA, Cayetano Heredia e ICH, además del Instituto Politécnico en el distrito de Pimentel. En las provincias de Lambayeque y Ferreñafe no se encontró oferta verificable en 2026 (0%).</w:t>
       </w:r>
     </w:p>
     <w:p>
@@ -34494,96 +34627,11 @@
             </c:dLbl>
             <c:dLbl>
               <c:idx val="1"/>
-              <c:layout>
-                <c:manualLayout>
-                  <c:x val="0.13040376202974627"/>
-                  <c:y val="2.3479512977544432E-2"/>
-                </c:manualLayout>
-              </c:layout>
-              <c:spPr>
-                <a:solidFill>
-                  <a:schemeClr val="bg1"/>
-                </a:solidFill>
-                <a:ln>
-                  <a:noFill/>
-                </a:ln>
-                <a:effectLst/>
-              </c:spPr>
-              <c:txPr>
-                <a:bodyPr rot="0" spcFirstLastPara="1" vertOverflow="ellipsis" vert="horz" wrap="square" lIns="38100" tIns="19050" rIns="38100" bIns="19050" anchor="ctr" anchorCtr="1">
-                  <a:spAutoFit/>
-                </a:bodyPr>
-                <a:lstStyle/>
-                <a:p>
-                  <a:pPr>
-                    <a:defRPr sz="1100" b="1" i="0" u="none" strike="noStrike" kern="1200" baseline="0">
-                      <a:solidFill>
-                        <a:schemeClr val="tx1"/>
-                      </a:solidFill>
-                      <a:latin typeface="Times New Roman" panose="02020603050405020304" pitchFamily="18" charset="0"/>
-                      <a:ea typeface="+mn-ea"/>
-                      <a:cs typeface="Times New Roman" panose="02020603050405020304" pitchFamily="18" charset="0"/>
-                    </a:defRPr>
-                  </a:pPr>
-                  <a:endParaRPr lang="en-US"/>
-                </a:p>
-              </c:txPr>
-              <c:dLblPos val="bestFit"/>
-              <c:showLegendKey val="0"/>
-              <c:showVal val="0"/>
-              <c:showCatName val="0"/>
-              <c:showSerName val="0"/>
-              <c:showPercent val="1"/>
-              <c:showBubbleSize val="0"/>
-              <c:extLst>
-                <c:ext xmlns:c15="http://schemas.microsoft.com/office/drawing/2012/chart" uri="{CE6537A1-D6FC-4f65-9D91-7224C49458BB}"/>
-                <c:ext xmlns:c16="http://schemas.microsoft.com/office/drawing/2014/chart" uri="{C3380CC4-5D6E-409C-BE32-E72D297353CC}">
-                  <c16:uniqueId val="{00000003-4D44-4472-90D4-7CA2B528A8CE}"/>
-                </c:ext>
-              </c:extLst>
+              <c:delete val="1"/>
             </c:dLbl>
             <c:dLbl>
               <c:idx val="2"/>
-              <c:spPr>
-                <a:solidFill>
-                  <a:schemeClr val="bg1"/>
-                </a:solidFill>
-                <a:ln>
-                  <a:noFill/>
-                </a:ln>
-                <a:effectLst/>
-              </c:spPr>
-              <c:txPr>
-                <a:bodyPr rot="0" spcFirstLastPara="1" vertOverflow="ellipsis" vert="horz" wrap="square" lIns="38100" tIns="19050" rIns="38100" bIns="19050" anchor="ctr" anchorCtr="1">
-                  <a:spAutoFit/>
-                </a:bodyPr>
-                <a:lstStyle/>
-                <a:p>
-                  <a:pPr>
-                    <a:defRPr sz="1100" b="1" i="0" u="none" strike="noStrike" kern="1200" baseline="0">
-                      <a:solidFill>
-                        <a:schemeClr val="tx1"/>
-                      </a:solidFill>
-                      <a:latin typeface="Times New Roman" panose="02020603050405020304" pitchFamily="18" charset="0"/>
-                      <a:ea typeface="+mn-ea"/>
-                      <a:cs typeface="Times New Roman" panose="02020603050405020304" pitchFamily="18" charset="0"/>
-                    </a:defRPr>
-                  </a:pPr>
-                  <a:endParaRPr lang="en-US"/>
-                </a:p>
-              </c:txPr>
-              <c:dLblPos val="ctr"/>
-              <c:showLegendKey val="0"/>
-              <c:showVal val="0"/>
-              <c:showCatName val="0"/>
-              <c:showSerName val="0"/>
-              <c:showPercent val="1"/>
-              <c:showBubbleSize val="0"/>
-              <c:extLst>
-                <c:ext xmlns:c16="http://schemas.microsoft.com/office/drawing/2014/chart" uri="{C3380CC4-5D6E-409C-BE32-E72D297353CC}">
-                  <c16:uniqueId val="{00000005-4D44-4472-90D4-7CA2B528A8CE}"/>
-                </c:ext>
-              </c:extLst>
+              <c:delete val="1"/>
             </c:dLbl>
             <c:spPr>
               <a:noFill/>
@@ -34661,13 +34709,13 @@
                 <c:formatCode>General</c:formatCode>
                 <c:ptCount val="3"/>
                 <c:pt idx="0">
-                  <c:v>516</c:v>
+                  <c:v>6</c:v>
                 </c:pt>
                 <c:pt idx="1">
-                  <c:v>51</c:v>
+                  <c:v>0</c:v>
                 </c:pt>
                 <c:pt idx="2">
-                  <c:v>106</c:v>
+                  <c:v>0</c:v>
                 </c:pt>
               </c:numCache>
             </c:numRef>

</xml_diff>